<commit_message>
Rewrite getInputData: return search/query structure, never build arrays
- getInputData returns search.create() object or { type: 'suiteql', query: '...' }
- Platform handles iteration and pagination automatically
- SuiteQL uses query structure pattern from zmp_mr_update_addresses.js
- Only exception: external API calls return arrays (no query structure available)
- Manual SuiteQL pagination (OFFSET/FETCH) reserved for outside Map/Reduce

Co-Authored-By: Claude Opus 4.6 <noreply@anthropic.com>
</commit_message>
<xml_diff>
--- a/coding-standards.docx
+++ b/coding-standards.docx
@@ -8359,7 +8359,7 @@
       </w:tr>
     </w:tbl>
     <w:bookmarkEnd w:id="31"/>
-    <w:bookmarkStart w:id="32" w:name="Xe949d7ba839983db606341f4263d91edae72ac5"/>
+    <w:bookmarkStart w:id="32" w:name="Xb6b9a0e0bbb823e4534d220dc340b3110163eb9"/>
     <w:p>
       <w:pPr>
         <w:pStyle w:val="Heading3"/>
@@ -8374,7 +8374,7 @@
         <w:t xml:space="preserve"> </w:t>
       </w:r>
       <w:r>
-        <w:t xml:space="preserve">— return a search or query, don’t return data</w:t>
+        <w:t xml:space="preserve">— return a search object, let the platform paginate</w:t>
       </w:r>
     </w:p>
     <w:p>
@@ -8382,22 +8382,17 @@
         <w:pStyle w:val="FirstParagraph"/>
       </w:pPr>
       <w:r>
-        <w:t xml:space="preserve">You don’t need to build an array and return it. Just return a</w:t>
-      </w:r>
-      <w:r>
-        <w:t xml:space="preserve"> </w:t>
-      </w:r>
-      <w:r>
         <w:rPr>
           <w:b/>
           <w:bCs/>
         </w:rPr>
-        <w:t xml:space="preserve">saved search</w:t>
-      </w:r>
-      <w:r>
-        <w:t xml:space="preserve">,</w:t>
-      </w:r>
-      <w:r>
+        <w:t xml:space="preserve">Never build an array in</w:t>
+      </w:r>
+      <w:r>
+        <w:rPr>
+          <w:b/>
+          <w:bCs/>
+        </w:rPr>
         <w:t xml:space="preserve"> </w:t>
       </w:r>
       <w:r>
@@ -8406,13 +8401,22 @@
           <w:b/>
           <w:bCs/>
         </w:rPr>
-        <w:t xml:space="preserve">search.create()</w:t>
+        <w:t xml:space="preserve">getInputData</w:t>
       </w:r>
       <w:r>
         <w:rPr>
           <w:b/>
           <w:bCs/>
         </w:rPr>
+        <w:t xml:space="preserve">.</w:t>
+      </w:r>
+      <w:r>
+        <w:t xml:space="preserve"> </w:t>
+      </w:r>
+      <w:r>
+        <w:t xml:space="preserve">Return a</w:t>
+      </w:r>
+      <w:r>
         <w:t xml:space="preserve"> </w:t>
       </w:r>
       <w:r>
@@ -8420,10 +8424,13 @@
           <w:b/>
           <w:bCs/>
         </w:rPr>
-        <w:t xml:space="preserve">object</w:t>
-      </w:r>
-      <w:r>
-        <w:t xml:space="preserve">, or</w:t>
+        <w:t xml:space="preserve">search object</w:t>
+      </w:r>
+      <w:r>
+        <w:t xml:space="preserve"> </w:t>
+      </w:r>
+      <w:r>
+        <w:t xml:space="preserve">or a</w:t>
       </w:r>
       <w:r>
         <w:t xml:space="preserve"> </w:t>
@@ -8433,13 +8440,73 @@
           <w:b/>
           <w:bCs/>
         </w:rPr>
-        <w:t xml:space="preserve">SuiteQL query</w:t>
-      </w:r>
-      <w:r>
-        <w:t xml:space="preserve"> </w:t>
-      </w:r>
-      <w:r>
-        <w:t xml:space="preserve">— the platform handles pagination automatically. Keep it minimal and delegate query construction to a library function.</w:t>
+        <w:t xml:space="preserve">SuiteQL query structure</w:t>
+      </w:r>
+      <w:r>
+        <w:t xml:space="preserve"> </w:t>
+      </w:r>
+      <w:r>
+        <w:t xml:space="preserve">— the Map/Reduce engine iterates and paginates it automatically. You don’t call</w:t>
+      </w:r>
+      <w:r>
+        <w:t xml:space="preserve"> </w:t>
+      </w:r>
+      <w:r>
+        <w:rPr>
+          <w:rStyle w:val="VerbatimChar"/>
+        </w:rPr>
+        <w:t xml:space="preserve">.run()</w:t>
+      </w:r>
+      <w:r>
+        <w:t xml:space="preserve">, you don’t call</w:t>
+      </w:r>
+      <w:r>
+        <w:t xml:space="preserve"> </w:t>
+      </w:r>
+      <w:r>
+        <w:rPr>
+          <w:rStyle w:val="VerbatimChar"/>
+        </w:rPr>
+        <w:t xml:space="preserve">.each()</w:t>
+      </w:r>
+      <w:r>
+        <w:t xml:space="preserve">, you don’t build arrays. Just return the structure and let the platform do the work.</w:t>
+      </w:r>
+    </w:p>
+    <w:p>
+      <w:pPr>
+        <w:pStyle w:val="BodyText"/>
+      </w:pPr>
+      <w:r>
+        <w:t xml:space="preserve">All search/query logic lives in a</w:t>
+      </w:r>
+      <w:r>
+        <w:t xml:space="preserve"> </w:t>
+      </w:r>
+      <w:r>
+        <w:rPr>
+          <w:b/>
+          <w:bCs/>
+        </w:rPr>
+        <w:t xml:space="preserve">separate lib file</w:t>
+      </w:r>
+      <w:r>
+        <w:t xml:space="preserve"> </w:t>
+      </w:r>
+      <w:r>
+        <w:t xml:space="preserve">(e.g.,</w:t>
+      </w:r>
+      <w:r>
+        <w:t xml:space="preserve"> </w:t>
+      </w:r>
+      <w:r>
+        <w:rPr>
+          <w:rStyle w:val="VerbatimChar"/>
+        </w:rPr>
+        <w:t xml:space="preserve">fp_lib_query.js</w:t>
+      </w:r>
+      <w:r>
+        <w:t xml:space="preserve">). The Map/Reduce script just calls the lib.</w:t>
       </w:r>
     </w:p>
     <w:p>
@@ -8457,7 +8524,32 @@
         <w:t xml:space="preserve"> </w:t>
       </w:r>
       <w:r>
-        <w:t xml:space="preserve">Always paginate. Saved searches and SuiteQL both have row limits that silently drop data if you don’t paginate. See</w:t>
+        <w:rPr>
+          <w:rStyle w:val="VerbatimChar"/>
+        </w:rPr>
+        <w:t xml:space="preserve">getInputData</w:t>
+      </w:r>
+      <w:r>
+        <w:t xml:space="preserve"> </w:t>
+      </w:r>
+      <w:r>
+        <w:t xml:space="preserve">sets up</w:t>
+      </w:r>
+      <w:r>
+        <w:t xml:space="preserve"> </w:t>
+      </w:r>
+      <w:r>
+        <w:rPr>
+          <w:i/>
+          <w:iCs/>
+        </w:rPr>
+        <w:t xml:space="preserve">what</w:t>
+      </w:r>
+      <w:r>
+        <w:t xml:space="preserve"> </w:t>
+      </w:r>
+      <w:r>
+        <w:t xml:space="preserve">to query — it never executes the query or builds results. The platform handles iteration and pagination. For pagination patterns outside of Map/Reduce (Suitelets, user events, standalone libs), see</w:t>
       </w:r>
       <w:r>
         <w:t xml:space="preserve"> </w:t>
@@ -8471,10 +8563,7 @@
         </w:r>
       </w:hyperlink>
       <w:r>
-        <w:t xml:space="preserve"> </w:t>
-      </w:r>
-      <w:r>
-        <w:t xml:space="preserve">for full patterns.</w:t>
+        <w:t xml:space="preserve">.</w:t>
       </w:r>
     </w:p>
     <w:p>
@@ -8482,47 +8571,11 @@
         <w:pStyle w:val="FirstParagraph"/>
       </w:pPr>
       <w:r>
-        <w:t xml:space="preserve">All search/query logic lives in a</w:t>
-      </w:r>
-      <w:r>
-        <w:t xml:space="preserve"> </w:t>
-      </w:r>
-      <w:r>
         <w:rPr>
           <w:b/>
           <w:bCs/>
         </w:rPr>
-        <w:t xml:space="preserve">separate lib file</w:t>
-      </w:r>
-      <w:r>
-        <w:t xml:space="preserve"> </w:t>
-      </w:r>
-      <w:r>
-        <w:t xml:space="preserve">(e.g.,</w:t>
-      </w:r>
-      <w:r>
-        <w:t xml:space="preserve"> </w:t>
-      </w:r>
-      <w:r>
-        <w:rPr>
-          <w:rStyle w:val="VerbatimChar"/>
-        </w:rPr>
-        <w:t xml:space="preserve">fp_lib_query.js</w:t>
-      </w:r>
-      <w:r>
-        <w:t xml:space="preserve">). The Map/Reduce script just calls the lib.</w:t>
-      </w:r>
-    </w:p>
-    <w:p>
-      <w:pPr>
-        <w:pStyle w:val="BodyText"/>
-      </w:pPr>
-      <w:r>
-        <w:rPr>
-          <w:b/>
-          <w:bCs/>
-        </w:rPr>
-        <w:t xml:space="preserve">Saved Search — platform paginates for you:</w:t>
+        <w:t xml:space="preserve">Saved Search — return the search object:</w:t>
       </w:r>
     </w:p>
     <w:p>
@@ -9183,7 +9236,7 @@
         <w:rPr>
           <w:rStyle w:val="CommentTok"/>
         </w:rPr>
-        <w:t xml:space="preserve">// NetSuite's Map/Reduce engine iterates the search automatically</w:t>
+        <w:t xml:space="preserve">// The Map/Reduce engine iterates and paginates automatically</w:t>
       </w:r>
       <w:r>
         <w:br/>
@@ -9204,88 +9257,7 @@
           <w:b/>
           <w:bCs/>
         </w:rPr>
-        <w:t xml:space="preserve">SuiteQL with pagination (</w:t>
-      </w:r>
-      <w:r>
-        <w:rPr>
-          <w:rStyle w:val="VerbatimChar"/>
-          <w:b/>
-          <w:bCs/>
-        </w:rPr>
-        <w:t xml:space="preserve">OFFSET</w:t>
-      </w:r>
-      <w:r>
-        <w:rPr>
-          <w:b/>
-          <w:bCs/>
-        </w:rPr>
-        <w:t xml:space="preserve">/</w:t>
-      </w:r>
-      <w:r>
-        <w:rPr>
-          <w:rStyle w:val="VerbatimChar"/>
-          <w:b/>
-          <w:bCs/>
-        </w:rPr>
-        <w:t xml:space="preserve">FETCH</w:t>
-      </w:r>
-      <w:r>
-        <w:rPr>
-          <w:b/>
-          <w:bCs/>
-        </w:rPr>
-        <w:t xml:space="preserve">):</w:t>
-      </w:r>
-    </w:p>
-    <w:p>
-      <w:pPr>
-        <w:pStyle w:val="BodyText"/>
-      </w:pPr>
-      <w:r>
-        <w:t xml:space="preserve">When using SuiteQL, the platform does</w:t>
-      </w:r>
-      <w:r>
-        <w:t xml:space="preserve"> </w:t>
-      </w:r>
-      <w:r>
-        <w:rPr>
-          <w:b/>
-          <w:bCs/>
-        </w:rPr>
-        <w:t xml:space="preserve">not</w:t>
-      </w:r>
-      <w:r>
-        <w:t xml:space="preserve"> </w:t>
-      </w:r>
-      <w:r>
-        <w:t xml:space="preserve">auto-paginate. The lib handles paging with</w:t>
-      </w:r>
-      <w:r>
-        <w:t xml:space="preserve"> </w:t>
-      </w:r>
-      <w:r>
-        <w:rPr>
-          <w:rStyle w:val="VerbatimChar"/>
-        </w:rPr>
-        <w:t xml:space="preserve">OFFSET</w:t>
-      </w:r>
-      <w:r>
-        <w:t xml:space="preserve"> </w:t>
-      </w:r>
-      <w:r>
-        <w:t xml:space="preserve">and</w:t>
-      </w:r>
-      <w:r>
-        <w:t xml:space="preserve"> </w:t>
-      </w:r>
-      <w:r>
-        <w:rPr>
-          <w:rStyle w:val="VerbatimChar"/>
-        </w:rPr>
-        <w:t xml:space="preserve">FETCH FIRST N ROWS ONLY</w:t>
-      </w:r>
-      <w:r>
-        <w:t xml:space="preserve">:</w:t>
+        <w:t xml:space="preserve">SuiteQL — return the query structure, not the results:</w:t>
       </w:r>
     </w:p>
     <w:p>
@@ -9296,7 +9268,16 @@
         <w:rPr>
           <w:rStyle w:val="CommentTok"/>
         </w:rPr>
-        <w:t xml:space="preserve">// ── fp_mr_sync_records.js ─────────────────────────────────</w:t>
+        <w:t xml:space="preserve">// ── fp_mr_update_addresses.js ─────────────────────────────</w:t>
+      </w:r>
+      <w:r>
+        <w:br/>
+      </w:r>
+      <w:r>
+        <w:rPr>
+          <w:rStyle w:val="CommentTok"/>
+        </w:rPr>
+        <w:t xml:space="preserve">// getInputData returns a SuiteQL structure — platform paginates</w:t>
       </w:r>
       <w:r>
         <w:br/>
@@ -9356,13 +9337,13 @@
         <w:rPr>
           <w:rStyle w:val="FunctionTok"/>
         </w:rPr>
-        <w:t xml:space="preserve">getAllTransactionIds</w:t>
-      </w:r>
-      <w:r>
-        <w:rPr>
-          <w:rStyle w:val="NormalTok"/>
-        </w:rPr>
-        <w:t xml:space="preserve">()</w:t>
+        <w:t xml:space="preserve">buildAddressQuery</w:t>
+      </w:r>
+      <w:r>
+        <w:rPr>
+          <w:rStyle w:val="NormalTok"/>
+        </w:rPr>
+        <w:t xml:space="preserve">(batchSize)</w:t>
       </w:r>
       <w:r>
         <w:rPr>
@@ -9395,6 +9376,15 @@
       </w:r>
       <w:r>
         <w:rPr>
+          <w:rStyle w:val="CommentTok"/>
+        </w:rPr>
+        <w:t xml:space="preserve">// Query construction lives here — testable, reusable</w:t>
+      </w:r>
+      <w:r>
+        <w:br/>
+      </w:r>
+      <w:r>
+        <w:rPr>
           <w:rStyle w:val="KeywordTok"/>
         </w:rPr>
         <w:t xml:space="preserve">function</w:t>
@@ -9409,13 +9399,13 @@
         <w:rPr>
           <w:rStyle w:val="FunctionTok"/>
         </w:rPr>
-        <w:t xml:space="preserve">getAllTransactionIds</w:t>
-      </w:r>
-      <w:r>
-        <w:rPr>
-          <w:rStyle w:val="NormalTok"/>
-        </w:rPr>
-        <w:t xml:space="preserve">() {</w:t>
+        <w:t xml:space="preserve">buildAddressQuery</w:t>
+      </w:r>
+      <w:r>
+        <w:rPr>
+          <w:rStyle w:val="NormalTok"/>
+        </w:rPr>
+        <w:t xml:space="preserve">(batchSize) {</w:t>
       </w:r>
       <w:r>
         <w:br/>
@@ -9428,33 +9418,255 @@
       </w:r>
       <w:r>
         <w:rPr>
-          <w:rStyle w:val="KeywordTok"/>
-        </w:rPr>
-        <w:t xml:space="preserve">const</w:t>
-      </w:r>
-      <w:r>
-        <w:rPr>
-          <w:rStyle w:val="NormalTok"/>
-        </w:rPr>
-        <w:t xml:space="preserve"> PAGE_SIZE </w:t>
-      </w:r>
-      <w:r>
-        <w:rPr>
-          <w:rStyle w:val="OperatorTok"/>
-        </w:rPr>
-        <w:t xml:space="preserve">=</w:t>
-      </w:r>
-      <w:r>
-        <w:rPr>
-          <w:rStyle w:val="NormalTok"/>
-        </w:rPr>
-        <w:t xml:space="preserve"> </w:t>
-      </w:r>
-      <w:r>
-        <w:rPr>
-          <w:rStyle w:val="DecValTok"/>
-        </w:rPr>
-        <w:t xml:space="preserve">1000</w:t>
+          <w:rStyle w:val="ControlFlowTok"/>
+        </w:rPr>
+        <w:t xml:space="preserve">return</w:t>
+      </w:r>
+      <w:r>
+        <w:rPr>
+          <w:rStyle w:val="NormalTok"/>
+        </w:rPr>
+        <w:t xml:space="preserve"> {</w:t>
+      </w:r>
+      <w:r>
+        <w:br/>
+      </w:r>
+      <w:r>
+        <w:rPr>
+          <w:rStyle w:val="NormalTok"/>
+        </w:rPr>
+        <w:t xml:space="preserve">        </w:t>
+      </w:r>
+      <w:r>
+        <w:rPr>
+          <w:rStyle w:val="DataTypeTok"/>
+        </w:rPr>
+        <w:t xml:space="preserve">type</w:t>
+      </w:r>
+      <w:r>
+        <w:rPr>
+          <w:rStyle w:val="OperatorTok"/>
+        </w:rPr>
+        <w:t xml:space="preserve">:</w:t>
+      </w:r>
+      <w:r>
+        <w:rPr>
+          <w:rStyle w:val="NormalTok"/>
+        </w:rPr>
+        <w:t xml:space="preserve"> </w:t>
+      </w:r>
+      <w:r>
+        <w:rPr>
+          <w:rStyle w:val="StringTok"/>
+        </w:rPr>
+        <w:t xml:space="preserve">'suiteql'</w:t>
+      </w:r>
+      <w:r>
+        <w:rPr>
+          <w:rStyle w:val="OperatorTok"/>
+        </w:rPr>
+        <w:t xml:space="preserve">,</w:t>
+      </w:r>
+      <w:r>
+        <w:br/>
+      </w:r>
+      <w:r>
+        <w:rPr>
+          <w:rStyle w:val="NormalTok"/>
+        </w:rPr>
+        <w:t xml:space="preserve">        </w:t>
+      </w:r>
+      <w:r>
+        <w:rPr>
+          <w:rStyle w:val="DataTypeTok"/>
+        </w:rPr>
+        <w:t xml:space="preserve">query</w:t>
+      </w:r>
+      <w:r>
+        <w:rPr>
+          <w:rStyle w:val="OperatorTok"/>
+        </w:rPr>
+        <w:t xml:space="preserve">:</w:t>
+      </w:r>
+      <w:r>
+        <w:rPr>
+          <w:rStyle w:val="NormalTok"/>
+        </w:rPr>
+        <w:t xml:space="preserve"> </w:t>
+      </w:r>
+      <w:r>
+        <w:rPr>
+          <w:rStyle w:val="VerbatimStringTok"/>
+        </w:rPr>
+        <w:t xml:space="preserve">`</w:t>
+      </w:r>
+      <w:r>
+        <w:br/>
+      </w:r>
+      <w:r>
+        <w:rPr>
+          <w:rStyle w:val="VerbatimStringTok"/>
+        </w:rPr>
+        <w:t xml:space="preserve">            SELECT TOP </w:t>
+      </w:r>
+      <w:r>
+        <w:rPr>
+          <w:rStyle w:val="SpecialCharTok"/>
+        </w:rPr>
+        <w:t xml:space="preserve">${</w:t>
+      </w:r>
+      <w:r>
+        <w:rPr>
+          <w:rStyle w:val="NormalTok"/>
+        </w:rPr>
+        <w:t xml:space="preserve">batchSize</w:t>
+      </w:r>
+      <w:r>
+        <w:rPr>
+          <w:rStyle w:val="SpecialCharTok"/>
+        </w:rPr>
+        <w:t xml:space="preserve">}</w:t>
+      </w:r>
+      <w:r>
+        <w:rPr>
+          <w:rStyle w:val="VerbatimStringTok"/>
+        </w:rPr>
+        <w:t xml:space="preserve"> customer.id AS entityid,</w:t>
+      </w:r>
+      <w:r>
+        <w:br/>
+      </w:r>
+      <w:r>
+        <w:rPr>
+          <w:rStyle w:val="VerbatimStringTok"/>
+        </w:rPr>
+        <w:t xml:space="preserve">                ShipToAddress.addr1 AS line1,</w:t>
+      </w:r>
+      <w:r>
+        <w:br/>
+      </w:r>
+      <w:r>
+        <w:rPr>
+          <w:rStyle w:val="VerbatimStringTok"/>
+        </w:rPr>
+        <w:t xml:space="preserve">                ShipToAddress.city AS city,</w:t>
+      </w:r>
+      <w:r>
+        <w:br/>
+      </w:r>
+      <w:r>
+        <w:rPr>
+          <w:rStyle w:val="VerbatimStringTok"/>
+        </w:rPr>
+        <w:t xml:space="preserve">                ShipToAddress.state AS state,</w:t>
+      </w:r>
+      <w:r>
+        <w:br/>
+      </w:r>
+      <w:r>
+        <w:rPr>
+          <w:rStyle w:val="VerbatimStringTok"/>
+        </w:rPr>
+        <w:t xml:space="preserve">                ShipToAddress.zip AS zip</w:t>
+      </w:r>
+      <w:r>
+        <w:br/>
+      </w:r>
+      <w:r>
+        <w:rPr>
+          <w:rStyle w:val="VerbatimStringTok"/>
+        </w:rPr>
+        <w:t xml:space="preserve">            FROM customer</w:t>
+      </w:r>
+      <w:r>
+        <w:br/>
+      </w:r>
+      <w:r>
+        <w:rPr>
+          <w:rStyle w:val="VerbatimStringTok"/>
+        </w:rPr>
+        <w:t xml:space="preserve">                LEFT OUTER JOIN entityaddressbook AS DefaultShipping</w:t>
+      </w:r>
+      <w:r>
+        <w:br/>
+      </w:r>
+      <w:r>
+        <w:rPr>
+          <w:rStyle w:val="VerbatimStringTok"/>
+        </w:rPr>
+        <w:t xml:space="preserve">                    ON (DefaultShipping.entity = customer.id)</w:t>
+      </w:r>
+      <w:r>
+        <w:br/>
+      </w:r>
+      <w:r>
+        <w:rPr>
+          <w:rStyle w:val="VerbatimStringTok"/>
+        </w:rPr>
+        <w:t xml:space="preserve">                    AND (DefaultShipping.defaultshipping = 'T')</w:t>
+      </w:r>
+      <w:r>
+        <w:br/>
+      </w:r>
+      <w:r>
+        <w:rPr>
+          <w:rStyle w:val="VerbatimStringTok"/>
+        </w:rPr>
+        <w:t xml:space="preserve">                LEFT OUTER JOIN entityaddress AS ShipToAddress</w:t>
+      </w:r>
+      <w:r>
+        <w:br/>
+      </w:r>
+      <w:r>
+        <w:rPr>
+          <w:rStyle w:val="VerbatimStringTok"/>
+        </w:rPr>
+        <w:t xml:space="preserve">                    ON (ShipToAddress.nkey = DefaultShipping.addressbookaddress)</w:t>
+      </w:r>
+      <w:r>
+        <w:br/>
+      </w:r>
+      <w:r>
+        <w:rPr>
+          <w:rStyle w:val="VerbatimStringTok"/>
+        </w:rPr>
+        <w:t xml:space="preserve">            WHERE customer.isinactive = 'F'</w:t>
+      </w:r>
+      <w:r>
+        <w:br/>
+      </w:r>
+      <w:r>
+        <w:rPr>
+          <w:rStyle w:val="VerbatimStringTok"/>
+        </w:rPr>
+        <w:t xml:space="preserve">                AND ShipToAddress.addr1 IS NOT NULL</w:t>
+      </w:r>
+      <w:r>
+        <w:br/>
+      </w:r>
+      <w:r>
+        <w:rPr>
+          <w:rStyle w:val="VerbatimStringTok"/>
+        </w:rPr>
+        <w:t xml:space="preserve">            ORDER BY customer.id DESC</w:t>
+      </w:r>
+      <w:r>
+        <w:br/>
+      </w:r>
+      <w:r>
+        <w:rPr>
+          <w:rStyle w:val="VerbatimStringTok"/>
+        </w:rPr>
+        <w:t xml:space="preserve">        `</w:t>
+      </w:r>
+      <w:r>
+        <w:br/>
+      </w:r>
+      <w:r>
+        <w:rPr>
+          <w:rStyle w:val="NormalTok"/>
+        </w:rPr>
+        <w:t xml:space="preserve">    }</w:t>
       </w:r>
       <w:r>
         <w:rPr>
@@ -9473,39 +9685,9 @@
       </w:r>
       <w:r>
         <w:rPr>
-          <w:rStyle w:val="KeywordTok"/>
-        </w:rPr>
-        <w:t xml:space="preserve">let</w:t>
-      </w:r>
-      <w:r>
-        <w:rPr>
-          <w:rStyle w:val="NormalTok"/>
-        </w:rPr>
-        <w:t xml:space="preserve"> offset </w:t>
-      </w:r>
-      <w:r>
-        <w:rPr>
-          <w:rStyle w:val="OperatorTok"/>
-        </w:rPr>
-        <w:t xml:space="preserve">=</w:t>
-      </w:r>
-      <w:r>
-        <w:rPr>
-          <w:rStyle w:val="NormalTok"/>
-        </w:rPr>
-        <w:t xml:space="preserve"> </w:t>
-      </w:r>
-      <w:r>
-        <w:rPr>
-          <w:rStyle w:val="DecValTok"/>
-        </w:rPr>
-        <w:t xml:space="preserve">0</w:t>
-      </w:r>
-      <w:r>
-        <w:rPr>
-          <w:rStyle w:val="OperatorTok"/>
-        </w:rPr>
-        <w:t xml:space="preserve">;</w:t>
+          <w:rStyle w:val="CommentTok"/>
+        </w:rPr>
+        <w:t xml:space="preserve">// Return { type: 'suiteql', query: '...' } — DON'T call runSuiteQL()</w:t>
       </w:r>
       <w:r>
         <w:br/>
@@ -9518,510 +9700,9 @@
       </w:r>
       <w:r>
         <w:rPr>
-          <w:rStyle w:val="KeywordTok"/>
-        </w:rPr>
-        <w:t xml:space="preserve">const</w:t>
-      </w:r>
-      <w:r>
-        <w:rPr>
-          <w:rStyle w:val="NormalTok"/>
-        </w:rPr>
-        <w:t xml:space="preserve"> allResults </w:t>
-      </w:r>
-      <w:r>
-        <w:rPr>
-          <w:rStyle w:val="OperatorTok"/>
-        </w:rPr>
-        <w:t xml:space="preserve">=</w:t>
-      </w:r>
-      <w:r>
-        <w:rPr>
-          <w:rStyle w:val="NormalTok"/>
-        </w:rPr>
-        <w:t xml:space="preserve"> []</w:t>
-      </w:r>
-      <w:r>
-        <w:rPr>
-          <w:rStyle w:val="OperatorTok"/>
-        </w:rPr>
-        <w:t xml:space="preserve">;</w:t>
-      </w:r>
-      <w:r>
-        <w:br/>
-      </w:r>
-      <w:r>
-        <w:rPr>
-          <w:rStyle w:val="NormalTok"/>
-        </w:rPr>
-        <w:t xml:space="preserve">    </w:t>
-      </w:r>
-      <w:r>
-        <w:rPr>
-          <w:rStyle w:val="KeywordTok"/>
-        </w:rPr>
-        <w:t xml:space="preserve">let</w:t>
-      </w:r>
-      <w:r>
-        <w:rPr>
-          <w:rStyle w:val="NormalTok"/>
-        </w:rPr>
-        <w:t xml:space="preserve"> hasMore </w:t>
-      </w:r>
-      <w:r>
-        <w:rPr>
-          <w:rStyle w:val="OperatorTok"/>
-        </w:rPr>
-        <w:t xml:space="preserve">=</w:t>
-      </w:r>
-      <w:r>
-        <w:rPr>
-          <w:rStyle w:val="NormalTok"/>
-        </w:rPr>
-        <w:t xml:space="preserve"> </w:t>
-      </w:r>
-      <w:r>
-        <w:rPr>
-          <w:rStyle w:val="KeywordTok"/>
-        </w:rPr>
-        <w:t xml:space="preserve">true</w:t>
-      </w:r>
-      <w:r>
-        <w:rPr>
-          <w:rStyle w:val="OperatorTok"/>
-        </w:rPr>
-        <w:t xml:space="preserve">;</w:t>
-      </w:r>
-      <w:r>
-        <w:br/>
-      </w:r>
-      <w:r>
-        <w:br/>
-      </w:r>
-      <w:r>
-        <w:rPr>
-          <w:rStyle w:val="NormalTok"/>
-        </w:rPr>
-        <w:t xml:space="preserve">    </w:t>
-      </w:r>
-      <w:r>
-        <w:rPr>
-          <w:rStyle w:val="ControlFlowTok"/>
-        </w:rPr>
-        <w:t xml:space="preserve">while</w:t>
-      </w:r>
-      <w:r>
-        <w:rPr>
-          <w:rStyle w:val="NormalTok"/>
-        </w:rPr>
-        <w:t xml:space="preserve"> (hasMore) {</w:t>
-      </w:r>
-      <w:r>
-        <w:br/>
-      </w:r>
-      <w:r>
-        <w:rPr>
-          <w:rStyle w:val="NormalTok"/>
-        </w:rPr>
-        <w:t xml:space="preserve">        </w:t>
-      </w:r>
-      <w:r>
-        <w:rPr>
-          <w:rStyle w:val="KeywordTok"/>
-        </w:rPr>
-        <w:t xml:space="preserve">const</w:t>
-      </w:r>
-      <w:r>
-        <w:rPr>
-          <w:rStyle w:val="NormalTok"/>
-        </w:rPr>
-        <w:t xml:space="preserve"> results </w:t>
-      </w:r>
-      <w:r>
-        <w:rPr>
-          <w:rStyle w:val="OperatorTok"/>
-        </w:rPr>
-        <w:t xml:space="preserve">=</w:t>
-      </w:r>
-      <w:r>
-        <w:rPr>
-          <w:rStyle w:val="NormalTok"/>
-        </w:rPr>
-        <w:t xml:space="preserve"> query</w:t>
-      </w:r>
-      <w:r>
-        <w:rPr>
-          <w:rStyle w:val="OperatorTok"/>
-        </w:rPr>
-        <w:t xml:space="preserve">.</w:t>
-      </w:r>
-      <w:r>
-        <w:rPr>
-          <w:rStyle w:val="FunctionTok"/>
-        </w:rPr>
-        <w:t xml:space="preserve">runSuiteQL</w:t>
-      </w:r>
-      <w:r>
-        <w:rPr>
-          <w:rStyle w:val="NormalTok"/>
-        </w:rPr>
-        <w:t xml:space="preserve">({</w:t>
-      </w:r>
-      <w:r>
-        <w:br/>
-      </w:r>
-      <w:r>
-        <w:rPr>
-          <w:rStyle w:val="NormalTok"/>
-        </w:rPr>
-        <w:t xml:space="preserve">            </w:t>
-      </w:r>
-      <w:r>
-        <w:rPr>
-          <w:rStyle w:val="DataTypeTok"/>
-        </w:rPr>
-        <w:t xml:space="preserve">query</w:t>
-      </w:r>
-      <w:r>
-        <w:rPr>
-          <w:rStyle w:val="OperatorTok"/>
-        </w:rPr>
-        <w:t xml:space="preserve">:</w:t>
-      </w:r>
-      <w:r>
-        <w:rPr>
-          <w:rStyle w:val="NormalTok"/>
-        </w:rPr>
-        <w:t xml:space="preserve"> </w:t>
-      </w:r>
-      <w:r>
-        <w:rPr>
-          <w:rStyle w:val="VerbatimStringTok"/>
-        </w:rPr>
-        <w:t xml:space="preserve">`</w:t>
-      </w:r>
-      <w:r>
-        <w:br/>
-      </w:r>
-      <w:r>
-        <w:rPr>
-          <w:rStyle w:val="VerbatimStringTok"/>
-        </w:rPr>
-        <w:t xml:space="preserve">                SELECT id, type, tranid</w:t>
-      </w:r>
-      <w:r>
-        <w:br/>
-      </w:r>
-      <w:r>
-        <w:rPr>
-          <w:rStyle w:val="VerbatimStringTok"/>
-        </w:rPr>
-        <w:t xml:space="preserve">                FROM transaction</w:t>
-      </w:r>
-      <w:r>
-        <w:br/>
-      </w:r>
-      <w:r>
-        <w:rPr>
-          <w:rStyle w:val="VerbatimStringTok"/>
-        </w:rPr>
-        <w:t xml:space="preserve">                WHERE custbody_fp_needs_processing = 'T'</w:t>
-      </w:r>
-      <w:r>
-        <w:br/>
-      </w:r>
-      <w:r>
-        <w:rPr>
-          <w:rStyle w:val="VerbatimStringTok"/>
-        </w:rPr>
-        <w:t xml:space="preserve">                  AND type IN ('SalesOrd', 'CustInvc')</w:t>
-      </w:r>
-      <w:r>
-        <w:br/>
-      </w:r>
-      <w:r>
-        <w:rPr>
-          <w:rStyle w:val="VerbatimStringTok"/>
-        </w:rPr>
-        <w:t xml:space="preserve">                ORDER BY id</w:t>
-      </w:r>
-      <w:r>
-        <w:br/>
-      </w:r>
-      <w:r>
-        <w:rPr>
-          <w:rStyle w:val="VerbatimStringTok"/>
-        </w:rPr>
-        <w:t xml:space="preserve">                OFFSET </w:t>
-      </w:r>
-      <w:r>
-        <w:rPr>
-          <w:rStyle w:val="SpecialCharTok"/>
-        </w:rPr>
-        <w:t xml:space="preserve">${</w:t>
-      </w:r>
-      <w:r>
-        <w:rPr>
-          <w:rStyle w:val="NormalTok"/>
-        </w:rPr>
-        <w:t xml:space="preserve">offset</w:t>
-      </w:r>
-      <w:r>
-        <w:rPr>
-          <w:rStyle w:val="SpecialCharTok"/>
-        </w:rPr>
-        <w:t xml:space="preserve">}</w:t>
-      </w:r>
-      <w:r>
-        <w:rPr>
-          <w:rStyle w:val="VerbatimStringTok"/>
-        </w:rPr>
-        <w:t xml:space="preserve"> ROWS</w:t>
-      </w:r>
-      <w:r>
-        <w:br/>
-      </w:r>
-      <w:r>
-        <w:rPr>
-          <w:rStyle w:val="VerbatimStringTok"/>
-        </w:rPr>
-        <w:t xml:space="preserve">                FETCH FIRST </w:t>
-      </w:r>
-      <w:r>
-        <w:rPr>
-          <w:rStyle w:val="SpecialCharTok"/>
-        </w:rPr>
-        <w:t xml:space="preserve">${</w:t>
-      </w:r>
-      <w:r>
-        <w:rPr>
-          <w:rStyle w:val="NormalTok"/>
-        </w:rPr>
-        <w:t xml:space="preserve">PAGE_SIZE</w:t>
-      </w:r>
-      <w:r>
-        <w:rPr>
-          <w:rStyle w:val="SpecialCharTok"/>
-        </w:rPr>
-        <w:t xml:space="preserve">}</w:t>
-      </w:r>
-      <w:r>
-        <w:rPr>
-          <w:rStyle w:val="VerbatimStringTok"/>
-        </w:rPr>
-        <w:t xml:space="preserve"> ROWS ONLY</w:t>
-      </w:r>
-      <w:r>
-        <w:br/>
-      </w:r>
-      <w:r>
-        <w:rPr>
-          <w:rStyle w:val="VerbatimStringTok"/>
-        </w:rPr>
-        <w:t xml:space="preserve">            `</w:t>
-      </w:r>
-      <w:r>
-        <w:br/>
-      </w:r>
-      <w:r>
-        <w:rPr>
-          <w:rStyle w:val="NormalTok"/>
-        </w:rPr>
-        <w:t xml:space="preserve">        })</w:t>
-      </w:r>
-      <w:r>
-        <w:rPr>
-          <w:rStyle w:val="OperatorTok"/>
-        </w:rPr>
-        <w:t xml:space="preserve">.</w:t>
-      </w:r>
-      <w:r>
-        <w:rPr>
-          <w:rStyle w:val="FunctionTok"/>
-        </w:rPr>
-        <w:t xml:space="preserve">asMappedResults</w:t>
-      </w:r>
-      <w:r>
-        <w:rPr>
-          <w:rStyle w:val="NormalTok"/>
-        </w:rPr>
-        <w:t xml:space="preserve">()</w:t>
-      </w:r>
-      <w:r>
-        <w:rPr>
-          <w:rStyle w:val="OperatorTok"/>
-        </w:rPr>
-        <w:t xml:space="preserve">;</w:t>
-      </w:r>
-      <w:r>
-        <w:br/>
-      </w:r>
-      <w:r>
-        <w:br/>
-      </w:r>
-      <w:r>
-        <w:rPr>
-          <w:rStyle w:val="NormalTok"/>
-        </w:rPr>
-        <w:t xml:space="preserve">        allResults</w:t>
-      </w:r>
-      <w:r>
-        <w:rPr>
-          <w:rStyle w:val="OperatorTok"/>
-        </w:rPr>
-        <w:t xml:space="preserve">.</w:t>
-      </w:r>
-      <w:r>
-        <w:rPr>
-          <w:rStyle w:val="FunctionTok"/>
-        </w:rPr>
-        <w:t xml:space="preserve">push</w:t>
-      </w:r>
-      <w:r>
-        <w:rPr>
-          <w:rStyle w:val="NormalTok"/>
-        </w:rPr>
-        <w:t xml:space="preserve">(</w:t>
-      </w:r>
-      <w:r>
-        <w:rPr>
-          <w:rStyle w:val="OperatorTok"/>
-        </w:rPr>
-        <w:t xml:space="preserve">...</w:t>
-      </w:r>
-      <w:r>
-        <w:rPr>
-          <w:rStyle w:val="NormalTok"/>
-        </w:rPr>
-        <w:t xml:space="preserve">results)</w:t>
-      </w:r>
-      <w:r>
-        <w:rPr>
-          <w:rStyle w:val="OperatorTok"/>
-        </w:rPr>
-        <w:t xml:space="preserve">;</w:t>
-      </w:r>
-      <w:r>
-        <w:br/>
-      </w:r>
-      <w:r>
-        <w:rPr>
-          <w:rStyle w:val="NormalTok"/>
-        </w:rPr>
-        <w:t xml:space="preserve">        hasMore </w:t>
-      </w:r>
-      <w:r>
-        <w:rPr>
-          <w:rStyle w:val="OperatorTok"/>
-        </w:rPr>
-        <w:t xml:space="preserve">=</w:t>
-      </w:r>
-      <w:r>
-        <w:rPr>
-          <w:rStyle w:val="NormalTok"/>
-        </w:rPr>
-        <w:t xml:space="preserve"> results</w:t>
-      </w:r>
-      <w:r>
-        <w:rPr>
-          <w:rStyle w:val="OperatorTok"/>
-        </w:rPr>
-        <w:t xml:space="preserve">.</w:t>
-      </w:r>
-      <w:r>
-        <w:rPr>
-          <w:rStyle w:val="AttributeTok"/>
-        </w:rPr>
-        <w:t xml:space="preserve">length</w:t>
-      </w:r>
-      <w:r>
-        <w:rPr>
-          <w:rStyle w:val="NormalTok"/>
-        </w:rPr>
-        <w:t xml:space="preserve"> </w:t>
-      </w:r>
-      <w:r>
-        <w:rPr>
-          <w:rStyle w:val="OperatorTok"/>
-        </w:rPr>
-        <w:t xml:space="preserve">===</w:t>
-      </w:r>
-      <w:r>
-        <w:rPr>
-          <w:rStyle w:val="NormalTok"/>
-        </w:rPr>
-        <w:t xml:space="preserve"> PAGE_SIZE</w:t>
-      </w:r>
-      <w:r>
-        <w:rPr>
-          <w:rStyle w:val="OperatorTok"/>
-        </w:rPr>
-        <w:t xml:space="preserve">;</w:t>
-      </w:r>
-      <w:r>
-        <w:br/>
-      </w:r>
-      <w:r>
-        <w:rPr>
-          <w:rStyle w:val="NormalTok"/>
-        </w:rPr>
-        <w:t xml:space="preserve">        offset </w:t>
-      </w:r>
-      <w:r>
-        <w:rPr>
-          <w:rStyle w:val="OperatorTok"/>
-        </w:rPr>
-        <w:t xml:space="preserve">+=</w:t>
-      </w:r>
-      <w:r>
-        <w:rPr>
-          <w:rStyle w:val="NormalTok"/>
-        </w:rPr>
-        <w:t xml:space="preserve"> PAGE_SIZE</w:t>
-      </w:r>
-      <w:r>
-        <w:rPr>
-          <w:rStyle w:val="OperatorTok"/>
-        </w:rPr>
-        <w:t xml:space="preserve">;</w:t>
-      </w:r>
-      <w:r>
-        <w:br/>
-      </w:r>
-      <w:r>
-        <w:rPr>
-          <w:rStyle w:val="NormalTok"/>
-        </w:rPr>
-        <w:t xml:space="preserve">    }</w:t>
-      </w:r>
-      <w:r>
-        <w:br/>
-      </w:r>
-      <w:r>
-        <w:br/>
-      </w:r>
-      <w:r>
-        <w:rPr>
-          <w:rStyle w:val="NormalTok"/>
-        </w:rPr>
-        <w:t xml:space="preserve">    </w:t>
-      </w:r>
-      <w:r>
-        <w:rPr>
-          <w:rStyle w:val="ControlFlowTok"/>
-        </w:rPr>
-        <w:t xml:space="preserve">return</w:t>
-      </w:r>
-      <w:r>
-        <w:rPr>
-          <w:rStyle w:val="NormalTok"/>
-        </w:rPr>
-        <w:t xml:space="preserve"> allResults</w:t>
-      </w:r>
-      <w:r>
-        <w:rPr>
-          <w:rStyle w:val="OperatorTok"/>
-        </w:rPr>
-        <w:t xml:space="preserve">;</w:t>
+          <w:rStyle w:val="CommentTok"/>
+        </w:rPr>
+        <w:t xml:space="preserve">// The Map/Reduce engine executes the query and paginates automatically</w:t>
       </w:r>
       <w:r>
         <w:br/>
@@ -10042,7 +9723,7 @@
           <w:b/>
           <w:bCs/>
         </w:rPr>
-        <w:t xml:space="preserve">External API call — also in a lib:</w:t>
+        <w:t xml:space="preserve">Loading a saved search by ID — same pattern:</w:t>
       </w:r>
     </w:p>
     <w:p>
@@ -10053,7 +9734,7 @@
         <w:rPr>
           <w:rStyle w:val="CommentTok"/>
         </w:rPr>
-        <w:t xml:space="preserve">// ── fp_mr_upsert_tax_codes.js ─────────────────────────────</w:t>
+        <w:t xml:space="preserve">// ── fp_mr_sync_records.js ─────────────────────────────────</w:t>
       </w:r>
       <w:r>
         <w:br/>
@@ -10101,7 +9782,7 @@
         <w:rPr>
           <w:rStyle w:val="NormalTok"/>
         </w:rPr>
-        <w:t xml:space="preserve"> fp_lib_api_connect</w:t>
+        <w:t xml:space="preserve"> fp_lib_query</w:t>
       </w:r>
       <w:r>
         <w:rPr>
@@ -10113,7 +9794,7 @@
         <w:rPr>
           <w:rStyle w:val="FunctionTok"/>
         </w:rPr>
-        <w:t xml:space="preserve">getTaxCodes</w:t>
+        <w:t xml:space="preserve">loadPendingTransactionSearch</w:t>
       </w:r>
       <w:r>
         <w:rPr>
@@ -10145,7 +9826,7 @@
         <w:rPr>
           <w:rStyle w:val="CommentTok"/>
         </w:rPr>
-        <w:t xml:space="preserve">// ── fp_lib_api_connect.js ─────────────────────────────────</w:t>
+        <w:t xml:space="preserve">// ── fp_lib_query.js ───────────────────────────────────────</w:t>
       </w:r>
       <w:r>
         <w:br/>
@@ -10166,7 +9847,7 @@
         <w:rPr>
           <w:rStyle w:val="FunctionTok"/>
         </w:rPr>
-        <w:t xml:space="preserve">getTaxCodes</w:t>
+        <w:t xml:space="preserve">loadPendingTransactionSearch</w:t>
       </w:r>
       <w:r>
         <w:rPr>
@@ -10185,27 +9866,15 @@
       </w:r>
       <w:r>
         <w:rPr>
-          <w:rStyle w:val="KeywordTok"/>
-        </w:rPr>
-        <w:t xml:space="preserve">const</w:t>
-      </w:r>
-      <w:r>
-        <w:rPr>
-          <w:rStyle w:val="NormalTok"/>
-        </w:rPr>
-        <w:t xml:space="preserve"> response </w:t>
-      </w:r>
-      <w:r>
-        <w:rPr>
-          <w:rStyle w:val="OperatorTok"/>
-        </w:rPr>
-        <w:t xml:space="preserve">=</w:t>
-      </w:r>
-      <w:r>
-        <w:rPr>
-          <w:rStyle w:val="NormalTok"/>
-        </w:rPr>
-        <w:t xml:space="preserve"> https</w:t>
+          <w:rStyle w:val="ControlFlowTok"/>
+        </w:rPr>
+        <w:t xml:space="preserve">return</w:t>
+      </w:r>
+      <w:r>
+        <w:rPr>
+          <w:rStyle w:val="NormalTok"/>
+        </w:rPr>
+        <w:t xml:space="preserve"> search</w:t>
       </w:r>
       <w:r>
         <w:rPr>
@@ -10217,7 +9886,7 @@
         <w:rPr>
           <w:rStyle w:val="FunctionTok"/>
         </w:rPr>
-        <w:t xml:space="preserve">post</w:t>
+        <w:t xml:space="preserve">load</w:t>
       </w:r>
       <w:r>
         <w:rPr>
@@ -10229,7 +9898,7 @@
         <w:rPr>
           <w:rStyle w:val="DataTypeTok"/>
         </w:rPr>
-        <w:t xml:space="preserve">url</w:t>
+        <w:t xml:space="preserve">id</w:t>
       </w:r>
       <w:r>
         <w:rPr>
@@ -10241,67 +9910,19 @@
         <w:rPr>
           <w:rStyle w:val="NormalTok"/>
         </w:rPr>
-        <w:t xml:space="preserve"> endpoint</w:t>
-      </w:r>
-      <w:r>
-        <w:rPr>
-          <w:rStyle w:val="OperatorTok"/>
-        </w:rPr>
-        <w:t xml:space="preserve">,</w:t>
-      </w:r>
-      <w:r>
-        <w:rPr>
-          <w:rStyle w:val="NormalTok"/>
-        </w:rPr>
-        <w:t xml:space="preserve"> </w:t>
-      </w:r>
-      <w:r>
-        <w:rPr>
-          <w:rStyle w:val="DataTypeTok"/>
-        </w:rPr>
-        <w:t xml:space="preserve">headers</w:t>
-      </w:r>
-      <w:r>
-        <w:rPr>
-          <w:rStyle w:val="OperatorTok"/>
-        </w:rPr>
-        <w:t xml:space="preserve">:</w:t>
-      </w:r>
-      <w:r>
-        <w:rPr>
-          <w:rStyle w:val="NormalTok"/>
-        </w:rPr>
-        <w:t xml:space="preserve"> authHeaders</w:t>
-      </w:r>
-      <w:r>
-        <w:rPr>
-          <w:rStyle w:val="OperatorTok"/>
-        </w:rPr>
-        <w:t xml:space="preserve">,</w:t>
-      </w:r>
-      <w:r>
-        <w:rPr>
-          <w:rStyle w:val="NormalTok"/>
-        </w:rPr>
-        <w:t xml:space="preserve"> </w:t>
-      </w:r>
-      <w:r>
-        <w:rPr>
-          <w:rStyle w:val="DataTypeTok"/>
-        </w:rPr>
-        <w:t xml:space="preserve">body</w:t>
-      </w:r>
-      <w:r>
-        <w:rPr>
-          <w:rStyle w:val="OperatorTok"/>
-        </w:rPr>
-        <w:t xml:space="preserve">:</w:t>
-      </w:r>
-      <w:r>
-        <w:rPr>
-          <w:rStyle w:val="NormalTok"/>
-        </w:rPr>
-        <w:t xml:space="preserve"> payload })</w:t>
+        <w:t xml:space="preserve"> </w:t>
+      </w:r>
+      <w:r>
+        <w:rPr>
+          <w:rStyle w:val="StringTok"/>
+        </w:rPr>
+        <w:t xml:space="preserve">'customsearch_fp_pending_transactions'</w:t>
+      </w:r>
+      <w:r>
+        <w:rPr>
+          <w:rStyle w:val="NormalTok"/>
+        </w:rPr>
+        <w:t xml:space="preserve"> })</w:t>
       </w:r>
       <w:r>
         <w:rPr>
@@ -10320,63 +9941,9 @@
       </w:r>
       <w:r>
         <w:rPr>
-          <w:rStyle w:val="ControlFlowTok"/>
-        </w:rPr>
-        <w:t xml:space="preserve">return</w:t>
-      </w:r>
-      <w:r>
-        <w:rPr>
-          <w:rStyle w:val="NormalTok"/>
-        </w:rPr>
-        <w:t xml:space="preserve"> </w:t>
-      </w:r>
-      <w:r>
-        <w:rPr>
-          <w:rStyle w:val="BuiltInTok"/>
-        </w:rPr>
-        <w:t xml:space="preserve">JSON</w:t>
-      </w:r>
-      <w:r>
-        <w:rPr>
-          <w:rStyle w:val="OperatorTok"/>
-        </w:rPr>
-        <w:t xml:space="preserve">.</w:t>
-      </w:r>
-      <w:r>
-        <w:rPr>
-          <w:rStyle w:val="FunctionTok"/>
-        </w:rPr>
-        <w:t xml:space="preserve">parse</w:t>
-      </w:r>
-      <w:r>
-        <w:rPr>
-          <w:rStyle w:val="NormalTok"/>
-        </w:rPr>
-        <w:t xml:space="preserve">(response</w:t>
-      </w:r>
-      <w:r>
-        <w:rPr>
-          <w:rStyle w:val="OperatorTok"/>
-        </w:rPr>
-        <w:t xml:space="preserve">.</w:t>
-      </w:r>
-      <w:r>
-        <w:rPr>
-          <w:rStyle w:val="AttributeTok"/>
-        </w:rPr>
-        <w:t xml:space="preserve">body</w:t>
-      </w:r>
-      <w:r>
-        <w:rPr>
-          <w:rStyle w:val="NormalTok"/>
-        </w:rPr>
-        <w:t xml:space="preserve">)</w:t>
-      </w:r>
-      <w:r>
-        <w:rPr>
-          <w:rStyle w:val="OperatorTok"/>
-        </w:rPr>
-        <w:t xml:space="preserve">;</w:t>
+          <w:rStyle w:val="CommentTok"/>
+        </w:rPr>
+        <w:t xml:space="preserve">// Platform paginates — no .run(), no .each(), no arrays</w:t>
       </w:r>
       <w:r>
         <w:br/>
@@ -10397,7 +9964,7 @@
           <w:b/>
           <w:bCs/>
         </w:rPr>
-        <w:t xml:space="preserve">What NOT to do:</w:t>
+        <w:t xml:space="preserve">External API call — the only case where you return data:</w:t>
       </w:r>
     </w:p>
     <w:p>
@@ -10408,7 +9975,7 @@
         <w:rPr>
           <w:rStyle w:val="CommentTok"/>
         </w:rPr>
-        <w:t xml:space="preserve">// BAD: Search logic inline in the Map/Reduce script — move to a lib file</w:t>
+        <w:t xml:space="preserve">// ── fp_mr_upsert_tax_codes.js ─────────────────────────────</w:t>
       </w:r>
       <w:r>
         <w:br/>
@@ -10448,426 +10015,39 @@
       </w:r>
       <w:r>
         <w:rPr>
-          <w:rStyle w:val="KeywordTok"/>
-        </w:rPr>
-        <w:t xml:space="preserve">const</w:t>
-      </w:r>
-      <w:r>
-        <w:rPr>
-          <w:rStyle w:val="NormalTok"/>
-        </w:rPr>
-        <w:t xml:space="preserve"> results </w:t>
-      </w:r>
-      <w:r>
-        <w:rPr>
-          <w:rStyle w:val="OperatorTok"/>
-        </w:rPr>
-        <w:t xml:space="preserve">=</w:t>
-      </w:r>
-      <w:r>
-        <w:rPr>
-          <w:rStyle w:val="NormalTok"/>
-        </w:rPr>
-        <w:t xml:space="preserve"> []</w:t>
+          <w:rStyle w:val="ControlFlowTok"/>
+        </w:rPr>
+        <w:t xml:space="preserve">return</w:t>
+      </w:r>
+      <w:r>
+        <w:rPr>
+          <w:rStyle w:val="NormalTok"/>
+        </w:rPr>
+        <w:t xml:space="preserve"> fp_lib_api_connect</w:t>
+      </w:r>
+      <w:r>
+        <w:rPr>
+          <w:rStyle w:val="OperatorTok"/>
+        </w:rPr>
+        <w:t xml:space="preserve">.</w:t>
+      </w:r>
+      <w:r>
+        <w:rPr>
+          <w:rStyle w:val="FunctionTok"/>
+        </w:rPr>
+        <w:t xml:space="preserve">getTaxCodes</w:t>
+      </w:r>
+      <w:r>
+        <w:rPr>
+          <w:rStyle w:val="NormalTok"/>
+        </w:rPr>
+        <w:t xml:space="preserve">()</w:t>
       </w:r>
       <w:r>
         <w:rPr>
           <w:rStyle w:val="OperatorTok"/>
         </w:rPr>
         <w:t xml:space="preserve">;</w:t>
-      </w:r>
-      <w:r>
-        <w:br/>
-      </w:r>
-      <w:r>
-        <w:rPr>
-          <w:rStyle w:val="NormalTok"/>
-        </w:rPr>
-        <w:t xml:space="preserve">    search</w:t>
-      </w:r>
-      <w:r>
-        <w:rPr>
-          <w:rStyle w:val="OperatorTok"/>
-        </w:rPr>
-        <w:t xml:space="preserve">.</w:t>
-      </w:r>
-      <w:r>
-        <w:rPr>
-          <w:rStyle w:val="FunctionTok"/>
-        </w:rPr>
-        <w:t xml:space="preserve">create</w:t>
-      </w:r>
-      <w:r>
-        <w:rPr>
-          <w:rStyle w:val="NormalTok"/>
-        </w:rPr>
-        <w:t xml:space="preserve">({</w:t>
-      </w:r>
-      <w:r>
-        <w:br/>
-      </w:r>
-      <w:r>
-        <w:rPr>
-          <w:rStyle w:val="NormalTok"/>
-        </w:rPr>
-        <w:t xml:space="preserve">        </w:t>
-      </w:r>
-      <w:r>
-        <w:rPr>
-          <w:rStyle w:val="DataTypeTok"/>
-        </w:rPr>
-        <w:t xml:space="preserve">type</w:t>
-      </w:r>
-      <w:r>
-        <w:rPr>
-          <w:rStyle w:val="OperatorTok"/>
-        </w:rPr>
-        <w:t xml:space="preserve">:</w:t>
-      </w:r>
-      <w:r>
-        <w:rPr>
-          <w:rStyle w:val="NormalTok"/>
-        </w:rPr>
-        <w:t xml:space="preserve"> </w:t>
-      </w:r>
-      <w:r>
-        <w:rPr>
-          <w:rStyle w:val="StringTok"/>
-        </w:rPr>
-        <w:t xml:space="preserve">'transaction'</w:t>
-      </w:r>
-      <w:r>
-        <w:rPr>
-          <w:rStyle w:val="OperatorTok"/>
-        </w:rPr>
-        <w:t xml:space="preserve">,</w:t>
-      </w:r>
-      <w:r>
-        <w:br/>
-      </w:r>
-      <w:r>
-        <w:rPr>
-          <w:rStyle w:val="NormalTok"/>
-        </w:rPr>
-        <w:t xml:space="preserve">        </w:t>
-      </w:r>
-      <w:r>
-        <w:rPr>
-          <w:rStyle w:val="DataTypeTok"/>
-        </w:rPr>
-        <w:t xml:space="preserve">filters</w:t>
-      </w:r>
-      <w:r>
-        <w:rPr>
-          <w:rStyle w:val="OperatorTok"/>
-        </w:rPr>
-        <w:t xml:space="preserve">:</w:t>
-      </w:r>
-      <w:r>
-        <w:rPr>
-          <w:rStyle w:val="NormalTok"/>
-        </w:rPr>
-        <w:t xml:space="preserve"> [[</w:t>
-      </w:r>
-      <w:r>
-        <w:rPr>
-          <w:rStyle w:val="StringTok"/>
-        </w:rPr>
-        <w:t xml:space="preserve">'type'</w:t>
-      </w:r>
-      <w:r>
-        <w:rPr>
-          <w:rStyle w:val="OperatorTok"/>
-        </w:rPr>
-        <w:t xml:space="preserve">,</w:t>
-      </w:r>
-      <w:r>
-        <w:rPr>
-          <w:rStyle w:val="NormalTok"/>
-        </w:rPr>
-        <w:t xml:space="preserve"> </w:t>
-      </w:r>
-      <w:r>
-        <w:rPr>
-          <w:rStyle w:val="StringTok"/>
-        </w:rPr>
-        <w:t xml:space="preserve">'anyof'</w:t>
-      </w:r>
-      <w:r>
-        <w:rPr>
-          <w:rStyle w:val="OperatorTok"/>
-        </w:rPr>
-        <w:t xml:space="preserve">,</w:t>
-      </w:r>
-      <w:r>
-        <w:rPr>
-          <w:rStyle w:val="NormalTok"/>
-        </w:rPr>
-        <w:t xml:space="preserve"> </w:t>
-      </w:r>
-      <w:r>
-        <w:rPr>
-          <w:rStyle w:val="StringTok"/>
-        </w:rPr>
-        <w:t xml:space="preserve">'SalesOrd'</w:t>
-      </w:r>
-      <w:r>
-        <w:rPr>
-          <w:rStyle w:val="NormalTok"/>
-        </w:rPr>
-        <w:t xml:space="preserve">]]</w:t>
-      </w:r>
-      <w:r>
-        <w:rPr>
-          <w:rStyle w:val="OperatorTok"/>
-        </w:rPr>
-        <w:t xml:space="preserve">,</w:t>
-      </w:r>
-      <w:r>
-        <w:br/>
-      </w:r>
-      <w:r>
-        <w:rPr>
-          <w:rStyle w:val="NormalTok"/>
-        </w:rPr>
-        <w:t xml:space="preserve">        </w:t>
-      </w:r>
-      <w:r>
-        <w:rPr>
-          <w:rStyle w:val="DataTypeTok"/>
-        </w:rPr>
-        <w:t xml:space="preserve">columns</w:t>
-      </w:r>
-      <w:r>
-        <w:rPr>
-          <w:rStyle w:val="OperatorTok"/>
-        </w:rPr>
-        <w:t xml:space="preserve">:</w:t>
-      </w:r>
-      <w:r>
-        <w:rPr>
-          <w:rStyle w:val="NormalTok"/>
-        </w:rPr>
-        <w:t xml:space="preserve"> [</w:t>
-      </w:r>
-      <w:r>
-        <w:rPr>
-          <w:rStyle w:val="StringTok"/>
-        </w:rPr>
-        <w:t xml:space="preserve">'internalid'</w:t>
-      </w:r>
-      <w:r>
-        <w:rPr>
-          <w:rStyle w:val="OperatorTok"/>
-        </w:rPr>
-        <w:t xml:space="preserve">,</w:t>
-      </w:r>
-      <w:r>
-        <w:rPr>
-          <w:rStyle w:val="NormalTok"/>
-        </w:rPr>
-        <w:t xml:space="preserve"> </w:t>
-      </w:r>
-      <w:r>
-        <w:rPr>
-          <w:rStyle w:val="StringTok"/>
-        </w:rPr>
-        <w:t xml:space="preserve">'tranid'</w:t>
-      </w:r>
-      <w:r>
-        <w:rPr>
-          <w:rStyle w:val="NormalTok"/>
-        </w:rPr>
-        <w:t xml:space="preserve">]</w:t>
-      </w:r>
-      <w:r>
-        <w:br/>
-      </w:r>
-      <w:r>
-        <w:rPr>
-          <w:rStyle w:val="NormalTok"/>
-        </w:rPr>
-        <w:t xml:space="preserve">    })</w:t>
-      </w:r>
-      <w:r>
-        <w:rPr>
-          <w:rStyle w:val="OperatorTok"/>
-        </w:rPr>
-        <w:t xml:space="preserve">.</w:t>
-      </w:r>
-      <w:r>
-        <w:rPr>
-          <w:rStyle w:val="FunctionTok"/>
-        </w:rPr>
-        <w:t xml:space="preserve">run</w:t>
-      </w:r>
-      <w:r>
-        <w:rPr>
-          <w:rStyle w:val="NormalTok"/>
-        </w:rPr>
-        <w:t xml:space="preserve">()</w:t>
-      </w:r>
-      <w:r>
-        <w:rPr>
-          <w:rStyle w:val="OperatorTok"/>
-        </w:rPr>
-        <w:t xml:space="preserve">.</w:t>
-      </w:r>
-      <w:r>
-        <w:rPr>
-          <w:rStyle w:val="FunctionTok"/>
-        </w:rPr>
-        <w:t xml:space="preserve">each</w:t>
-      </w:r>
-      <w:r>
-        <w:rPr>
-          <w:rStyle w:val="NormalTok"/>
-        </w:rPr>
-        <w:t xml:space="preserve">(</w:t>
-      </w:r>
-      <w:r>
-        <w:rPr>
-          <w:rStyle w:val="KeywordTok"/>
-        </w:rPr>
-        <w:t xml:space="preserve">function</w:t>
-      </w:r>
-      <w:r>
-        <w:rPr>
-          <w:rStyle w:val="NormalTok"/>
-        </w:rPr>
-        <w:t xml:space="preserve">(result) {</w:t>
-      </w:r>
-      <w:r>
-        <w:br/>
-      </w:r>
-      <w:r>
-        <w:rPr>
-          <w:rStyle w:val="NormalTok"/>
-        </w:rPr>
-        <w:t xml:space="preserve">        results</w:t>
-      </w:r>
-      <w:r>
-        <w:rPr>
-          <w:rStyle w:val="OperatorTok"/>
-        </w:rPr>
-        <w:t xml:space="preserve">.</w:t>
-      </w:r>
-      <w:r>
-        <w:rPr>
-          <w:rStyle w:val="FunctionTok"/>
-        </w:rPr>
-        <w:t xml:space="preserve">push</w:t>
-      </w:r>
-      <w:r>
-        <w:rPr>
-          <w:rStyle w:val="NormalTok"/>
-        </w:rPr>
-        <w:t xml:space="preserve">(result)</w:t>
-      </w:r>
-      <w:r>
-        <w:rPr>
-          <w:rStyle w:val="OperatorTok"/>
-        </w:rPr>
-        <w:t xml:space="preserve">;</w:t>
-      </w:r>
-      <w:r>
-        <w:rPr>
-          <w:rStyle w:val="NormalTok"/>
-        </w:rPr>
-        <w:t xml:space="preserve">  </w:t>
-      </w:r>
-      <w:r>
-        <w:rPr>
-          <w:rStyle w:val="CommentTok"/>
-        </w:rPr>
-        <w:t xml:space="preserve">// Building array manually — unnecessary</w:t>
-      </w:r>
-      <w:r>
-        <w:br/>
-      </w:r>
-      <w:r>
-        <w:rPr>
-          <w:rStyle w:val="NormalTok"/>
-        </w:rPr>
-        <w:t xml:space="preserve">        </w:t>
-      </w:r>
-      <w:r>
-        <w:rPr>
-          <w:rStyle w:val="ControlFlowTok"/>
-        </w:rPr>
-        <w:t xml:space="preserve">return</w:t>
-      </w:r>
-      <w:r>
-        <w:rPr>
-          <w:rStyle w:val="NormalTok"/>
-        </w:rPr>
-        <w:t xml:space="preserve"> </w:t>
-      </w:r>
-      <w:r>
-        <w:rPr>
-          <w:rStyle w:val="KeywordTok"/>
-        </w:rPr>
-        <w:t xml:space="preserve">true</w:t>
-      </w:r>
-      <w:r>
-        <w:rPr>
-          <w:rStyle w:val="OperatorTok"/>
-        </w:rPr>
-        <w:t xml:space="preserve">;</w:t>
-      </w:r>
-      <w:r>
-        <w:br/>
-      </w:r>
-      <w:r>
-        <w:rPr>
-          <w:rStyle w:val="NormalTok"/>
-        </w:rPr>
-        <w:t xml:space="preserve">    })</w:t>
-      </w:r>
-      <w:r>
-        <w:rPr>
-          <w:rStyle w:val="OperatorTok"/>
-        </w:rPr>
-        <w:t xml:space="preserve">;</w:t>
-      </w:r>
-      <w:r>
-        <w:br/>
-      </w:r>
-      <w:r>
-        <w:rPr>
-          <w:rStyle w:val="NormalTok"/>
-        </w:rPr>
-        <w:t xml:space="preserve">    </w:t>
-      </w:r>
-      <w:r>
-        <w:rPr>
-          <w:rStyle w:val="ControlFlowTok"/>
-        </w:rPr>
-        <w:t xml:space="preserve">return</w:t>
-      </w:r>
-      <w:r>
-        <w:rPr>
-          <w:rStyle w:val="NormalTok"/>
-        </w:rPr>
-        <w:t xml:space="preserve"> results</w:t>
-      </w:r>
-      <w:r>
-        <w:rPr>
-          <w:rStyle w:val="OperatorTok"/>
-        </w:rPr>
-        <w:t xml:space="preserve">;</w:t>
-      </w:r>
-      <w:r>
-        <w:rPr>
-          <w:rStyle w:val="NormalTok"/>
-        </w:rPr>
-        <w:t xml:space="preserve">  </w:t>
-      </w:r>
-      <w:r>
-        <w:rPr>
-          <w:rStyle w:val="CommentTok"/>
-        </w:rPr>
-        <w:t xml:space="preserve">// Just return the search object instead</w:t>
       </w:r>
       <w:r>
         <w:br/>
@@ -10887,7 +10067,7 @@
         <w:rPr>
           <w:rStyle w:val="CommentTok"/>
         </w:rPr>
-        <w:t xml:space="preserve">// BAD: SuiteQL without pagination — misses rows beyond first page</w:t>
+        <w:t xml:space="preserve">// ── fp_lib_api_connect.js ─────────────────────────────────</w:t>
       </w:r>
       <w:r>
         <w:br/>
@@ -10908,6 +10088,284 @@
         <w:rPr>
           <w:rStyle w:val="FunctionTok"/>
         </w:rPr>
+        <w:t xml:space="preserve">getTaxCodes</w:t>
+      </w:r>
+      <w:r>
+        <w:rPr>
+          <w:rStyle w:val="NormalTok"/>
+        </w:rPr>
+        <w:t xml:space="preserve">() {</w:t>
+      </w:r>
+      <w:r>
+        <w:br/>
+      </w:r>
+      <w:r>
+        <w:rPr>
+          <w:rStyle w:val="NormalTok"/>
+        </w:rPr>
+        <w:t xml:space="preserve">    </w:t>
+      </w:r>
+      <w:r>
+        <w:rPr>
+          <w:rStyle w:val="KeywordTok"/>
+        </w:rPr>
+        <w:t xml:space="preserve">const</w:t>
+      </w:r>
+      <w:r>
+        <w:rPr>
+          <w:rStyle w:val="NormalTok"/>
+        </w:rPr>
+        <w:t xml:space="preserve"> response </w:t>
+      </w:r>
+      <w:r>
+        <w:rPr>
+          <w:rStyle w:val="OperatorTok"/>
+        </w:rPr>
+        <w:t xml:space="preserve">=</w:t>
+      </w:r>
+      <w:r>
+        <w:rPr>
+          <w:rStyle w:val="NormalTok"/>
+        </w:rPr>
+        <w:t xml:space="preserve"> https</w:t>
+      </w:r>
+      <w:r>
+        <w:rPr>
+          <w:rStyle w:val="OperatorTok"/>
+        </w:rPr>
+        <w:t xml:space="preserve">.</w:t>
+      </w:r>
+      <w:r>
+        <w:rPr>
+          <w:rStyle w:val="FunctionTok"/>
+        </w:rPr>
+        <w:t xml:space="preserve">post</w:t>
+      </w:r>
+      <w:r>
+        <w:rPr>
+          <w:rStyle w:val="NormalTok"/>
+        </w:rPr>
+        <w:t xml:space="preserve">({ </w:t>
+      </w:r>
+      <w:r>
+        <w:rPr>
+          <w:rStyle w:val="DataTypeTok"/>
+        </w:rPr>
+        <w:t xml:space="preserve">url</w:t>
+      </w:r>
+      <w:r>
+        <w:rPr>
+          <w:rStyle w:val="OperatorTok"/>
+        </w:rPr>
+        <w:t xml:space="preserve">:</w:t>
+      </w:r>
+      <w:r>
+        <w:rPr>
+          <w:rStyle w:val="NormalTok"/>
+        </w:rPr>
+        <w:t xml:space="preserve"> endpoint</w:t>
+      </w:r>
+      <w:r>
+        <w:rPr>
+          <w:rStyle w:val="OperatorTok"/>
+        </w:rPr>
+        <w:t xml:space="preserve">,</w:t>
+      </w:r>
+      <w:r>
+        <w:rPr>
+          <w:rStyle w:val="NormalTok"/>
+        </w:rPr>
+        <w:t xml:space="preserve"> </w:t>
+      </w:r>
+      <w:r>
+        <w:rPr>
+          <w:rStyle w:val="DataTypeTok"/>
+        </w:rPr>
+        <w:t xml:space="preserve">headers</w:t>
+      </w:r>
+      <w:r>
+        <w:rPr>
+          <w:rStyle w:val="OperatorTok"/>
+        </w:rPr>
+        <w:t xml:space="preserve">:</w:t>
+      </w:r>
+      <w:r>
+        <w:rPr>
+          <w:rStyle w:val="NormalTok"/>
+        </w:rPr>
+        <w:t xml:space="preserve"> authHeaders</w:t>
+      </w:r>
+      <w:r>
+        <w:rPr>
+          <w:rStyle w:val="OperatorTok"/>
+        </w:rPr>
+        <w:t xml:space="preserve">,</w:t>
+      </w:r>
+      <w:r>
+        <w:rPr>
+          <w:rStyle w:val="NormalTok"/>
+        </w:rPr>
+        <w:t xml:space="preserve"> </w:t>
+      </w:r>
+      <w:r>
+        <w:rPr>
+          <w:rStyle w:val="DataTypeTok"/>
+        </w:rPr>
+        <w:t xml:space="preserve">body</w:t>
+      </w:r>
+      <w:r>
+        <w:rPr>
+          <w:rStyle w:val="OperatorTok"/>
+        </w:rPr>
+        <w:t xml:space="preserve">:</w:t>
+      </w:r>
+      <w:r>
+        <w:rPr>
+          <w:rStyle w:val="NormalTok"/>
+        </w:rPr>
+        <w:t xml:space="preserve"> payload })</w:t>
+      </w:r>
+      <w:r>
+        <w:rPr>
+          <w:rStyle w:val="OperatorTok"/>
+        </w:rPr>
+        <w:t xml:space="preserve">;</w:t>
+      </w:r>
+      <w:r>
+        <w:br/>
+      </w:r>
+      <w:r>
+        <w:rPr>
+          <w:rStyle w:val="NormalTok"/>
+        </w:rPr>
+        <w:t xml:space="preserve">    </w:t>
+      </w:r>
+      <w:r>
+        <w:rPr>
+          <w:rStyle w:val="ControlFlowTok"/>
+        </w:rPr>
+        <w:t xml:space="preserve">return</w:t>
+      </w:r>
+      <w:r>
+        <w:rPr>
+          <w:rStyle w:val="NormalTok"/>
+        </w:rPr>
+        <w:t xml:space="preserve"> </w:t>
+      </w:r>
+      <w:r>
+        <w:rPr>
+          <w:rStyle w:val="BuiltInTok"/>
+        </w:rPr>
+        <w:t xml:space="preserve">JSON</w:t>
+      </w:r>
+      <w:r>
+        <w:rPr>
+          <w:rStyle w:val="OperatorTok"/>
+        </w:rPr>
+        <w:t xml:space="preserve">.</w:t>
+      </w:r>
+      <w:r>
+        <w:rPr>
+          <w:rStyle w:val="FunctionTok"/>
+        </w:rPr>
+        <w:t xml:space="preserve">parse</w:t>
+      </w:r>
+      <w:r>
+        <w:rPr>
+          <w:rStyle w:val="NormalTok"/>
+        </w:rPr>
+        <w:t xml:space="preserve">(response</w:t>
+      </w:r>
+      <w:r>
+        <w:rPr>
+          <w:rStyle w:val="OperatorTok"/>
+        </w:rPr>
+        <w:t xml:space="preserve">.</w:t>
+      </w:r>
+      <w:r>
+        <w:rPr>
+          <w:rStyle w:val="AttributeTok"/>
+        </w:rPr>
+        <w:t xml:space="preserve">body</w:t>
+      </w:r>
+      <w:r>
+        <w:rPr>
+          <w:rStyle w:val="NormalTok"/>
+        </w:rPr>
+        <w:t xml:space="preserve">)</w:t>
+      </w:r>
+      <w:r>
+        <w:rPr>
+          <w:rStyle w:val="OperatorTok"/>
+        </w:rPr>
+        <w:t xml:space="preserve">;</w:t>
+      </w:r>
+      <w:r>
+        <w:br/>
+      </w:r>
+      <w:r>
+        <w:rPr>
+          <w:rStyle w:val="NormalTok"/>
+        </w:rPr>
+        <w:t xml:space="preserve">    </w:t>
+      </w:r>
+      <w:r>
+        <w:rPr>
+          <w:rStyle w:val="CommentTok"/>
+        </w:rPr>
+        <w:t xml:space="preserve">// External API — no search/query structure available, array is the only option</w:t>
+      </w:r>
+      <w:r>
+        <w:br/>
+      </w:r>
+      <w:r>
+        <w:rPr>
+          <w:rStyle w:val="NormalTok"/>
+        </w:rPr>
+        <w:t xml:space="preserve">}</w:t>
+      </w:r>
+    </w:p>
+    <w:p>
+      <w:pPr>
+        <w:pStyle w:val="FirstParagraph"/>
+      </w:pPr>
+      <w:r>
+        <w:rPr>
+          <w:b/>
+          <w:bCs/>
+        </w:rPr>
+        <w:t xml:space="preserve">What NOT to do:</w:t>
+      </w:r>
+    </w:p>
+    <w:p>
+      <w:pPr>
+        <w:pStyle w:val="SourceCode"/>
+      </w:pPr>
+      <w:r>
+        <w:rPr>
+          <w:rStyle w:val="CommentTok"/>
+        </w:rPr>
+        <w:t xml:space="preserve">// BAD: Building an array — just return the search object instead</w:t>
+      </w:r>
+      <w:r>
+        <w:br/>
+      </w:r>
+      <w:r>
+        <w:rPr>
+          <w:rStyle w:val="KeywordTok"/>
+        </w:rPr>
+        <w:t xml:space="preserve">function</w:t>
+      </w:r>
+      <w:r>
+        <w:rPr>
+          <w:rStyle w:val="NormalTok"/>
+        </w:rPr>
+        <w:t xml:space="preserve"> </w:t>
+      </w:r>
+      <w:r>
+        <w:rPr>
+          <w:rStyle w:val="FunctionTok"/>
+        </w:rPr>
         <w:t xml:space="preserve">getInputData</w:t>
       </w:r>
       <w:r>
@@ -10927,6 +10385,351 @@
       </w:r>
       <w:r>
         <w:rPr>
+          <w:rStyle w:val="KeywordTok"/>
+        </w:rPr>
+        <w:t xml:space="preserve">const</w:t>
+      </w:r>
+      <w:r>
+        <w:rPr>
+          <w:rStyle w:val="NormalTok"/>
+        </w:rPr>
+        <w:t xml:space="preserve"> results </w:t>
+      </w:r>
+      <w:r>
+        <w:rPr>
+          <w:rStyle w:val="OperatorTok"/>
+        </w:rPr>
+        <w:t xml:space="preserve">=</w:t>
+      </w:r>
+      <w:r>
+        <w:rPr>
+          <w:rStyle w:val="NormalTok"/>
+        </w:rPr>
+        <w:t xml:space="preserve"> []</w:t>
+      </w:r>
+      <w:r>
+        <w:rPr>
+          <w:rStyle w:val="OperatorTok"/>
+        </w:rPr>
+        <w:t xml:space="preserve">;</w:t>
+      </w:r>
+      <w:r>
+        <w:br/>
+      </w:r>
+      <w:r>
+        <w:rPr>
+          <w:rStyle w:val="NormalTok"/>
+        </w:rPr>
+        <w:t xml:space="preserve">    search</w:t>
+      </w:r>
+      <w:r>
+        <w:rPr>
+          <w:rStyle w:val="OperatorTok"/>
+        </w:rPr>
+        <w:t xml:space="preserve">.</w:t>
+      </w:r>
+      <w:r>
+        <w:rPr>
+          <w:rStyle w:val="FunctionTok"/>
+        </w:rPr>
+        <w:t xml:space="preserve">create</w:t>
+      </w:r>
+      <w:r>
+        <w:rPr>
+          <w:rStyle w:val="NormalTok"/>
+        </w:rPr>
+        <w:t xml:space="preserve">({</w:t>
+      </w:r>
+      <w:r>
+        <w:br/>
+      </w:r>
+      <w:r>
+        <w:rPr>
+          <w:rStyle w:val="NormalTok"/>
+        </w:rPr>
+        <w:t xml:space="preserve">        </w:t>
+      </w:r>
+      <w:r>
+        <w:rPr>
+          <w:rStyle w:val="DataTypeTok"/>
+        </w:rPr>
+        <w:t xml:space="preserve">type</w:t>
+      </w:r>
+      <w:r>
+        <w:rPr>
+          <w:rStyle w:val="OperatorTok"/>
+        </w:rPr>
+        <w:t xml:space="preserve">:</w:t>
+      </w:r>
+      <w:r>
+        <w:rPr>
+          <w:rStyle w:val="NormalTok"/>
+        </w:rPr>
+        <w:t xml:space="preserve"> </w:t>
+      </w:r>
+      <w:r>
+        <w:rPr>
+          <w:rStyle w:val="StringTok"/>
+        </w:rPr>
+        <w:t xml:space="preserve">'transaction'</w:t>
+      </w:r>
+      <w:r>
+        <w:rPr>
+          <w:rStyle w:val="OperatorTok"/>
+        </w:rPr>
+        <w:t xml:space="preserve">,</w:t>
+      </w:r>
+      <w:r>
+        <w:br/>
+      </w:r>
+      <w:r>
+        <w:rPr>
+          <w:rStyle w:val="NormalTok"/>
+        </w:rPr>
+        <w:t xml:space="preserve">        </w:t>
+      </w:r>
+      <w:r>
+        <w:rPr>
+          <w:rStyle w:val="DataTypeTok"/>
+        </w:rPr>
+        <w:t xml:space="preserve">filters</w:t>
+      </w:r>
+      <w:r>
+        <w:rPr>
+          <w:rStyle w:val="OperatorTok"/>
+        </w:rPr>
+        <w:t xml:space="preserve">:</w:t>
+      </w:r>
+      <w:r>
+        <w:rPr>
+          <w:rStyle w:val="NormalTok"/>
+        </w:rPr>
+        <w:t xml:space="preserve"> [[</w:t>
+      </w:r>
+      <w:r>
+        <w:rPr>
+          <w:rStyle w:val="StringTok"/>
+        </w:rPr>
+        <w:t xml:space="preserve">'type'</w:t>
+      </w:r>
+      <w:r>
+        <w:rPr>
+          <w:rStyle w:val="OperatorTok"/>
+        </w:rPr>
+        <w:t xml:space="preserve">,</w:t>
+      </w:r>
+      <w:r>
+        <w:rPr>
+          <w:rStyle w:val="NormalTok"/>
+        </w:rPr>
+        <w:t xml:space="preserve"> </w:t>
+      </w:r>
+      <w:r>
+        <w:rPr>
+          <w:rStyle w:val="StringTok"/>
+        </w:rPr>
+        <w:t xml:space="preserve">'anyof'</w:t>
+      </w:r>
+      <w:r>
+        <w:rPr>
+          <w:rStyle w:val="OperatorTok"/>
+        </w:rPr>
+        <w:t xml:space="preserve">,</w:t>
+      </w:r>
+      <w:r>
+        <w:rPr>
+          <w:rStyle w:val="NormalTok"/>
+        </w:rPr>
+        <w:t xml:space="preserve"> </w:t>
+      </w:r>
+      <w:r>
+        <w:rPr>
+          <w:rStyle w:val="StringTok"/>
+        </w:rPr>
+        <w:t xml:space="preserve">'SalesOrd'</w:t>
+      </w:r>
+      <w:r>
+        <w:rPr>
+          <w:rStyle w:val="NormalTok"/>
+        </w:rPr>
+        <w:t xml:space="preserve">]]</w:t>
+      </w:r>
+      <w:r>
+        <w:rPr>
+          <w:rStyle w:val="OperatorTok"/>
+        </w:rPr>
+        <w:t xml:space="preserve">,</w:t>
+      </w:r>
+      <w:r>
+        <w:br/>
+      </w:r>
+      <w:r>
+        <w:rPr>
+          <w:rStyle w:val="NormalTok"/>
+        </w:rPr>
+        <w:t xml:space="preserve">        </w:t>
+      </w:r>
+      <w:r>
+        <w:rPr>
+          <w:rStyle w:val="DataTypeTok"/>
+        </w:rPr>
+        <w:t xml:space="preserve">columns</w:t>
+      </w:r>
+      <w:r>
+        <w:rPr>
+          <w:rStyle w:val="OperatorTok"/>
+        </w:rPr>
+        <w:t xml:space="preserve">:</w:t>
+      </w:r>
+      <w:r>
+        <w:rPr>
+          <w:rStyle w:val="NormalTok"/>
+        </w:rPr>
+        <w:t xml:space="preserve"> [</w:t>
+      </w:r>
+      <w:r>
+        <w:rPr>
+          <w:rStyle w:val="StringTok"/>
+        </w:rPr>
+        <w:t xml:space="preserve">'internalid'</w:t>
+      </w:r>
+      <w:r>
+        <w:rPr>
+          <w:rStyle w:val="OperatorTok"/>
+        </w:rPr>
+        <w:t xml:space="preserve">,</w:t>
+      </w:r>
+      <w:r>
+        <w:rPr>
+          <w:rStyle w:val="NormalTok"/>
+        </w:rPr>
+        <w:t xml:space="preserve"> </w:t>
+      </w:r>
+      <w:r>
+        <w:rPr>
+          <w:rStyle w:val="StringTok"/>
+        </w:rPr>
+        <w:t xml:space="preserve">'tranid'</w:t>
+      </w:r>
+      <w:r>
+        <w:rPr>
+          <w:rStyle w:val="NormalTok"/>
+        </w:rPr>
+        <w:t xml:space="preserve">]</w:t>
+      </w:r>
+      <w:r>
+        <w:br/>
+      </w:r>
+      <w:r>
+        <w:rPr>
+          <w:rStyle w:val="NormalTok"/>
+        </w:rPr>
+        <w:t xml:space="preserve">    })</w:t>
+      </w:r>
+      <w:r>
+        <w:rPr>
+          <w:rStyle w:val="OperatorTok"/>
+        </w:rPr>
+        <w:t xml:space="preserve">.</w:t>
+      </w:r>
+      <w:r>
+        <w:rPr>
+          <w:rStyle w:val="FunctionTok"/>
+        </w:rPr>
+        <w:t xml:space="preserve">run</w:t>
+      </w:r>
+      <w:r>
+        <w:rPr>
+          <w:rStyle w:val="NormalTok"/>
+        </w:rPr>
+        <w:t xml:space="preserve">()</w:t>
+      </w:r>
+      <w:r>
+        <w:rPr>
+          <w:rStyle w:val="OperatorTok"/>
+        </w:rPr>
+        <w:t xml:space="preserve">.</w:t>
+      </w:r>
+      <w:r>
+        <w:rPr>
+          <w:rStyle w:val="FunctionTok"/>
+        </w:rPr>
+        <w:t xml:space="preserve">each</w:t>
+      </w:r>
+      <w:r>
+        <w:rPr>
+          <w:rStyle w:val="NormalTok"/>
+        </w:rPr>
+        <w:t xml:space="preserve">(</w:t>
+      </w:r>
+      <w:r>
+        <w:rPr>
+          <w:rStyle w:val="KeywordTok"/>
+        </w:rPr>
+        <w:t xml:space="preserve">function</w:t>
+      </w:r>
+      <w:r>
+        <w:rPr>
+          <w:rStyle w:val="NormalTok"/>
+        </w:rPr>
+        <w:t xml:space="preserve">(result) {</w:t>
+      </w:r>
+      <w:r>
+        <w:br/>
+      </w:r>
+      <w:r>
+        <w:rPr>
+          <w:rStyle w:val="NormalTok"/>
+        </w:rPr>
+        <w:t xml:space="preserve">        results</w:t>
+      </w:r>
+      <w:r>
+        <w:rPr>
+          <w:rStyle w:val="OperatorTok"/>
+        </w:rPr>
+        <w:t xml:space="preserve">.</w:t>
+      </w:r>
+      <w:r>
+        <w:rPr>
+          <w:rStyle w:val="FunctionTok"/>
+        </w:rPr>
+        <w:t xml:space="preserve">push</w:t>
+      </w:r>
+      <w:r>
+        <w:rPr>
+          <w:rStyle w:val="NormalTok"/>
+        </w:rPr>
+        <w:t xml:space="preserve">(result)</w:t>
+      </w:r>
+      <w:r>
+        <w:rPr>
+          <w:rStyle w:val="OperatorTok"/>
+        </w:rPr>
+        <w:t xml:space="preserve">;</w:t>
+      </w:r>
+      <w:r>
+        <w:rPr>
+          <w:rStyle w:val="NormalTok"/>
+        </w:rPr>
+        <w:t xml:space="preserve">  </w:t>
+      </w:r>
+      <w:r>
+        <w:rPr>
+          <w:rStyle w:val="CommentTok"/>
+        </w:rPr>
+        <w:t xml:space="preserve">// Unnecessary — the platform does this for you</w:t>
+      </w:r>
+      <w:r>
+        <w:br/>
+      </w:r>
+      <w:r>
+        <w:rPr>
+          <w:rStyle w:val="NormalTok"/>
+        </w:rPr>
+        <w:t xml:space="preserve">        </w:t>
+      </w:r>
+      <w:r>
+        <w:rPr>
           <w:rStyle w:val="ControlFlowTok"/>
         </w:rPr>
         <w:t xml:space="preserve">return</w:t>
@@ -10935,6 +10738,128 @@
         <w:rPr>
           <w:rStyle w:val="NormalTok"/>
         </w:rPr>
+        <w:t xml:space="preserve"> </w:t>
+      </w:r>
+      <w:r>
+        <w:rPr>
+          <w:rStyle w:val="KeywordTok"/>
+        </w:rPr>
+        <w:t xml:space="preserve">true</w:t>
+      </w:r>
+      <w:r>
+        <w:rPr>
+          <w:rStyle w:val="OperatorTok"/>
+        </w:rPr>
+        <w:t xml:space="preserve">;</w:t>
+      </w:r>
+      <w:r>
+        <w:br/>
+      </w:r>
+      <w:r>
+        <w:rPr>
+          <w:rStyle w:val="NormalTok"/>
+        </w:rPr>
+        <w:t xml:space="preserve">    })</w:t>
+      </w:r>
+      <w:r>
+        <w:rPr>
+          <w:rStyle w:val="OperatorTok"/>
+        </w:rPr>
+        <w:t xml:space="preserve">;</w:t>
+      </w:r>
+      <w:r>
+        <w:br/>
+      </w:r>
+      <w:r>
+        <w:rPr>
+          <w:rStyle w:val="NormalTok"/>
+        </w:rPr>
+        <w:t xml:space="preserve">    </w:t>
+      </w:r>
+      <w:r>
+        <w:rPr>
+          <w:rStyle w:val="ControlFlowTok"/>
+        </w:rPr>
+        <w:t xml:space="preserve">return</w:t>
+      </w:r>
+      <w:r>
+        <w:rPr>
+          <w:rStyle w:val="NormalTok"/>
+        </w:rPr>
+        <w:t xml:space="preserve"> results</w:t>
+      </w:r>
+      <w:r>
+        <w:rPr>
+          <w:rStyle w:val="OperatorTok"/>
+        </w:rPr>
+        <w:t xml:space="preserve">;</w:t>
+      </w:r>
+      <w:r>
+        <w:br/>
+      </w:r>
+      <w:r>
+        <w:rPr>
+          <w:rStyle w:val="NormalTok"/>
+        </w:rPr>
+        <w:t xml:space="preserve">}</w:t>
+      </w:r>
+    </w:p>
+    <w:p>
+      <w:pPr>
+        <w:pStyle w:val="SourceCode"/>
+      </w:pPr>
+      <w:r>
+        <w:rPr>
+          <w:rStyle w:val="CommentTok"/>
+        </w:rPr>
+        <w:t xml:space="preserve">// BAD: Executing SuiteQL and returning results — return the query structure instead</w:t>
+      </w:r>
+      <w:r>
+        <w:br/>
+      </w:r>
+      <w:r>
+        <w:rPr>
+          <w:rStyle w:val="KeywordTok"/>
+        </w:rPr>
+        <w:t xml:space="preserve">function</w:t>
+      </w:r>
+      <w:r>
+        <w:rPr>
+          <w:rStyle w:val="NormalTok"/>
+        </w:rPr>
+        <w:t xml:space="preserve"> </w:t>
+      </w:r>
+      <w:r>
+        <w:rPr>
+          <w:rStyle w:val="FunctionTok"/>
+        </w:rPr>
+        <w:t xml:space="preserve">getInputData</w:t>
+      </w:r>
+      <w:r>
+        <w:rPr>
+          <w:rStyle w:val="NormalTok"/>
+        </w:rPr>
+        <w:t xml:space="preserve">() {</w:t>
+      </w:r>
+      <w:r>
+        <w:br/>
+      </w:r>
+      <w:r>
+        <w:rPr>
+          <w:rStyle w:val="NormalTok"/>
+        </w:rPr>
+        <w:t xml:space="preserve">    </w:t>
+      </w:r>
+      <w:r>
+        <w:rPr>
+          <w:rStyle w:val="ControlFlowTok"/>
+        </w:rPr>
+        <w:t xml:space="preserve">return</w:t>
+      </w:r>
+      <w:r>
+        <w:rPr>
+          <w:rStyle w:val="NormalTok"/>
+        </w:rPr>
         <w:t xml:space="preserve"> query</w:t>
       </w:r>
       <w:r>
@@ -11031,7 +10956,282 @@
         <w:rPr>
           <w:rStyle w:val="CommentTok"/>
         </w:rPr>
-        <w:t xml:space="preserve">// Only gets first 5000 rows!</w:t>
+        <w:t xml:space="preserve">// Executes the query AND builds an array — let the platform do this</w:t>
+      </w:r>
+      <w:r>
+        <w:br/>
+      </w:r>
+      <w:r>
+        <w:rPr>
+          <w:rStyle w:val="NormalTok"/>
+        </w:rPr>
+        <w:t xml:space="preserve">}</w:t>
+      </w:r>
+    </w:p>
+    <w:p>
+      <w:pPr>
+        <w:pStyle w:val="SourceCode"/>
+      </w:pPr>
+      <w:r>
+        <w:rPr>
+          <w:rStyle w:val="CommentTok"/>
+        </w:rPr>
+        <w:t xml:space="preserve">// BAD: Inline search/query logic — move it to a lib file</w:t>
+      </w:r>
+      <w:r>
+        <w:br/>
+      </w:r>
+      <w:r>
+        <w:rPr>
+          <w:rStyle w:val="KeywordTok"/>
+        </w:rPr>
+        <w:t xml:space="preserve">function</w:t>
+      </w:r>
+      <w:r>
+        <w:rPr>
+          <w:rStyle w:val="NormalTok"/>
+        </w:rPr>
+        <w:t xml:space="preserve"> </w:t>
+      </w:r>
+      <w:r>
+        <w:rPr>
+          <w:rStyle w:val="FunctionTok"/>
+        </w:rPr>
+        <w:t xml:space="preserve">getInputData</w:t>
+      </w:r>
+      <w:r>
+        <w:rPr>
+          <w:rStyle w:val="NormalTok"/>
+        </w:rPr>
+        <w:t xml:space="preserve">() {</w:t>
+      </w:r>
+      <w:r>
+        <w:br/>
+      </w:r>
+      <w:r>
+        <w:rPr>
+          <w:rStyle w:val="NormalTok"/>
+        </w:rPr>
+        <w:t xml:space="preserve">    </w:t>
+      </w:r>
+      <w:r>
+        <w:rPr>
+          <w:rStyle w:val="ControlFlowTok"/>
+        </w:rPr>
+        <w:t xml:space="preserve">return</w:t>
+      </w:r>
+      <w:r>
+        <w:rPr>
+          <w:rStyle w:val="NormalTok"/>
+        </w:rPr>
+        <w:t xml:space="preserve"> search</w:t>
+      </w:r>
+      <w:r>
+        <w:rPr>
+          <w:rStyle w:val="OperatorTok"/>
+        </w:rPr>
+        <w:t xml:space="preserve">.</w:t>
+      </w:r>
+      <w:r>
+        <w:rPr>
+          <w:rStyle w:val="FunctionTok"/>
+        </w:rPr>
+        <w:t xml:space="preserve">create</w:t>
+      </w:r>
+      <w:r>
+        <w:rPr>
+          <w:rStyle w:val="NormalTok"/>
+        </w:rPr>
+        <w:t xml:space="preserve">({</w:t>
+      </w:r>
+      <w:r>
+        <w:br/>
+      </w:r>
+      <w:r>
+        <w:rPr>
+          <w:rStyle w:val="NormalTok"/>
+        </w:rPr>
+        <w:t xml:space="preserve">        </w:t>
+      </w:r>
+      <w:r>
+        <w:rPr>
+          <w:rStyle w:val="DataTypeTok"/>
+        </w:rPr>
+        <w:t xml:space="preserve">type</w:t>
+      </w:r>
+      <w:r>
+        <w:rPr>
+          <w:rStyle w:val="OperatorTok"/>
+        </w:rPr>
+        <w:t xml:space="preserve">:</w:t>
+      </w:r>
+      <w:r>
+        <w:rPr>
+          <w:rStyle w:val="NormalTok"/>
+        </w:rPr>
+        <w:t xml:space="preserve"> </w:t>
+      </w:r>
+      <w:r>
+        <w:rPr>
+          <w:rStyle w:val="StringTok"/>
+        </w:rPr>
+        <w:t xml:space="preserve">'transaction'</w:t>
+      </w:r>
+      <w:r>
+        <w:rPr>
+          <w:rStyle w:val="OperatorTok"/>
+        </w:rPr>
+        <w:t xml:space="preserve">,</w:t>
+      </w:r>
+      <w:r>
+        <w:br/>
+      </w:r>
+      <w:r>
+        <w:rPr>
+          <w:rStyle w:val="NormalTok"/>
+        </w:rPr>
+        <w:t xml:space="preserve">        </w:t>
+      </w:r>
+      <w:r>
+        <w:rPr>
+          <w:rStyle w:val="DataTypeTok"/>
+        </w:rPr>
+        <w:t xml:space="preserve">filters</w:t>
+      </w:r>
+      <w:r>
+        <w:rPr>
+          <w:rStyle w:val="OperatorTok"/>
+        </w:rPr>
+        <w:t xml:space="preserve">:</w:t>
+      </w:r>
+      <w:r>
+        <w:rPr>
+          <w:rStyle w:val="NormalTok"/>
+        </w:rPr>
+        <w:t xml:space="preserve"> [[</w:t>
+      </w:r>
+      <w:r>
+        <w:rPr>
+          <w:rStyle w:val="StringTok"/>
+        </w:rPr>
+        <w:t xml:space="preserve">'type'</w:t>
+      </w:r>
+      <w:r>
+        <w:rPr>
+          <w:rStyle w:val="OperatorTok"/>
+        </w:rPr>
+        <w:t xml:space="preserve">,</w:t>
+      </w:r>
+      <w:r>
+        <w:rPr>
+          <w:rStyle w:val="NormalTok"/>
+        </w:rPr>
+        <w:t xml:space="preserve"> </w:t>
+      </w:r>
+      <w:r>
+        <w:rPr>
+          <w:rStyle w:val="StringTok"/>
+        </w:rPr>
+        <w:t xml:space="preserve">'anyof'</w:t>
+      </w:r>
+      <w:r>
+        <w:rPr>
+          <w:rStyle w:val="OperatorTok"/>
+        </w:rPr>
+        <w:t xml:space="preserve">,</w:t>
+      </w:r>
+      <w:r>
+        <w:rPr>
+          <w:rStyle w:val="NormalTok"/>
+        </w:rPr>
+        <w:t xml:space="preserve"> </w:t>
+      </w:r>
+      <w:r>
+        <w:rPr>
+          <w:rStyle w:val="StringTok"/>
+        </w:rPr>
+        <w:t xml:space="preserve">'SalesOrd'</w:t>
+      </w:r>
+      <w:r>
+        <w:rPr>
+          <w:rStyle w:val="NormalTok"/>
+        </w:rPr>
+        <w:t xml:space="preserve">]]</w:t>
+      </w:r>
+      <w:r>
+        <w:rPr>
+          <w:rStyle w:val="OperatorTok"/>
+        </w:rPr>
+        <w:t xml:space="preserve">,</w:t>
+      </w:r>
+      <w:r>
+        <w:br/>
+      </w:r>
+      <w:r>
+        <w:rPr>
+          <w:rStyle w:val="NormalTok"/>
+        </w:rPr>
+        <w:t xml:space="preserve">        </w:t>
+      </w:r>
+      <w:r>
+        <w:rPr>
+          <w:rStyle w:val="DataTypeTok"/>
+        </w:rPr>
+        <w:t xml:space="preserve">columns</w:t>
+      </w:r>
+      <w:r>
+        <w:rPr>
+          <w:rStyle w:val="OperatorTok"/>
+        </w:rPr>
+        <w:t xml:space="preserve">:</w:t>
+      </w:r>
+      <w:r>
+        <w:rPr>
+          <w:rStyle w:val="NormalTok"/>
+        </w:rPr>
+        <w:t xml:space="preserve"> [</w:t>
+      </w:r>
+      <w:r>
+        <w:rPr>
+          <w:rStyle w:val="StringTok"/>
+        </w:rPr>
+        <w:t xml:space="preserve">'internalid'</w:t>
+      </w:r>
+      <w:r>
+        <w:rPr>
+          <w:rStyle w:val="NormalTok"/>
+        </w:rPr>
+        <w:t xml:space="preserve">]</w:t>
+      </w:r>
+      <w:r>
+        <w:br/>
+      </w:r>
+      <w:r>
+        <w:rPr>
+          <w:rStyle w:val="NormalTok"/>
+        </w:rPr>
+        <w:t xml:space="preserve">    })</w:t>
+      </w:r>
+      <w:r>
+        <w:rPr>
+          <w:rStyle w:val="OperatorTok"/>
+        </w:rPr>
+        <w:t xml:space="preserve">;</w:t>
+      </w:r>
+      <w:r>
+        <w:br/>
+      </w:r>
+      <w:r>
+        <w:rPr>
+          <w:rStyle w:val="NormalTok"/>
+        </w:rPr>
+        <w:t xml:space="preserve">    </w:t>
+      </w:r>
+      <w:r>
+        <w:rPr>
+          <w:rStyle w:val="CommentTok"/>
+        </w:rPr>
+        <w:t xml:space="preserve">// Search construction belongs in fp_lib_query.js, not in the M/R script</w:t>
       </w:r>
       <w:r>
         <w:br/>

</xml_diff>

<commit_message>
Add record.load avoidance rule — prefer lightweight APIs
Use search.lookupFields, record.submitFields, and SuiteQL instead of
full record.load/save cycles. Especially important in afterSubmit.
Only load records when subrecords or sublist modifications require it.

Co-Authored-By: Claude Opus 4.6 <noreply@anthropic.com>
</commit_message>
<xml_diff>
--- a/coding-standards.docx
+++ b/coding-standards.docx
@@ -2,7 +2,7 @@
 <file path=word/document.xml><?xml version="1.0" encoding="utf-8"?>
 <w:document xmlns:w="http://schemas.openxmlformats.org/wordprocessingml/2006/main" xmlns:m="http://schemas.openxmlformats.org/officeDocument/2006/math" xmlns:r="http://schemas.openxmlformats.org/officeDocument/2006/relationships" xmlns:o="urn:schemas-microsoft-com:office:office" xmlns:v="urn:schemas-microsoft-com:vml" xmlns:w10="urn:schemas-microsoft-com:office:word" xmlns:a="http://schemas.openxmlformats.org/drawingml/2006/main" xmlns:pic="http://schemas.openxmlformats.org/drawingml/2006/picture" xmlns:wp="http://schemas.openxmlformats.org/drawingml/2006/wordprocessingDrawing">
   <w:body>
-    <w:bookmarkStart w:id="113" w:name="coding-standards-best-practices"/>
+    <w:bookmarkStart w:id="114" w:name="coding-standards-best-practices"/>
     <w:p>
       <w:pPr>
         <w:pStyle w:val="Heading1"/>
@@ -15344,7 +15344,7 @@
     </w:p>
     <w:bookmarkEnd w:id="36"/>
     <w:bookmarkEnd w:id="37"/>
-    <w:bookmarkStart w:id="41" w:name="platform-patterns"/>
+    <w:bookmarkStart w:id="42" w:name="platform-patterns"/>
     <w:p>
       <w:pPr>
         <w:pStyle w:val="Heading2"/>
@@ -18436,22 +18436,44 @@
         <w:t xml:space="preserve">- Automated testing (Playwright E2E tests use REST to create test data)</w:t>
       </w:r>
     </w:p>
-    <w:p>
-      <w:r>
-        <w:pict>
-          <v:rect style="width:0;height:1.5pt" o:hralign="center" o:hrstd="t" o:hr="t"/>
-        </w:pict>
-      </w:r>
-    </w:p>
     <w:bookmarkEnd w:id="40"/>
-    <w:bookmarkEnd w:id="41"/>
-    <w:bookmarkStart w:id="50" w:name="error-handling"/>
+    <w:bookmarkStart w:id="41" w:name="X9d82f4d3fece8fa5e87e9e307b62da26d9cdac6"/>
     <w:p>
       <w:pPr>
-        <w:pStyle w:val="Heading2"/>
+        <w:pStyle w:val="Heading3"/>
       </w:pPr>
       <w:r>
-        <w:t xml:space="preserve">6. Error Handling</w:t>
+        <w:t xml:space="preserve">Avoid</w:t>
+      </w:r>
+      <w:r>
+        <w:t xml:space="preserve"> </w:t>
+      </w:r>
+      <w:r>
+        <w:rPr>
+          <w:rStyle w:val="VerbatimChar"/>
+        </w:rPr>
+        <w:t xml:space="preserve">record.load</w:t>
+      </w:r>
+      <w:r>
+        <w:t xml:space="preserve"> </w:t>
+      </w:r>
+      <w:r>
+        <w:t xml:space="preserve">/</w:t>
+      </w:r>
+      <w:r>
+        <w:t xml:space="preserve"> </w:t>
+      </w:r>
+      <w:r>
+        <w:rPr>
+          <w:rStyle w:val="VerbatimChar"/>
+        </w:rPr>
+        <w:t xml:space="preserve">record.save</w:t>
+      </w:r>
+      <w:r>
+        <w:t xml:space="preserve"> </w:t>
+      </w:r>
+      <w:r>
+        <w:t xml:space="preserve">— use lightweight APIs instead</w:t>
       </w:r>
     </w:p>
     <w:p>
@@ -18459,7 +18481,31 @@
         <w:pStyle w:val="FirstParagraph"/>
       </w:pPr>
       <w:r>
-        <w:t xml:space="preserve">Our error handling strategy has one goal:</w:t>
+        <w:rPr>
+          <w:rStyle w:val="VerbatimChar"/>
+        </w:rPr>
+        <w:t xml:space="preserve">record.load()</w:t>
+      </w:r>
+      <w:r>
+        <w:t xml:space="preserve"> </w:t>
+      </w:r>
+      <w:r>
+        <w:t xml:space="preserve">and</w:t>
+      </w:r>
+      <w:r>
+        <w:t xml:space="preserve"> </w:t>
+      </w:r>
+      <w:r>
+        <w:rPr>
+          <w:rStyle w:val="VerbatimChar"/>
+        </w:rPr>
+        <w:t xml:space="preserve">record.save()</w:t>
+      </w:r>
+      <w:r>
+        <w:t xml:space="preserve"> </w:t>
+      </w:r>
+      <w:r>
+        <w:t xml:space="preserve">are the most expensive operations in SuiteScript — they consume heavy governance, trigger workflows/user events, and lock the record.</w:t>
       </w:r>
       <w:r>
         <w:t xml:space="preserve"> </w:t>
@@ -18469,22 +18515,1535 @@
           <w:b/>
           <w:bCs/>
         </w:rPr>
-        <w:t xml:space="preserve">when something fails, you know exactly what failed, where, and on which record/line.</w:t>
-      </w:r>
-      <w:r>
-        <w:t xml:space="preserve"> </w:t>
-      </w:r>
-      <w:r>
-        <w:t xml:space="preserve">Errors bubble up from the deepest level with full context so the top-level catch can log everything in one place.</w:t>
+        <w:t xml:space="preserve">Use them only when you have no alternative</w:t>
+      </w:r>
+      <w:r>
+        <w:t xml:space="preserve"> </w:t>
+      </w:r>
+      <w:r>
+        <w:t xml:space="preserve">(e.g., subrecords that must be read or modified).</w:t>
       </w:r>
     </w:p>
-    <w:bookmarkStart w:id="42" w:name="top-level-trycatch-in-every-entry-point"/>
     <w:p>
       <w:pPr>
-        <w:pStyle w:val="Heading3"/>
+        <w:pStyle w:val="BodyText"/>
       </w:pPr>
       <w:r>
-        <w:t xml:space="preserve">Top-level try…catch in every entry point</w:t>
+        <w:t xml:space="preserve">For everything else, use the lightweight alternatives:</w:t>
+      </w:r>
+    </w:p>
+    <w:tbl>
+      <w:tblPr>
+        <w:tblStyle w:val="Table"/>
+        <w:tblW w:type="pct" w:w="5000"/>
+        <w:tblLayout w:type="fixed"/>
+        <w:tblLook w:firstRow="1" w:lastRow="0" w:firstColumn="0" w:lastColumn="0" w:noHBand="0" w:noVBand="0" w:val="0020"/>
+      </w:tblPr>
+      <w:tblGrid>
+        <w:gridCol w:w="2066"/>
+        <w:gridCol w:w="1721"/>
+        <w:gridCol w:w="4132"/>
+      </w:tblGrid>
+      <w:tr>
+        <w:trPr>
+          <w:tblHeader w:val="on"/>
+        </w:trPr>
+        <w:tc>
+          <w:tcPr/>
+          <w:p>
+            <w:pPr>
+              <w:pStyle w:val="Compact"/>
+            </w:pPr>
+            <w:r>
+              <w:t xml:space="preserve">Need</w:t>
+            </w:r>
+          </w:p>
+        </w:tc>
+        <w:tc>
+          <w:tcPr/>
+          <w:p>
+            <w:pPr>
+              <w:pStyle w:val="Compact"/>
+            </w:pPr>
+            <w:r>
+              <w:t xml:space="preserve">Use</w:t>
+            </w:r>
+          </w:p>
+        </w:tc>
+        <w:tc>
+          <w:tcPr/>
+          <w:p>
+            <w:pPr>
+              <w:pStyle w:val="Compact"/>
+            </w:pPr>
+            <w:r>
+              <w:t xml:space="preserve">Instead of</w:t>
+            </w:r>
+          </w:p>
+        </w:tc>
+      </w:tr>
+      <w:tr>
+        <w:tc>
+          <w:tcPr/>
+          <w:p>
+            <w:pPr>
+              <w:pStyle w:val="Compact"/>
+            </w:pPr>
+            <w:r>
+              <w:t xml:space="preserve">Read a few fields</w:t>
+            </w:r>
+          </w:p>
+        </w:tc>
+        <w:tc>
+          <w:tcPr/>
+          <w:p>
+            <w:pPr>
+              <w:pStyle w:val="Compact"/>
+            </w:pPr>
+            <w:r>
+              <w:rPr>
+                <w:rStyle w:val="VerbatimChar"/>
+              </w:rPr>
+              <w:t xml:space="preserve">search.lookupFields()</w:t>
+            </w:r>
+          </w:p>
+        </w:tc>
+        <w:tc>
+          <w:tcPr/>
+          <w:p>
+            <w:pPr>
+              <w:pStyle w:val="Compact"/>
+            </w:pPr>
+            <w:r>
+              <w:rPr>
+                <w:rStyle w:val="VerbatimChar"/>
+              </w:rPr>
+              <w:t xml:space="preserve">record.load()</w:t>
+            </w:r>
+            <w:r>
+              <w:t xml:space="preserve"> </w:t>
+            </w:r>
+            <w:r>
+              <w:t xml:space="preserve">+</w:t>
+            </w:r>
+            <w:r>
+              <w:t xml:space="preserve"> </w:t>
+            </w:r>
+            <w:r>
+              <w:rPr>
+                <w:rStyle w:val="VerbatimChar"/>
+              </w:rPr>
+              <w:t xml:space="preserve">getValue()</w:t>
+            </w:r>
+          </w:p>
+        </w:tc>
+      </w:tr>
+      <w:tr>
+        <w:tc>
+          <w:tcPr/>
+          <w:p>
+            <w:pPr>
+              <w:pStyle w:val="Compact"/>
+            </w:pPr>
+            <w:r>
+              <w:t xml:space="preserve">Read many fields/lines</w:t>
+            </w:r>
+          </w:p>
+        </w:tc>
+        <w:tc>
+          <w:tcPr/>
+          <w:p>
+            <w:pPr>
+              <w:pStyle w:val="Compact"/>
+            </w:pPr>
+            <w:r>
+              <w:t xml:space="preserve">SuiteQL via</w:t>
+            </w:r>
+            <w:r>
+              <w:t xml:space="preserve"> </w:t>
+            </w:r>
+            <w:r>
+              <w:rPr>
+                <w:rStyle w:val="VerbatimChar"/>
+              </w:rPr>
+              <w:t xml:space="preserve">query.runSuiteQL()</w:t>
+            </w:r>
+          </w:p>
+        </w:tc>
+        <w:tc>
+          <w:tcPr/>
+          <w:p>
+            <w:pPr>
+              <w:pStyle w:val="Compact"/>
+            </w:pPr>
+            <w:r>
+              <w:rPr>
+                <w:rStyle w:val="VerbatimChar"/>
+              </w:rPr>
+              <w:t xml:space="preserve">record.load()</w:t>
+            </w:r>
+            <w:r>
+              <w:t xml:space="preserve"> </w:t>
+            </w:r>
+            <w:r>
+              <w:t xml:space="preserve">+ loop</w:t>
+            </w:r>
+          </w:p>
+        </w:tc>
+      </w:tr>
+      <w:tr>
+        <w:tc>
+          <w:tcPr/>
+          <w:p>
+            <w:pPr>
+              <w:pStyle w:val="Compact"/>
+            </w:pPr>
+            <w:r>
+              <w:t xml:space="preserve">Update a few fields</w:t>
+            </w:r>
+          </w:p>
+        </w:tc>
+        <w:tc>
+          <w:tcPr/>
+          <w:p>
+            <w:pPr>
+              <w:pStyle w:val="Compact"/>
+            </w:pPr>
+            <w:r>
+              <w:rPr>
+                <w:rStyle w:val="VerbatimChar"/>
+              </w:rPr>
+              <w:t xml:space="preserve">record.submitFields()</w:t>
+            </w:r>
+          </w:p>
+        </w:tc>
+        <w:tc>
+          <w:tcPr/>
+          <w:p>
+            <w:pPr>
+              <w:pStyle w:val="Compact"/>
+            </w:pPr>
+            <w:r>
+              <w:rPr>
+                <w:rStyle w:val="VerbatimChar"/>
+              </w:rPr>
+              <w:t xml:space="preserve">record.load()</w:t>
+            </w:r>
+            <w:r>
+              <w:t xml:space="preserve"> </w:t>
+            </w:r>
+            <w:r>
+              <w:t xml:space="preserve">+</w:t>
+            </w:r>
+            <w:r>
+              <w:t xml:space="preserve"> </w:t>
+            </w:r>
+            <w:r>
+              <w:rPr>
+                <w:rStyle w:val="VerbatimChar"/>
+              </w:rPr>
+              <w:t xml:space="preserve">setValue()</w:t>
+            </w:r>
+            <w:r>
+              <w:t xml:space="preserve"> </w:t>
+            </w:r>
+            <w:r>
+              <w:t xml:space="preserve">+</w:t>
+            </w:r>
+            <w:r>
+              <w:t xml:space="preserve"> </w:t>
+            </w:r>
+            <w:r>
+              <w:rPr>
+                <w:rStyle w:val="VerbatimChar"/>
+              </w:rPr>
+              <w:t xml:space="preserve">save()</w:t>
+            </w:r>
+          </w:p>
+        </w:tc>
+      </w:tr>
+    </w:tbl>
+    <w:p>
+      <w:pPr>
+        <w:pStyle w:val="SourceCode"/>
+      </w:pPr>
+      <w:r>
+        <w:rPr>
+          <w:rStyle w:val="CommentTok"/>
+        </w:rPr>
+        <w:t xml:space="preserve">// GOOD: Read fields without loading the record (2 governance units)</w:t>
+      </w:r>
+      <w:r>
+        <w:br/>
+      </w:r>
+      <w:r>
+        <w:rPr>
+          <w:rStyle w:val="KeywordTok"/>
+        </w:rPr>
+        <w:t xml:space="preserve">const</w:t>
+      </w:r>
+      <w:r>
+        <w:rPr>
+          <w:rStyle w:val="NormalTok"/>
+        </w:rPr>
+        <w:t xml:space="preserve"> fields </w:t>
+      </w:r>
+      <w:r>
+        <w:rPr>
+          <w:rStyle w:val="OperatorTok"/>
+        </w:rPr>
+        <w:t xml:space="preserve">=</w:t>
+      </w:r>
+      <w:r>
+        <w:rPr>
+          <w:rStyle w:val="NormalTok"/>
+        </w:rPr>
+        <w:t xml:space="preserve"> search</w:t>
+      </w:r>
+      <w:r>
+        <w:rPr>
+          <w:rStyle w:val="OperatorTok"/>
+        </w:rPr>
+        <w:t xml:space="preserve">.</w:t>
+      </w:r>
+      <w:r>
+        <w:rPr>
+          <w:rStyle w:val="FunctionTok"/>
+        </w:rPr>
+        <w:t xml:space="preserve">lookupFields</w:t>
+      </w:r>
+      <w:r>
+        <w:rPr>
+          <w:rStyle w:val="NormalTok"/>
+        </w:rPr>
+        <w:t xml:space="preserve">({</w:t>
+      </w:r>
+      <w:r>
+        <w:br/>
+      </w:r>
+      <w:r>
+        <w:rPr>
+          <w:rStyle w:val="NormalTok"/>
+        </w:rPr>
+        <w:t xml:space="preserve">    </w:t>
+      </w:r>
+      <w:r>
+        <w:rPr>
+          <w:rStyle w:val="DataTypeTok"/>
+        </w:rPr>
+        <w:t xml:space="preserve">type</w:t>
+      </w:r>
+      <w:r>
+        <w:rPr>
+          <w:rStyle w:val="OperatorTok"/>
+        </w:rPr>
+        <w:t xml:space="preserve">:</w:t>
+      </w:r>
+      <w:r>
+        <w:rPr>
+          <w:rStyle w:val="NormalTok"/>
+        </w:rPr>
+        <w:t xml:space="preserve"> search</w:t>
+      </w:r>
+      <w:r>
+        <w:rPr>
+          <w:rStyle w:val="OperatorTok"/>
+        </w:rPr>
+        <w:t xml:space="preserve">.</w:t>
+      </w:r>
+      <w:r>
+        <w:rPr>
+          <w:rStyle w:val="AttributeTok"/>
+        </w:rPr>
+        <w:t xml:space="preserve">Type</w:t>
+      </w:r>
+      <w:r>
+        <w:rPr>
+          <w:rStyle w:val="OperatorTok"/>
+        </w:rPr>
+        <w:t xml:space="preserve">.</w:t>
+      </w:r>
+      <w:r>
+        <w:rPr>
+          <w:rStyle w:val="AttributeTok"/>
+        </w:rPr>
+        <w:t xml:space="preserve">SALES_ORDER</w:t>
+      </w:r>
+      <w:r>
+        <w:rPr>
+          <w:rStyle w:val="OperatorTok"/>
+        </w:rPr>
+        <w:t xml:space="preserve">,</w:t>
+      </w:r>
+      <w:r>
+        <w:br/>
+      </w:r>
+      <w:r>
+        <w:rPr>
+          <w:rStyle w:val="NormalTok"/>
+        </w:rPr>
+        <w:t xml:space="preserve">    </w:t>
+      </w:r>
+      <w:r>
+        <w:rPr>
+          <w:rStyle w:val="DataTypeTok"/>
+        </w:rPr>
+        <w:t xml:space="preserve">id</w:t>
+      </w:r>
+      <w:r>
+        <w:rPr>
+          <w:rStyle w:val="OperatorTok"/>
+        </w:rPr>
+        <w:t xml:space="preserve">:</w:t>
+      </w:r>
+      <w:r>
+        <w:rPr>
+          <w:rStyle w:val="NormalTok"/>
+        </w:rPr>
+        <w:t xml:space="preserve"> transactionId</w:t>
+      </w:r>
+      <w:r>
+        <w:rPr>
+          <w:rStyle w:val="OperatorTok"/>
+        </w:rPr>
+        <w:t xml:space="preserve">,</w:t>
+      </w:r>
+      <w:r>
+        <w:br/>
+      </w:r>
+      <w:r>
+        <w:rPr>
+          <w:rStyle w:val="NormalTok"/>
+        </w:rPr>
+        <w:t xml:space="preserve">    </w:t>
+      </w:r>
+      <w:r>
+        <w:rPr>
+          <w:rStyle w:val="DataTypeTok"/>
+        </w:rPr>
+        <w:t xml:space="preserve">columns</w:t>
+      </w:r>
+      <w:r>
+        <w:rPr>
+          <w:rStyle w:val="OperatorTok"/>
+        </w:rPr>
+        <w:t xml:space="preserve">:</w:t>
+      </w:r>
+      <w:r>
+        <w:rPr>
+          <w:rStyle w:val="NormalTok"/>
+        </w:rPr>
+        <w:t xml:space="preserve"> [</w:t>
+      </w:r>
+      <w:r>
+        <w:rPr>
+          <w:rStyle w:val="StringTok"/>
+        </w:rPr>
+        <w:t xml:space="preserve">'tranid'</w:t>
+      </w:r>
+      <w:r>
+        <w:rPr>
+          <w:rStyle w:val="OperatorTok"/>
+        </w:rPr>
+        <w:t xml:space="preserve">,</w:t>
+      </w:r>
+      <w:r>
+        <w:rPr>
+          <w:rStyle w:val="NormalTok"/>
+        </w:rPr>
+        <w:t xml:space="preserve"> </w:t>
+      </w:r>
+      <w:r>
+        <w:rPr>
+          <w:rStyle w:val="StringTok"/>
+        </w:rPr>
+        <w:t xml:space="preserve">'status'</w:t>
+      </w:r>
+      <w:r>
+        <w:rPr>
+          <w:rStyle w:val="OperatorTok"/>
+        </w:rPr>
+        <w:t xml:space="preserve">,</w:t>
+      </w:r>
+      <w:r>
+        <w:rPr>
+          <w:rStyle w:val="NormalTok"/>
+        </w:rPr>
+        <w:t xml:space="preserve"> </w:t>
+      </w:r>
+      <w:r>
+        <w:rPr>
+          <w:rStyle w:val="StringTok"/>
+        </w:rPr>
+        <w:t xml:space="preserve">'entity'</w:t>
+      </w:r>
+      <w:r>
+        <w:rPr>
+          <w:rStyle w:val="OperatorTok"/>
+        </w:rPr>
+        <w:t xml:space="preserve">,</w:t>
+      </w:r>
+      <w:r>
+        <w:rPr>
+          <w:rStyle w:val="NormalTok"/>
+        </w:rPr>
+        <w:t xml:space="preserve"> </w:t>
+      </w:r>
+      <w:r>
+        <w:rPr>
+          <w:rStyle w:val="StringTok"/>
+        </w:rPr>
+        <w:t xml:space="preserve">'custbody_fp_tax_history_steps'</w:t>
+      </w:r>
+      <w:r>
+        <w:rPr>
+          <w:rStyle w:val="NormalTok"/>
+        </w:rPr>
+        <w:t xml:space="preserve">]</w:t>
+      </w:r>
+      <w:r>
+        <w:br/>
+      </w:r>
+      <w:r>
+        <w:rPr>
+          <w:rStyle w:val="NormalTok"/>
+        </w:rPr>
+        <w:t xml:space="preserve">})</w:t>
+      </w:r>
+      <w:r>
+        <w:rPr>
+          <w:rStyle w:val="OperatorTok"/>
+        </w:rPr>
+        <w:t xml:space="preserve">;</w:t>
+      </w:r>
+      <w:r>
+        <w:br/>
+      </w:r>
+      <w:r>
+        <w:rPr>
+          <w:rStyle w:val="KeywordTok"/>
+        </w:rPr>
+        <w:t xml:space="preserve">const</w:t>
+      </w:r>
+      <w:r>
+        <w:rPr>
+          <w:rStyle w:val="NormalTok"/>
+        </w:rPr>
+        <w:t xml:space="preserve"> status </w:t>
+      </w:r>
+      <w:r>
+        <w:rPr>
+          <w:rStyle w:val="OperatorTok"/>
+        </w:rPr>
+        <w:t xml:space="preserve">=</w:t>
+      </w:r>
+      <w:r>
+        <w:rPr>
+          <w:rStyle w:val="NormalTok"/>
+        </w:rPr>
+        <w:t xml:space="preserve"> fields</w:t>
+      </w:r>
+      <w:r>
+        <w:rPr>
+          <w:rStyle w:val="OperatorTok"/>
+        </w:rPr>
+        <w:t xml:space="preserve">.</w:t>
+      </w:r>
+      <w:r>
+        <w:rPr>
+          <w:rStyle w:val="AttributeTok"/>
+        </w:rPr>
+        <w:t xml:space="preserve">status</w:t>
+      </w:r>
+      <w:r>
+        <w:rPr>
+          <w:rStyle w:val="NormalTok"/>
+        </w:rPr>
+        <w:t xml:space="preserve">[</w:t>
+      </w:r>
+      <w:r>
+        <w:rPr>
+          <w:rStyle w:val="DecValTok"/>
+        </w:rPr>
+        <w:t xml:space="preserve">0</w:t>
+      </w:r>
+      <w:r>
+        <w:rPr>
+          <w:rStyle w:val="NormalTok"/>
+        </w:rPr>
+        <w:t xml:space="preserve">]</w:t>
+      </w:r>
+      <w:r>
+        <w:rPr>
+          <w:rStyle w:val="OperatorTok"/>
+        </w:rPr>
+        <w:t xml:space="preserve">.</w:t>
+      </w:r>
+      <w:r>
+        <w:rPr>
+          <w:rStyle w:val="AttributeTok"/>
+        </w:rPr>
+        <w:t xml:space="preserve">value</w:t>
+      </w:r>
+      <w:r>
+        <w:rPr>
+          <w:rStyle w:val="OperatorTok"/>
+        </w:rPr>
+        <w:t xml:space="preserve">;</w:t>
+      </w:r>
+      <w:r>
+        <w:br/>
+      </w:r>
+      <w:r>
+        <w:rPr>
+          <w:rStyle w:val="KeywordTok"/>
+        </w:rPr>
+        <w:t xml:space="preserve">const</w:t>
+      </w:r>
+      <w:r>
+        <w:rPr>
+          <w:rStyle w:val="NormalTok"/>
+        </w:rPr>
+        <w:t xml:space="preserve"> tranId </w:t>
+      </w:r>
+      <w:r>
+        <w:rPr>
+          <w:rStyle w:val="OperatorTok"/>
+        </w:rPr>
+        <w:t xml:space="preserve">=</w:t>
+      </w:r>
+      <w:r>
+        <w:rPr>
+          <w:rStyle w:val="NormalTok"/>
+        </w:rPr>
+        <w:t xml:space="preserve"> fields</w:t>
+      </w:r>
+      <w:r>
+        <w:rPr>
+          <w:rStyle w:val="OperatorTok"/>
+        </w:rPr>
+        <w:t xml:space="preserve">.</w:t>
+      </w:r>
+      <w:r>
+        <w:rPr>
+          <w:rStyle w:val="AttributeTok"/>
+        </w:rPr>
+        <w:t xml:space="preserve">tranid</w:t>
+      </w:r>
+      <w:r>
+        <w:rPr>
+          <w:rStyle w:val="OperatorTok"/>
+        </w:rPr>
+        <w:t xml:space="preserve">;</w:t>
+      </w:r>
+    </w:p>
+    <w:p>
+      <w:pPr>
+        <w:pStyle w:val="SourceCode"/>
+      </w:pPr>
+      <w:r>
+        <w:rPr>
+          <w:rStyle w:val="CommentTok"/>
+        </w:rPr>
+        <w:t xml:space="preserve">// GOOD: Update fields without loading the record (2 governance units)</w:t>
+      </w:r>
+      <w:r>
+        <w:br/>
+      </w:r>
+      <w:r>
+        <w:rPr>
+          <w:rStyle w:val="NormalTok"/>
+        </w:rPr>
+        <w:t xml:space="preserve">record</w:t>
+      </w:r>
+      <w:r>
+        <w:rPr>
+          <w:rStyle w:val="OperatorTok"/>
+        </w:rPr>
+        <w:t xml:space="preserve">.</w:t>
+      </w:r>
+      <w:r>
+        <w:rPr>
+          <w:rStyle w:val="FunctionTok"/>
+        </w:rPr>
+        <w:t xml:space="preserve">submitFields</w:t>
+      </w:r>
+      <w:r>
+        <w:rPr>
+          <w:rStyle w:val="NormalTok"/>
+        </w:rPr>
+        <w:t xml:space="preserve">({</w:t>
+      </w:r>
+      <w:r>
+        <w:br/>
+      </w:r>
+      <w:r>
+        <w:rPr>
+          <w:rStyle w:val="NormalTok"/>
+        </w:rPr>
+        <w:t xml:space="preserve">    </w:t>
+      </w:r>
+      <w:r>
+        <w:rPr>
+          <w:rStyle w:val="DataTypeTok"/>
+        </w:rPr>
+        <w:t xml:space="preserve">type</w:t>
+      </w:r>
+      <w:r>
+        <w:rPr>
+          <w:rStyle w:val="OperatorTok"/>
+        </w:rPr>
+        <w:t xml:space="preserve">:</w:t>
+      </w:r>
+      <w:r>
+        <w:rPr>
+          <w:rStyle w:val="NormalTok"/>
+        </w:rPr>
+        <w:t xml:space="preserve"> record</w:t>
+      </w:r>
+      <w:r>
+        <w:rPr>
+          <w:rStyle w:val="OperatorTok"/>
+        </w:rPr>
+        <w:t xml:space="preserve">.</w:t>
+      </w:r>
+      <w:r>
+        <w:rPr>
+          <w:rStyle w:val="AttributeTok"/>
+        </w:rPr>
+        <w:t xml:space="preserve">Type</w:t>
+      </w:r>
+      <w:r>
+        <w:rPr>
+          <w:rStyle w:val="OperatorTok"/>
+        </w:rPr>
+        <w:t xml:space="preserve">.</w:t>
+      </w:r>
+      <w:r>
+        <w:rPr>
+          <w:rStyle w:val="AttributeTok"/>
+        </w:rPr>
+        <w:t xml:space="preserve">SALES_ORDER</w:t>
+      </w:r>
+      <w:r>
+        <w:rPr>
+          <w:rStyle w:val="OperatorTok"/>
+        </w:rPr>
+        <w:t xml:space="preserve">,</w:t>
+      </w:r>
+      <w:r>
+        <w:br/>
+      </w:r>
+      <w:r>
+        <w:rPr>
+          <w:rStyle w:val="NormalTok"/>
+        </w:rPr>
+        <w:t xml:space="preserve">    </w:t>
+      </w:r>
+      <w:r>
+        <w:rPr>
+          <w:rStyle w:val="DataTypeTok"/>
+        </w:rPr>
+        <w:t xml:space="preserve">id</w:t>
+      </w:r>
+      <w:r>
+        <w:rPr>
+          <w:rStyle w:val="OperatorTok"/>
+        </w:rPr>
+        <w:t xml:space="preserve">:</w:t>
+      </w:r>
+      <w:r>
+        <w:rPr>
+          <w:rStyle w:val="NormalTok"/>
+        </w:rPr>
+        <w:t xml:space="preserve"> transactionId</w:t>
+      </w:r>
+      <w:r>
+        <w:rPr>
+          <w:rStyle w:val="OperatorTok"/>
+        </w:rPr>
+        <w:t xml:space="preserve">,</w:t>
+      </w:r>
+      <w:r>
+        <w:br/>
+      </w:r>
+      <w:r>
+        <w:rPr>
+          <w:rStyle w:val="NormalTok"/>
+        </w:rPr>
+        <w:t xml:space="preserve">    </w:t>
+      </w:r>
+      <w:r>
+        <w:rPr>
+          <w:rStyle w:val="DataTypeTok"/>
+        </w:rPr>
+        <w:t xml:space="preserve">values</w:t>
+      </w:r>
+      <w:r>
+        <w:rPr>
+          <w:rStyle w:val="OperatorTok"/>
+        </w:rPr>
+        <w:t xml:space="preserve">:</w:t>
+      </w:r>
+      <w:r>
+        <w:rPr>
+          <w:rStyle w:val="NormalTok"/>
+        </w:rPr>
+        <w:t xml:space="preserve"> {</w:t>
+      </w:r>
+      <w:r>
+        <w:br/>
+      </w:r>
+      <w:r>
+        <w:rPr>
+          <w:rStyle w:val="NormalTok"/>
+        </w:rPr>
+        <w:t xml:space="preserve">        </w:t>
+      </w:r>
+      <w:r>
+        <w:rPr>
+          <w:rStyle w:val="DataTypeTok"/>
+        </w:rPr>
+        <w:t xml:space="preserve">custbody_fp_tax_history_steps</w:t>
+      </w:r>
+      <w:r>
+        <w:rPr>
+          <w:rStyle w:val="OperatorTok"/>
+        </w:rPr>
+        <w:t xml:space="preserve">:</w:t>
+      </w:r>
+      <w:r>
+        <w:rPr>
+          <w:rStyle w:val="NormalTok"/>
+        </w:rPr>
+        <w:t xml:space="preserve"> </w:t>
+      </w:r>
+      <w:r>
+        <w:rPr>
+          <w:rStyle w:val="BuiltInTok"/>
+        </w:rPr>
+        <w:t xml:space="preserve">JSON</w:t>
+      </w:r>
+      <w:r>
+        <w:rPr>
+          <w:rStyle w:val="OperatorTok"/>
+        </w:rPr>
+        <w:t xml:space="preserve">.</w:t>
+      </w:r>
+      <w:r>
+        <w:rPr>
+          <w:rStyle w:val="FunctionTok"/>
+        </w:rPr>
+        <w:t xml:space="preserve">stringify</w:t>
+      </w:r>
+      <w:r>
+        <w:rPr>
+          <w:rStyle w:val="NormalTok"/>
+        </w:rPr>
+        <w:t xml:space="preserve">(taxSteps)</w:t>
+      </w:r>
+      <w:r>
+        <w:rPr>
+          <w:rStyle w:val="OperatorTok"/>
+        </w:rPr>
+        <w:t xml:space="preserve">,</w:t>
+      </w:r>
+      <w:r>
+        <w:br/>
+      </w:r>
+      <w:r>
+        <w:rPr>
+          <w:rStyle w:val="NormalTok"/>
+        </w:rPr>
+        <w:t xml:space="preserve">        </w:t>
+      </w:r>
+      <w:r>
+        <w:rPr>
+          <w:rStyle w:val="DataTypeTok"/>
+        </w:rPr>
+        <w:t xml:space="preserve">custbody_fp_last_calc_date</w:t>
+      </w:r>
+      <w:r>
+        <w:rPr>
+          <w:rStyle w:val="OperatorTok"/>
+        </w:rPr>
+        <w:t xml:space="preserve">:</w:t>
+      </w:r>
+      <w:r>
+        <w:rPr>
+          <w:rStyle w:val="NormalTok"/>
+        </w:rPr>
+        <w:t xml:space="preserve"> </w:t>
+      </w:r>
+      <w:r>
+        <w:rPr>
+          <w:rStyle w:val="KeywordTok"/>
+        </w:rPr>
+        <w:t xml:space="preserve">new</w:t>
+      </w:r>
+      <w:r>
+        <w:rPr>
+          <w:rStyle w:val="NormalTok"/>
+        </w:rPr>
+        <w:t xml:space="preserve"> </w:t>
+      </w:r>
+      <w:r>
+        <w:rPr>
+          <w:rStyle w:val="BuiltInTok"/>
+        </w:rPr>
+        <w:t xml:space="preserve">Date</w:t>
+      </w:r>
+      <w:r>
+        <w:rPr>
+          <w:rStyle w:val="NormalTok"/>
+        </w:rPr>
+        <w:t xml:space="preserve">()</w:t>
+      </w:r>
+      <w:r>
+        <w:br/>
+      </w:r>
+      <w:r>
+        <w:rPr>
+          <w:rStyle w:val="NormalTok"/>
+        </w:rPr>
+        <w:t xml:space="preserve">    }</w:t>
+      </w:r>
+      <w:r>
+        <w:rPr>
+          <w:rStyle w:val="OperatorTok"/>
+        </w:rPr>
+        <w:t xml:space="preserve">,</w:t>
+      </w:r>
+      <w:r>
+        <w:br/>
+      </w:r>
+      <w:r>
+        <w:rPr>
+          <w:rStyle w:val="NormalTok"/>
+        </w:rPr>
+        <w:t xml:space="preserve">    </w:t>
+      </w:r>
+      <w:r>
+        <w:rPr>
+          <w:rStyle w:val="DataTypeTok"/>
+        </w:rPr>
+        <w:t xml:space="preserve">options</w:t>
+      </w:r>
+      <w:r>
+        <w:rPr>
+          <w:rStyle w:val="OperatorTok"/>
+        </w:rPr>
+        <w:t xml:space="preserve">:</w:t>
+      </w:r>
+      <w:r>
+        <w:rPr>
+          <w:rStyle w:val="NormalTok"/>
+        </w:rPr>
+        <w:t xml:space="preserve"> { </w:t>
+      </w:r>
+      <w:r>
+        <w:rPr>
+          <w:rStyle w:val="DataTypeTok"/>
+        </w:rPr>
+        <w:t xml:space="preserve">enableSourcing</w:t>
+      </w:r>
+      <w:r>
+        <w:rPr>
+          <w:rStyle w:val="OperatorTok"/>
+        </w:rPr>
+        <w:t xml:space="preserve">:</w:t>
+      </w:r>
+      <w:r>
+        <w:rPr>
+          <w:rStyle w:val="NormalTok"/>
+        </w:rPr>
+        <w:t xml:space="preserve"> </w:t>
+      </w:r>
+      <w:r>
+        <w:rPr>
+          <w:rStyle w:val="KeywordTok"/>
+        </w:rPr>
+        <w:t xml:space="preserve">false</w:t>
+      </w:r>
+      <w:r>
+        <w:rPr>
+          <w:rStyle w:val="OperatorTok"/>
+        </w:rPr>
+        <w:t xml:space="preserve">,</w:t>
+      </w:r>
+      <w:r>
+        <w:rPr>
+          <w:rStyle w:val="NormalTok"/>
+        </w:rPr>
+        <w:t xml:space="preserve"> </w:t>
+      </w:r>
+      <w:r>
+        <w:rPr>
+          <w:rStyle w:val="DataTypeTok"/>
+        </w:rPr>
+        <w:t xml:space="preserve">ignoreMandatoryFields</w:t>
+      </w:r>
+      <w:r>
+        <w:rPr>
+          <w:rStyle w:val="OperatorTok"/>
+        </w:rPr>
+        <w:t xml:space="preserve">:</w:t>
+      </w:r>
+      <w:r>
+        <w:rPr>
+          <w:rStyle w:val="NormalTok"/>
+        </w:rPr>
+        <w:t xml:space="preserve"> </w:t>
+      </w:r>
+      <w:r>
+        <w:rPr>
+          <w:rStyle w:val="KeywordTok"/>
+        </w:rPr>
+        <w:t xml:space="preserve">true</w:t>
+      </w:r>
+      <w:r>
+        <w:rPr>
+          <w:rStyle w:val="NormalTok"/>
+        </w:rPr>
+        <w:t xml:space="preserve"> }</w:t>
+      </w:r>
+      <w:r>
+        <w:br/>
+      </w:r>
+      <w:r>
+        <w:rPr>
+          <w:rStyle w:val="NormalTok"/>
+        </w:rPr>
+        <w:t xml:space="preserve">})</w:t>
+      </w:r>
+      <w:r>
+        <w:rPr>
+          <w:rStyle w:val="OperatorTok"/>
+        </w:rPr>
+        <w:t xml:space="preserve">;</w:t>
+      </w:r>
+    </w:p>
+    <w:p>
+      <w:pPr>
+        <w:pStyle w:val="SourceCode"/>
+      </w:pPr>
+      <w:r>
+        <w:rPr>
+          <w:rStyle w:val="CommentTok"/>
+        </w:rPr>
+        <w:t xml:space="preserve">// GOOD: Read line-level data via SuiteQL (1 governance unit)</w:t>
+      </w:r>
+      <w:r>
+        <w:br/>
+      </w:r>
+      <w:r>
+        <w:rPr>
+          <w:rStyle w:val="KeywordTok"/>
+        </w:rPr>
+        <w:t xml:space="preserve">const</w:t>
+      </w:r>
+      <w:r>
+        <w:rPr>
+          <w:rStyle w:val="NormalTok"/>
+        </w:rPr>
+        <w:t xml:space="preserve"> lines </w:t>
+      </w:r>
+      <w:r>
+        <w:rPr>
+          <w:rStyle w:val="OperatorTok"/>
+        </w:rPr>
+        <w:t xml:space="preserve">=</w:t>
+      </w:r>
+      <w:r>
+        <w:rPr>
+          <w:rStyle w:val="NormalTok"/>
+        </w:rPr>
+        <w:t xml:space="preserve"> query</w:t>
+      </w:r>
+      <w:r>
+        <w:rPr>
+          <w:rStyle w:val="OperatorTok"/>
+        </w:rPr>
+        <w:t xml:space="preserve">.</w:t>
+      </w:r>
+      <w:r>
+        <w:rPr>
+          <w:rStyle w:val="FunctionTok"/>
+        </w:rPr>
+        <w:t xml:space="preserve">runSuiteQL</w:t>
+      </w:r>
+      <w:r>
+        <w:rPr>
+          <w:rStyle w:val="NormalTok"/>
+        </w:rPr>
+        <w:t xml:space="preserve">({</w:t>
+      </w:r>
+      <w:r>
+        <w:br/>
+      </w:r>
+      <w:r>
+        <w:rPr>
+          <w:rStyle w:val="NormalTok"/>
+        </w:rPr>
+        <w:t xml:space="preserve">    </w:t>
+      </w:r>
+      <w:r>
+        <w:rPr>
+          <w:rStyle w:val="DataTypeTok"/>
+        </w:rPr>
+        <w:t xml:space="preserve">query</w:t>
+      </w:r>
+      <w:r>
+        <w:rPr>
+          <w:rStyle w:val="OperatorTok"/>
+        </w:rPr>
+        <w:t xml:space="preserve">:</w:t>
+      </w:r>
+      <w:r>
+        <w:rPr>
+          <w:rStyle w:val="NormalTok"/>
+        </w:rPr>
+        <w:t xml:space="preserve"> </w:t>
+      </w:r>
+      <w:r>
+        <w:rPr>
+          <w:rStyle w:val="VerbatimStringTok"/>
+        </w:rPr>
+        <w:t xml:space="preserve">`</w:t>
+      </w:r>
+      <w:r>
+        <w:br/>
+      </w:r>
+      <w:r>
+        <w:rPr>
+          <w:rStyle w:val="VerbatimStringTok"/>
+        </w:rPr>
+        <w:t xml:space="preserve">        SELECT line, item, taxcode, amount</w:t>
+      </w:r>
+      <w:r>
+        <w:br/>
+      </w:r>
+      <w:r>
+        <w:rPr>
+          <w:rStyle w:val="VerbatimStringTok"/>
+        </w:rPr>
+        <w:t xml:space="preserve">        FROM transactionline</w:t>
+      </w:r>
+      <w:r>
+        <w:br/>
+      </w:r>
+      <w:r>
+        <w:rPr>
+          <w:rStyle w:val="VerbatimStringTok"/>
+        </w:rPr>
+        <w:t xml:space="preserve">        WHERE transaction = </w:t>
+      </w:r>
+      <w:r>
+        <w:rPr>
+          <w:rStyle w:val="SpecialCharTok"/>
+        </w:rPr>
+        <w:t xml:space="preserve">${</w:t>
+      </w:r>
+      <w:r>
+        <w:rPr>
+          <w:rStyle w:val="NormalTok"/>
+        </w:rPr>
+        <w:t xml:space="preserve">transactionId</w:t>
+      </w:r>
+      <w:r>
+        <w:rPr>
+          <w:rStyle w:val="SpecialCharTok"/>
+        </w:rPr>
+        <w:t xml:space="preserve">}</w:t>
+      </w:r>
+      <w:r>
+        <w:br/>
+      </w:r>
+      <w:r>
+        <w:rPr>
+          <w:rStyle w:val="VerbatimStringTok"/>
+        </w:rPr>
+        <w:t xml:space="preserve">            AND taxline = 'F' AND mainline = 'F'</w:t>
+      </w:r>
+      <w:r>
+        <w:br/>
+      </w:r>
+      <w:r>
+        <w:rPr>
+          <w:rStyle w:val="VerbatimStringTok"/>
+        </w:rPr>
+        <w:t xml:space="preserve">        ORDER BY line</w:t>
+      </w:r>
+      <w:r>
+        <w:br/>
+      </w:r>
+      <w:r>
+        <w:rPr>
+          <w:rStyle w:val="VerbatimStringTok"/>
+        </w:rPr>
+        <w:t xml:space="preserve">    `</w:t>
+      </w:r>
+      <w:r>
+        <w:br/>
+      </w:r>
+      <w:r>
+        <w:rPr>
+          <w:rStyle w:val="NormalTok"/>
+        </w:rPr>
+        <w:t xml:space="preserve">})</w:t>
+      </w:r>
+      <w:r>
+        <w:rPr>
+          <w:rStyle w:val="OperatorTok"/>
+        </w:rPr>
+        <w:t xml:space="preserve">.</w:t>
+      </w:r>
+      <w:r>
+        <w:rPr>
+          <w:rStyle w:val="FunctionTok"/>
+        </w:rPr>
+        <w:t xml:space="preserve">asMappedResults</w:t>
+      </w:r>
+      <w:r>
+        <w:rPr>
+          <w:rStyle w:val="NormalTok"/>
+        </w:rPr>
+        <w:t xml:space="preserve">()</w:t>
+      </w:r>
+      <w:r>
+        <w:rPr>
+          <w:rStyle w:val="OperatorTok"/>
+        </w:rPr>
+        <w:t xml:space="preserve">;</w:t>
+      </w:r>
+    </w:p>
+    <w:p>
+      <w:pPr>
+        <w:pStyle w:val="SourceCode"/>
+      </w:pPr>
+      <w:r>
+        <w:rPr>
+          <w:rStyle w:val="CommentTok"/>
+        </w:rPr>
+        <w:t xml:space="preserve">// BAD: Loading the full record just to read or update a few fields (10 governance units)</w:t>
+      </w:r>
+      <w:r>
+        <w:br/>
+      </w:r>
+      <w:r>
+        <w:rPr>
+          <w:rStyle w:val="KeywordTok"/>
+        </w:rPr>
+        <w:t xml:space="preserve">const</w:t>
+      </w:r>
+      <w:r>
+        <w:rPr>
+          <w:rStyle w:val="NormalTok"/>
+        </w:rPr>
+        <w:t xml:space="preserve"> rec </w:t>
+      </w:r>
+      <w:r>
+        <w:rPr>
+          <w:rStyle w:val="OperatorTok"/>
+        </w:rPr>
+        <w:t xml:space="preserve">=</w:t>
+      </w:r>
+      <w:r>
+        <w:rPr>
+          <w:rStyle w:val="NormalTok"/>
+        </w:rPr>
+        <w:t xml:space="preserve"> record</w:t>
+      </w:r>
+      <w:r>
+        <w:rPr>
+          <w:rStyle w:val="OperatorTok"/>
+        </w:rPr>
+        <w:t xml:space="preserve">.</w:t>
+      </w:r>
+      <w:r>
+        <w:rPr>
+          <w:rStyle w:val="FunctionTok"/>
+        </w:rPr>
+        <w:t xml:space="preserve">load</w:t>
+      </w:r>
+      <w:r>
+        <w:rPr>
+          <w:rStyle w:val="NormalTok"/>
+        </w:rPr>
+        <w:t xml:space="preserve">({ </w:t>
+      </w:r>
+      <w:r>
+        <w:rPr>
+          <w:rStyle w:val="DataTypeTok"/>
+        </w:rPr>
+        <w:t xml:space="preserve">type</w:t>
+      </w:r>
+      <w:r>
+        <w:rPr>
+          <w:rStyle w:val="OperatorTok"/>
+        </w:rPr>
+        <w:t xml:space="preserve">:</w:t>
+      </w:r>
+      <w:r>
+        <w:rPr>
+          <w:rStyle w:val="NormalTok"/>
+        </w:rPr>
+        <w:t xml:space="preserve"> record</w:t>
+      </w:r>
+      <w:r>
+        <w:rPr>
+          <w:rStyle w:val="OperatorTok"/>
+        </w:rPr>
+        <w:t xml:space="preserve">.</w:t>
+      </w:r>
+      <w:r>
+        <w:rPr>
+          <w:rStyle w:val="AttributeTok"/>
+        </w:rPr>
+        <w:t xml:space="preserve">Type</w:t>
+      </w:r>
+      <w:r>
+        <w:rPr>
+          <w:rStyle w:val="OperatorTok"/>
+        </w:rPr>
+        <w:t xml:space="preserve">.</w:t>
+      </w:r>
+      <w:r>
+        <w:rPr>
+          <w:rStyle w:val="AttributeTok"/>
+        </w:rPr>
+        <w:t xml:space="preserve">SALES_ORDER</w:t>
+      </w:r>
+      <w:r>
+        <w:rPr>
+          <w:rStyle w:val="OperatorTok"/>
+        </w:rPr>
+        <w:t xml:space="preserve">,</w:t>
+      </w:r>
+      <w:r>
+        <w:rPr>
+          <w:rStyle w:val="NormalTok"/>
+        </w:rPr>
+        <w:t xml:space="preserve"> </w:t>
+      </w:r>
+      <w:r>
+        <w:rPr>
+          <w:rStyle w:val="DataTypeTok"/>
+        </w:rPr>
+        <w:t xml:space="preserve">id</w:t>
+      </w:r>
+      <w:r>
+        <w:rPr>
+          <w:rStyle w:val="OperatorTok"/>
+        </w:rPr>
+        <w:t xml:space="preserve">:</w:t>
+      </w:r>
+      <w:r>
+        <w:rPr>
+          <w:rStyle w:val="NormalTok"/>
+        </w:rPr>
+        <w:t xml:space="preserve"> transactionId })</w:t>
+      </w:r>
+      <w:r>
+        <w:rPr>
+          <w:rStyle w:val="OperatorTok"/>
+        </w:rPr>
+        <w:t xml:space="preserve">;</w:t>
+      </w:r>
+      <w:r>
+        <w:br/>
+      </w:r>
+      <w:r>
+        <w:rPr>
+          <w:rStyle w:val="KeywordTok"/>
+        </w:rPr>
+        <w:t xml:space="preserve">const</w:t>
+      </w:r>
+      <w:r>
+        <w:rPr>
+          <w:rStyle w:val="NormalTok"/>
+        </w:rPr>
+        <w:t xml:space="preserve"> status </w:t>
+      </w:r>
+      <w:r>
+        <w:rPr>
+          <w:rStyle w:val="OperatorTok"/>
+        </w:rPr>
+        <w:t xml:space="preserve">=</w:t>
+      </w:r>
+      <w:r>
+        <w:rPr>
+          <w:rStyle w:val="NormalTok"/>
+        </w:rPr>
+        <w:t xml:space="preserve"> rec</w:t>
+      </w:r>
+      <w:r>
+        <w:rPr>
+          <w:rStyle w:val="OperatorTok"/>
+        </w:rPr>
+        <w:t xml:space="preserve">.</w:t>
+      </w:r>
+      <w:r>
+        <w:rPr>
+          <w:rStyle w:val="FunctionTok"/>
+        </w:rPr>
+        <w:t xml:space="preserve">getValue</w:t>
+      </w:r>
+      <w:r>
+        <w:rPr>
+          <w:rStyle w:val="NormalTok"/>
+        </w:rPr>
+        <w:t xml:space="preserve">(</w:t>
+      </w:r>
+      <w:r>
+        <w:rPr>
+          <w:rStyle w:val="StringTok"/>
+        </w:rPr>
+        <w:t xml:space="preserve">'status'</w:t>
+      </w:r>
+      <w:r>
+        <w:rPr>
+          <w:rStyle w:val="NormalTok"/>
+        </w:rPr>
+        <w:t xml:space="preserve">)</w:t>
+      </w:r>
+      <w:r>
+        <w:rPr>
+          <w:rStyle w:val="OperatorTok"/>
+        </w:rPr>
+        <w:t xml:space="preserve">;</w:t>
+      </w:r>
+      <w:r>
+        <w:br/>
+      </w:r>
+      <w:r>
+        <w:rPr>
+          <w:rStyle w:val="NormalTok"/>
+        </w:rPr>
+        <w:t xml:space="preserve">rec</w:t>
+      </w:r>
+      <w:r>
+        <w:rPr>
+          <w:rStyle w:val="OperatorTok"/>
+        </w:rPr>
+        <w:t xml:space="preserve">.</w:t>
+      </w:r>
+      <w:r>
+        <w:rPr>
+          <w:rStyle w:val="FunctionTok"/>
+        </w:rPr>
+        <w:t xml:space="preserve">setValue</w:t>
+      </w:r>
+      <w:r>
+        <w:rPr>
+          <w:rStyle w:val="NormalTok"/>
+        </w:rPr>
+        <w:t xml:space="preserve">({ </w:t>
+      </w:r>
+      <w:r>
+        <w:rPr>
+          <w:rStyle w:val="DataTypeTok"/>
+        </w:rPr>
+        <w:t xml:space="preserve">fieldId</w:t>
+      </w:r>
+      <w:r>
+        <w:rPr>
+          <w:rStyle w:val="OperatorTok"/>
+        </w:rPr>
+        <w:t xml:space="preserve">:</w:t>
+      </w:r>
+      <w:r>
+        <w:rPr>
+          <w:rStyle w:val="NormalTok"/>
+        </w:rPr>
+        <w:t xml:space="preserve"> </w:t>
+      </w:r>
+      <w:r>
+        <w:rPr>
+          <w:rStyle w:val="StringTok"/>
+        </w:rPr>
+        <w:t xml:space="preserve">'custbody_fp_notes'</w:t>
+      </w:r>
+      <w:r>
+        <w:rPr>
+          <w:rStyle w:val="OperatorTok"/>
+        </w:rPr>
+        <w:t xml:space="preserve">,</w:t>
+      </w:r>
+      <w:r>
+        <w:rPr>
+          <w:rStyle w:val="NormalTok"/>
+        </w:rPr>
+        <w:t xml:space="preserve"> </w:t>
+      </w:r>
+      <w:r>
+        <w:rPr>
+          <w:rStyle w:val="DataTypeTok"/>
+        </w:rPr>
+        <w:t xml:space="preserve">value</w:t>
+      </w:r>
+      <w:r>
+        <w:rPr>
+          <w:rStyle w:val="OperatorTok"/>
+        </w:rPr>
+        <w:t xml:space="preserve">:</w:t>
+      </w:r>
+      <w:r>
+        <w:rPr>
+          <w:rStyle w:val="NormalTok"/>
+        </w:rPr>
+        <w:t xml:space="preserve"> </w:t>
+      </w:r>
+      <w:r>
+        <w:rPr>
+          <w:rStyle w:val="StringTok"/>
+        </w:rPr>
+        <w:t xml:space="preserve">'Updated'</w:t>
+      </w:r>
+      <w:r>
+        <w:rPr>
+          <w:rStyle w:val="NormalTok"/>
+        </w:rPr>
+        <w:t xml:space="preserve"> })</w:t>
+      </w:r>
+      <w:r>
+        <w:rPr>
+          <w:rStyle w:val="OperatorTok"/>
+        </w:rPr>
+        <w:t xml:space="preserve">;</w:t>
+      </w:r>
+      <w:r>
+        <w:br/>
+      </w:r>
+      <w:r>
+        <w:rPr>
+          <w:rStyle w:val="NormalTok"/>
+        </w:rPr>
+        <w:t xml:space="preserve">rec</w:t>
+      </w:r>
+      <w:r>
+        <w:rPr>
+          <w:rStyle w:val="OperatorTok"/>
+        </w:rPr>
+        <w:t xml:space="preserve">.</w:t>
+      </w:r>
+      <w:r>
+        <w:rPr>
+          <w:rStyle w:val="FunctionTok"/>
+        </w:rPr>
+        <w:t xml:space="preserve">save</w:t>
+      </w:r>
+      <w:r>
+        <w:rPr>
+          <w:rStyle w:val="NormalTok"/>
+        </w:rPr>
+        <w:t xml:space="preserve">()</w:t>
+      </w:r>
+      <w:r>
+        <w:rPr>
+          <w:rStyle w:val="OperatorTok"/>
+        </w:rPr>
+        <w:t xml:space="preserve">;</w:t>
       </w:r>
     </w:p>
     <w:p>
@@ -18492,6 +20051,322 @@
         <w:pStyle w:val="FirstParagraph"/>
       </w:pPr>
       <w:r>
+        <w:rPr>
+          <w:b/>
+          <w:bCs/>
+        </w:rPr>
+        <w:t xml:space="preserve">This is especially important in</w:t>
+      </w:r>
+      <w:r>
+        <w:rPr>
+          <w:b/>
+          <w:bCs/>
+        </w:rPr>
+        <w:t xml:space="preserve"> </w:t>
+      </w:r>
+      <w:r>
+        <w:rPr>
+          <w:rStyle w:val="VerbatimChar"/>
+          <w:b/>
+          <w:bCs/>
+        </w:rPr>
+        <w:t xml:space="preserve">afterSubmit</w:t>
+      </w:r>
+      <w:r>
+        <w:t xml:space="preserve">, where the transaction is already saved. In most cases you only need to read values or update a few fields —</w:t>
+      </w:r>
+      <w:r>
+        <w:t xml:space="preserve"> </w:t>
+      </w:r>
+      <w:r>
+        <w:rPr>
+          <w:rStyle w:val="VerbatimChar"/>
+        </w:rPr>
+        <w:t xml:space="preserve">search.lookupFields()</w:t>
+      </w:r>
+      <w:r>
+        <w:t xml:space="preserve">, SuiteQL, and</w:t>
+      </w:r>
+      <w:r>
+        <w:t xml:space="preserve"> </w:t>
+      </w:r>
+      <w:r>
+        <w:rPr>
+          <w:rStyle w:val="VerbatimChar"/>
+        </w:rPr>
+        <w:t xml:space="preserve">record.submitFields()</w:t>
+      </w:r>
+      <w:r>
+        <w:t xml:space="preserve"> </w:t>
+      </w:r>
+      <w:r>
+        <w:t xml:space="preserve">handle this without the overhead of a full load/save cycle.</w:t>
+      </w:r>
+    </w:p>
+    <w:p>
+      <w:pPr>
+        <w:pStyle w:val="BodyText"/>
+      </w:pPr>
+      <w:r>
+        <w:rPr>
+          <w:b/>
+          <w:bCs/>
+        </w:rPr>
+        <w:t xml:space="preserve">When you DO need</w:t>
+      </w:r>
+      <w:r>
+        <w:rPr>
+          <w:b/>
+          <w:bCs/>
+        </w:rPr>
+        <w:t xml:space="preserve"> </w:t>
+      </w:r>
+      <w:r>
+        <w:rPr>
+          <w:rStyle w:val="VerbatimChar"/>
+          <w:b/>
+          <w:bCs/>
+        </w:rPr>
+        <w:t xml:space="preserve">record.load</w:t>
+      </w:r>
+      <w:r>
+        <w:rPr>
+          <w:b/>
+          <w:bCs/>
+        </w:rPr>
+        <w:t xml:space="preserve">:</w:t>
+      </w:r>
+      <w:r>
+        <w:t xml:space="preserve"> </w:t>
+      </w:r>
+      <w:r>
+        <w:t xml:space="preserve">- Reading or modifying</w:t>
+      </w:r>
+      <w:r>
+        <w:t xml:space="preserve"> </w:t>
+      </w:r>
+      <w:r>
+        <w:rPr>
+          <w:b/>
+          <w:bCs/>
+        </w:rPr>
+        <w:t xml:space="preserve">subrecords</w:t>
+      </w:r>
+      <w:r>
+        <w:t xml:space="preserve"> </w:t>
+      </w:r>
+      <w:r>
+        <w:t xml:space="preserve">(addresses, inventory detail) — subrecords require a loaded parent record</w:t>
+      </w:r>
+      <w:r>
+        <w:t xml:space="preserve"> </w:t>
+      </w:r>
+      <w:r>
+        <w:t xml:space="preserve">- Setting</w:t>
+      </w:r>
+      <w:r>
+        <w:t xml:space="preserve"> </w:t>
+      </w:r>
+      <w:r>
+        <w:rPr>
+          <w:b/>
+          <w:bCs/>
+        </w:rPr>
+        <w:t xml:space="preserve">sublist values</w:t>
+      </w:r>
+      <w:r>
+        <w:t xml:space="preserve"> </w:t>
+      </w:r>
+      <w:r>
+        <w:t xml:space="preserve">that can’t be done via</w:t>
+      </w:r>
+      <w:r>
+        <w:t xml:space="preserve"> </w:t>
+      </w:r>
+      <w:r>
+        <w:rPr>
+          <w:rStyle w:val="VerbatimChar"/>
+        </w:rPr>
+        <w:t xml:space="preserve">submitFields</w:t>
+      </w:r>
+      <w:r>
+        <w:t xml:space="preserve"> </w:t>
+      </w:r>
+      <w:r>
+        <w:t xml:space="preserve">(e.g., line-level fields on item sublists)</w:t>
+      </w:r>
+      <w:r>
+        <w:t xml:space="preserve"> </w:t>
+      </w:r>
+      <w:r>
+        <w:t xml:space="preserve">- Dynamic mode operations where you need field sourcing to fire (e.g., setting</w:t>
+      </w:r>
+      <w:r>
+        <w:t xml:space="preserve"> </w:t>
+      </w:r>
+      <w:r>
+        <w:rPr>
+          <w:rStyle w:val="VerbatimChar"/>
+        </w:rPr>
+        <w:t xml:space="preserve">entity</w:t>
+      </w:r>
+      <w:r>
+        <w:t xml:space="preserve"> </w:t>
+      </w:r>
+      <w:r>
+        <w:t xml:space="preserve">and waiting for address fields to populate)</w:t>
+      </w:r>
+    </w:p>
+    <w:p>
+      <w:pPr>
+        <w:pStyle w:val="BlockText"/>
+      </w:pPr>
+      <w:r>
+        <w:rPr>
+          <w:b/>
+          <w:bCs/>
+        </w:rPr>
+        <w:t xml:space="preserve">Rule:</w:t>
+      </w:r>
+      <w:r>
+        <w:t xml:space="preserve"> </w:t>
+      </w:r>
+      <w:r>
+        <w:t xml:space="preserve">Default to</w:t>
+      </w:r>
+      <w:r>
+        <w:t xml:space="preserve"> </w:t>
+      </w:r>
+      <w:r>
+        <w:rPr>
+          <w:rStyle w:val="VerbatimChar"/>
+        </w:rPr>
+        <w:t xml:space="preserve">search.lookupFields</w:t>
+      </w:r>
+      <w:r>
+        <w:t xml:space="preserve"> </w:t>
+      </w:r>
+      <w:r>
+        <w:t xml:space="preserve">/</w:t>
+      </w:r>
+      <w:r>
+        <w:t xml:space="preserve"> </w:t>
+      </w:r>
+      <w:r>
+        <w:rPr>
+          <w:rStyle w:val="VerbatimChar"/>
+        </w:rPr>
+        <w:t xml:space="preserve">record.submitFields</w:t>
+      </w:r>
+      <w:r>
+        <w:t xml:space="preserve"> </w:t>
+      </w:r>
+      <w:r>
+        <w:t xml:space="preserve">/ SuiteQL. Only use</w:t>
+      </w:r>
+      <w:r>
+        <w:t xml:space="preserve"> </w:t>
+      </w:r>
+      <w:r>
+        <w:rPr>
+          <w:rStyle w:val="VerbatimChar"/>
+        </w:rPr>
+        <w:t xml:space="preserve">record.load</w:t>
+      </w:r>
+      <w:r>
+        <w:t xml:space="preserve"> </w:t>
+      </w:r>
+      <w:r>
+        <w:t xml:space="preserve">+</w:t>
+      </w:r>
+      <w:r>
+        <w:t xml:space="preserve"> </w:t>
+      </w:r>
+      <w:r>
+        <w:rPr>
+          <w:rStyle w:val="VerbatimChar"/>
+        </w:rPr>
+        <w:t xml:space="preserve">record.save</w:t>
+      </w:r>
+      <w:r>
+        <w:t xml:space="preserve"> </w:t>
+      </w:r>
+      <w:r>
+        <w:t xml:space="preserve">when subrecords or sublist modifications require it. When you do load a record, document</w:t>
+      </w:r>
+      <w:r>
+        <w:t xml:space="preserve"> </w:t>
+      </w:r>
+      <w:r>
+        <w:rPr>
+          <w:b/>
+          <w:bCs/>
+        </w:rPr>
+        <w:t xml:space="preserve">why</w:t>
+      </w:r>
+      <w:r>
+        <w:t xml:space="preserve"> </w:t>
+      </w:r>
+      <w:r>
+        <w:t xml:space="preserve">a lightweight API wasn’t sufficient.</w:t>
+      </w:r>
+    </w:p>
+    <w:p>
+      <w:r>
+        <w:pict>
+          <v:rect style="width:0;height:1.5pt" o:hralign="center" o:hrstd="t" o:hr="t"/>
+        </w:pict>
+      </w:r>
+    </w:p>
+    <w:bookmarkEnd w:id="41"/>
+    <w:bookmarkEnd w:id="42"/>
+    <w:bookmarkStart w:id="51" w:name="error-handling"/>
+    <w:p>
+      <w:pPr>
+        <w:pStyle w:val="Heading2"/>
+      </w:pPr>
+      <w:r>
+        <w:t xml:space="preserve">6. Error Handling</w:t>
+      </w:r>
+    </w:p>
+    <w:p>
+      <w:pPr>
+        <w:pStyle w:val="FirstParagraph"/>
+      </w:pPr>
+      <w:r>
+        <w:t xml:space="preserve">Our error handling strategy has one goal:</w:t>
+      </w:r>
+      <w:r>
+        <w:t xml:space="preserve"> </w:t>
+      </w:r>
+      <w:r>
+        <w:rPr>
+          <w:b/>
+          <w:bCs/>
+        </w:rPr>
+        <w:t xml:space="preserve">when something fails, you know exactly what failed, where, and on which record/line.</w:t>
+      </w:r>
+      <w:r>
+        <w:t xml:space="preserve"> </w:t>
+      </w:r>
+      <w:r>
+        <w:t xml:space="preserve">Errors bubble up from the deepest level with full context so the top-level catch can log everything in one place.</w:t>
+      </w:r>
+    </w:p>
+    <w:bookmarkStart w:id="43" w:name="top-level-trycatch-in-every-entry-point"/>
+    <w:p>
+      <w:pPr>
+        <w:pStyle w:val="Heading3"/>
+      </w:pPr>
+      <w:r>
+        <w:t xml:space="preserve">Top-level try…catch in every entry point</w:t>
+      </w:r>
+    </w:p>
+    <w:p>
+      <w:pPr>
+        <w:pStyle w:val="FirstParagraph"/>
+      </w:pPr>
+      <w:r>
         <w:t xml:space="preserve">Every exported function (</w:t>
       </w:r>
       <w:r>
@@ -19862,8 +21737,8 @@
         <w:t xml:space="preserve">}</w:t>
       </w:r>
     </w:p>
-    <w:bookmarkEnd w:id="42"/>
-    <w:bookmarkStart w:id="43" w:name="never-leave-an-empty-catch-block"/>
+    <w:bookmarkEnd w:id="43"/>
+    <w:bookmarkStart w:id="44" w:name="never-leave-an-empty-catch-block"/>
     <w:p>
       <w:pPr>
         <w:pStyle w:val="Heading3"/>
@@ -20609,8 +22484,8 @@
         <w:t xml:space="preserve">}</w:t>
       </w:r>
     </w:p>
-    <w:bookmarkEnd w:id="43"/>
-    <w:bookmarkStart w:id="44" w:name="X27a5fb6f7fa5861724c37befebdc3c038613c40"/>
+    <w:bookmarkEnd w:id="44"/>
+    <w:bookmarkStart w:id="45" w:name="X27a5fb6f7fa5861724c37befebdc3c038613c40"/>
     <w:p>
       <w:pPr>
         <w:pStyle w:val="Heading3"/>
@@ -21934,8 +23809,8 @@
         <w:t xml:space="preserve">}</w:t>
       </w:r>
     </w:p>
-    <w:bookmarkEnd w:id="44"/>
-    <w:bookmarkStart w:id="45" w:name="Xc95750c30bc935e7dc8343d456de09a6eed81bf"/>
+    <w:bookmarkEnd w:id="45"/>
+    <w:bookmarkStart w:id="46" w:name="Xc95750c30bc935e7dc8343d456de09a6eed81bf"/>
     <w:p>
       <w:pPr>
         <w:pStyle w:val="Heading3"/>
@@ -23532,8 +25407,8 @@
         <w:t xml:space="preserve">[ERROR] Connection timeout</w:t>
       </w:r>
     </w:p>
-    <w:bookmarkEnd w:id="45"/>
-    <w:bookmarkStart w:id="46" w:name="X397d73b2db381ea5b42d20785da3aa2421142dd"/>
+    <w:bookmarkEnd w:id="46"/>
+    <w:bookmarkStart w:id="47" w:name="X397d73b2db381ea5b42d20785da3aa2421142dd"/>
     <w:p>
       <w:pPr>
         <w:pStyle w:val="Heading3"/>
@@ -24278,8 +26153,8 @@
         <w:t xml:space="preserve">;</w:t>
       </w:r>
     </w:p>
-    <w:bookmarkEnd w:id="46"/>
-    <w:bookmarkStart w:id="47" w:name="validate-inputs-early-fail-fast"/>
+    <w:bookmarkEnd w:id="47"/>
+    <w:bookmarkStart w:id="48" w:name="validate-inputs-early-fail-fast"/>
     <w:p>
       <w:pPr>
         <w:pStyle w:val="Heading3"/>
@@ -24599,8 +26474,8 @@
         <w:t xml:space="preserve">}</w:t>
       </w:r>
     </w:p>
-    <w:bookmarkEnd w:id="47"/>
-    <w:bookmarkStart w:id="48" w:name="Xd6de46c3c37772f663f33120770320e678859ca"/>
+    <w:bookmarkEnd w:id="48"/>
+    <w:bookmarkStart w:id="49" w:name="Xd6de46c3c37772f663f33120770320e678859ca"/>
     <w:p>
       <w:pPr>
         <w:pStyle w:val="Heading3"/>
@@ -24890,8 +26765,8 @@
         <w:t xml:space="preserve">}</w:t>
       </w:r>
     </w:p>
-    <w:bookmarkEnd w:id="48"/>
-    <w:bookmarkStart w:id="49" w:name="X67bf6fd1fc5024aa71058470d1da399cd9e6d56"/>
+    <w:bookmarkEnd w:id="49"/>
+    <w:bookmarkStart w:id="50" w:name="X67bf6fd1fc5024aa71058470d1da399cd9e6d56"/>
     <w:p>
       <w:pPr>
         <w:pStyle w:val="Heading3"/>
@@ -27355,9 +29230,9 @@
         </w:pict>
       </w:r>
     </w:p>
-    <w:bookmarkEnd w:id="49"/>
     <w:bookmarkEnd w:id="50"/>
-    <w:bookmarkStart w:id="54" w:name="logging"/>
+    <w:bookmarkEnd w:id="51"/>
+    <w:bookmarkStart w:id="55" w:name="logging"/>
     <w:p>
       <w:pPr>
         <w:pStyle w:val="Heading2"/>
@@ -27366,7 +29241,7 @@
         <w:t xml:space="preserve">7. Logging</w:t>
       </w:r>
     </w:p>
-    <w:bookmarkStart w:id="51" w:name="use-structured-contextual-log-messages"/>
+    <w:bookmarkStart w:id="52" w:name="use-structured-contextual-log-messages"/>
     <w:p>
       <w:pPr>
         <w:pStyle w:val="Heading3"/>
@@ -27877,8 +29752,8 @@
         <w:t xml:space="preserve">// Dumps entire object with no context</w:t>
       </w:r>
     </w:p>
-    <w:bookmarkEnd w:id="51"/>
-    <w:bookmarkStart w:id="52" w:name="log-levels-use-them-correctly"/>
+    <w:bookmarkEnd w:id="52"/>
+    <w:bookmarkStart w:id="53" w:name="log-levels-use-them-correctly"/>
     <w:p>
       <w:pPr>
         <w:pStyle w:val="Heading3"/>
@@ -28105,8 +29980,8 @@
         </w:tc>
       </w:tr>
     </w:tbl>
-    <w:bookmarkEnd w:id="52"/>
-    <w:bookmarkStart w:id="53" w:name="never-log-sensitive-data"/>
+    <w:bookmarkEnd w:id="53"/>
+    <w:bookmarkStart w:id="54" w:name="never-log-sensitive-data"/>
     <w:p>
       <w:pPr>
         <w:pStyle w:val="Heading3"/>
@@ -28343,9 +30218,9 @@
         </w:pict>
       </w:r>
     </w:p>
-    <w:bookmarkEnd w:id="53"/>
     <w:bookmarkEnd w:id="54"/>
-    <w:bookmarkStart w:id="58" w:name="security"/>
+    <w:bookmarkEnd w:id="55"/>
+    <w:bookmarkStart w:id="59" w:name="security"/>
     <w:p>
       <w:pPr>
         <w:pStyle w:val="Heading2"/>
@@ -28354,7 +30229,7 @@
         <w:t xml:space="preserve">8. Security</w:t>
       </w:r>
     </w:p>
-    <w:bookmarkStart w:id="55" w:name="Xae2a55eaa2d32cd562952aa1877544fb011ba9a"/>
+    <w:bookmarkStart w:id="56" w:name="Xae2a55eaa2d32cd562952aa1877544fb011ba9a"/>
     <w:p>
       <w:pPr>
         <w:pStyle w:val="Heading3"/>
@@ -28833,8 +30708,8 @@
         <w:t xml:space="preserve">}</w:t>
       </w:r>
     </w:p>
-    <w:bookmarkEnd w:id="55"/>
-    <w:bookmarkStart w:id="56" w:name="validate-at-system-boundaries"/>
+    <w:bookmarkEnd w:id="56"/>
+    <w:bookmarkStart w:id="57" w:name="validate-at-system-boundaries"/>
     <w:p>
       <w:pPr>
         <w:pStyle w:val="Heading3"/>
@@ -29199,8 +31074,8 @@
         <w:t xml:space="preserve">}</w:t>
       </w:r>
     </w:p>
-    <w:bookmarkEnd w:id="56"/>
-    <w:bookmarkStart w:id="57" w:name="use-environment-specific-configuration"/>
+    <w:bookmarkEnd w:id="57"/>
+    <w:bookmarkStart w:id="58" w:name="use-environment-specific-configuration"/>
     <w:p>
       <w:pPr>
         <w:pStyle w:val="Heading3"/>
@@ -29353,9 +31228,9 @@
         </w:pict>
       </w:r>
     </w:p>
-    <w:bookmarkEnd w:id="57"/>
     <w:bookmarkEnd w:id="58"/>
-    <w:bookmarkStart w:id="63" w:name="comments-documentation"/>
+    <w:bookmarkEnd w:id="59"/>
+    <w:bookmarkStart w:id="64" w:name="comments-documentation"/>
     <w:p>
       <w:pPr>
         <w:pStyle w:val="Heading2"/>
@@ -29364,7 +31239,7 @@
         <w:t xml:space="preserve">9. Comments &amp; Documentation</w:t>
       </w:r>
     </w:p>
-    <w:bookmarkStart w:id="59" w:name="comment-why-not-what"/>
+    <w:bookmarkStart w:id="60" w:name="comment-why-not-what"/>
     <w:p>
       <w:pPr>
         <w:pStyle w:val="Heading3"/>
@@ -29575,8 +31450,8 @@
         <w:t xml:space="preserve">;</w:t>
       </w:r>
     </w:p>
-    <w:bookmarkEnd w:id="59"/>
-    <w:bookmarkStart w:id="60" w:name="use-jsdoc-for-public-functions"/>
+    <w:bookmarkEnd w:id="60"/>
+    <w:bookmarkStart w:id="61" w:name="use-jsdoc-for-public-functions"/>
     <w:p>
       <w:pPr>
         <w:pStyle w:val="Heading3"/>
@@ -29758,8 +31633,8 @@
         <w:t xml:space="preserve"> apiKey) { }</w:t>
       </w:r>
     </w:p>
-    <w:bookmarkEnd w:id="60"/>
-    <w:bookmarkStart w:id="61" w:name="when-to-comment-vs.-when-to-rename"/>
+    <w:bookmarkEnd w:id="61"/>
+    <w:bookmarkStart w:id="62" w:name="when-to-comment-vs.-when-to-rename"/>
     <w:p>
       <w:pPr>
         <w:pStyle w:val="Heading3"/>
@@ -29989,8 +31864,8 @@
         <w:t xml:space="preserve">;</w:t>
       </w:r>
     </w:p>
-    <w:bookmarkEnd w:id="61"/>
-    <w:bookmarkStart w:id="62" w:name="dont-leave-commented-out-code"/>
+    <w:bookmarkEnd w:id="62"/>
+    <w:bookmarkStart w:id="63" w:name="dont-leave-commented-out-code"/>
     <w:p>
       <w:pPr>
         <w:pStyle w:val="Heading3"/>
@@ -30214,9 +32089,9 @@
         </w:pict>
       </w:r>
     </w:p>
-    <w:bookmarkEnd w:id="62"/>
     <w:bookmarkEnd w:id="63"/>
-    <w:bookmarkStart w:id="67" w:name="constants-configuration"/>
+    <w:bookmarkEnd w:id="64"/>
+    <w:bookmarkStart w:id="68" w:name="constants-configuration"/>
     <w:p>
       <w:pPr>
         <w:pStyle w:val="Heading2"/>
@@ -30225,7 +32100,7 @@
         <w:t xml:space="preserve">10. Constants &amp; Configuration</w:t>
       </w:r>
     </w:p>
-    <w:bookmarkStart w:id="64" w:name="no-magic-numbers-or-strings"/>
+    <w:bookmarkStart w:id="65" w:name="no-magic-numbers-or-strings"/>
     <w:p>
       <w:pPr>
         <w:pStyle w:val="Heading3"/>
@@ -30814,8 +32689,8 @@
         <w:t xml:space="preserve">;</w:t>
       </w:r>
     </w:p>
-    <w:bookmarkEnd w:id="64"/>
-    <w:bookmarkStart w:id="65" w:name="use-object.freeze-for-constant-maps"/>
+    <w:bookmarkEnd w:id="65"/>
+    <w:bookmarkStart w:id="66" w:name="use-object.freeze-for-constant-maps"/>
     <w:p>
       <w:pPr>
         <w:pStyle w:val="Heading3"/>
@@ -31132,8 +33007,8 @@
         <w:t xml:space="preserve">// Silently fails (or throws in strict mode)</w:t>
       </w:r>
     </w:p>
-    <w:bookmarkEnd w:id="65"/>
-    <w:bookmarkStart w:id="66" w:name="group-related-config-together"/>
+    <w:bookmarkEnd w:id="66"/>
+    <w:bookmarkStart w:id="67" w:name="group-related-config-together"/>
     <w:p>
       <w:pPr>
         <w:pStyle w:val="Heading3"/>
@@ -31508,9 +33383,9 @@
         </w:pict>
       </w:r>
     </w:p>
-    <w:bookmarkEnd w:id="66"/>
     <w:bookmarkEnd w:id="67"/>
-    <w:bookmarkStart w:id="72" w:name="boolean-data-handling"/>
+    <w:bookmarkEnd w:id="68"/>
+    <w:bookmarkStart w:id="73" w:name="boolean-data-handling"/>
     <w:p>
       <w:pPr>
         <w:pStyle w:val="Heading2"/>
@@ -31519,7 +33394,7 @@
         <w:t xml:space="preserve">11. Boolean &amp; Data Handling</w:t>
       </w:r>
     </w:p>
-    <w:bookmarkStart w:id="68" w:name="normalize-booleans-from-external-sources"/>
+    <w:bookmarkStart w:id="69" w:name="normalize-booleans-from-external-sources"/>
     <w:p>
       <w:pPr>
         <w:pStyle w:val="Heading3"/>
@@ -31859,8 +33734,8 @@
         <w:t xml:space="preserve">;</w:t>
       </w:r>
     </w:p>
-    <w:bookmarkEnd w:id="68"/>
-    <w:bookmarkStart w:id="69" w:name="use-nullish-coalescing-for-defaults-not"/>
+    <w:bookmarkEnd w:id="69"/>
+    <w:bookmarkStart w:id="70" w:name="use-nullish-coalescing-for-defaults-not"/>
     <w:p>
       <w:pPr>
         <w:pStyle w:val="Heading3"/>
@@ -32240,8 +34115,8 @@
         <w:t xml:space="preserve">// If name is '', you get 'Unknown'!</w:t>
       </w:r>
     </w:p>
-    <w:bookmarkEnd w:id="69"/>
-    <w:bookmarkStart w:id="70" w:name="Xec267554d2e4b827274042da05d7947fdd6e33b"/>
+    <w:bookmarkEnd w:id="70"/>
+    <w:bookmarkStart w:id="71" w:name="Xec267554d2e4b827274042da05d7947fdd6e33b"/>
     <w:p>
       <w:pPr>
         <w:pStyle w:val="Heading3"/>
@@ -33230,8 +35105,8 @@
         <w:t xml:space="preserve">be a template literal. For plain strings, template literals are preferred but single quotes are acceptable. Never use double quotes — single quotes or backticks only.</w:t>
       </w:r>
     </w:p>
-    <w:bookmarkEnd w:id="70"/>
-    <w:bookmarkStart w:id="71" w:name="X899c3adfc602478938c38a211714e0998d650ae"/>
+    <w:bookmarkEnd w:id="71"/>
+    <w:bookmarkStart w:id="72" w:name="X899c3adfc602478938c38a211714e0998d650ae"/>
     <w:p>
       <w:pPr>
         <w:pStyle w:val="Heading3"/>
@@ -33882,9 +35757,9 @@
         </w:pict>
       </w:r>
     </w:p>
-    <w:bookmarkEnd w:id="71"/>
     <w:bookmarkEnd w:id="72"/>
-    <w:bookmarkStart w:id="80" w:name="testing"/>
+    <w:bookmarkEnd w:id="73"/>
+    <w:bookmarkStart w:id="81" w:name="testing"/>
     <w:p>
       <w:pPr>
         <w:pStyle w:val="Heading2"/>
@@ -33893,7 +35768,7 @@
         <w:t xml:space="preserve">12. Testing</w:t>
       </w:r>
     </w:p>
-    <w:bookmarkStart w:id="73" w:name="test-file-naming-mirrors-source-files"/>
+    <w:bookmarkStart w:id="74" w:name="test-file-naming-mirrors-source-files"/>
     <w:p>
       <w:pPr>
         <w:pStyle w:val="Heading3"/>
@@ -33943,8 +35818,8 @@
         <w:t xml:space="preserve">Test:    __tests__/ut_ctrl_order.js</w:t>
       </w:r>
     </w:p>
-    <w:bookmarkEnd w:id="73"/>
-    <w:bookmarkStart w:id="74" w:name="structure-arrange-act-assert"/>
+    <w:bookmarkEnd w:id="74"/>
+    <w:bookmarkStart w:id="75" w:name="structure-arrange-act-assert"/>
     <w:p>
       <w:pPr>
         <w:pStyle w:val="Heading3"/>
@@ -34429,8 +36304,8 @@
         <w:t xml:space="preserve">;</w:t>
       </w:r>
     </w:p>
-    <w:bookmarkEnd w:id="74"/>
-    <w:bookmarkStart w:id="75" w:name="Xc7fa6374fdb5c6b271562e793d936f15320b660"/>
+    <w:bookmarkEnd w:id="75"/>
+    <w:bookmarkStart w:id="76" w:name="Xc7fa6374fdb5c6b271562e793d936f15320b660"/>
     <w:p>
       <w:pPr>
         <w:pStyle w:val="Heading3"/>
@@ -34918,8 +36793,8 @@
         <w:t xml:space="preserve">;</w:t>
       </w:r>
     </w:p>
-    <w:bookmarkEnd w:id="75"/>
-    <w:bookmarkStart w:id="76" w:name="Xb38d4d34d98fd2df030f0b4d44c7ecc8b96b33f"/>
+    <w:bookmarkEnd w:id="76"/>
+    <w:bookmarkStart w:id="77" w:name="Xb38d4d34d98fd2df030f0b4d44c7ecc8b96b33f"/>
     <w:p>
       <w:pPr>
         <w:pStyle w:val="Heading3"/>
@@ -35182,8 +37057,8 @@
         <w:t xml:space="preserve">// Now you're not testing real behavior</w:t>
       </w:r>
     </w:p>
-    <w:bookmarkEnd w:id="76"/>
-    <w:bookmarkStart w:id="77" w:name="Xd21cb49f66874755db4ae83a7bf30f56cd56479"/>
+    <w:bookmarkEnd w:id="77"/>
+    <w:bookmarkStart w:id="78" w:name="Xd21cb49f66874755db4ae83a7bf30f56cd56479"/>
     <w:p>
       <w:pPr>
         <w:pStyle w:val="Heading3"/>
@@ -35869,8 +37744,8 @@
         <w:t xml:space="preserve">;</w:t>
       </w:r>
     </w:p>
-    <w:bookmarkEnd w:id="77"/>
-    <w:bookmarkStart w:id="78" w:name="use-fixtures-for-complex-test-data"/>
+    <w:bookmarkEnd w:id="78"/>
+    <w:bookmarkStart w:id="79" w:name="use-fixtures-for-complex-test-data"/>
     <w:p>
       <w:pPr>
         <w:pStyle w:val="Heading3"/>
@@ -36508,8 +38383,8 @@
         <w:t xml:space="preserve">;</w:t>
       </w:r>
     </w:p>
-    <w:bookmarkEnd w:id="78"/>
-    <w:bookmarkStart w:id="79" w:name="clean-up-between-tests"/>
+    <w:bookmarkEnd w:id="79"/>
+    <w:bookmarkStart w:id="80" w:name="clean-up-between-tests"/>
     <w:p>
       <w:pPr>
         <w:pStyle w:val="Heading3"/>
@@ -36728,9 +38603,9 @@
         </w:pict>
       </w:r>
     </w:p>
-    <w:bookmarkEnd w:id="79"/>
     <w:bookmarkEnd w:id="80"/>
-    <w:bookmarkStart w:id="86" w:name="code-smells-to-avoid"/>
+    <w:bookmarkEnd w:id="81"/>
+    <w:bookmarkStart w:id="87" w:name="code-smells-to-avoid"/>
     <w:p>
       <w:pPr>
         <w:pStyle w:val="Heading2"/>
@@ -36739,7 +38614,7 @@
         <w:t xml:space="preserve">13. Code Smells to Avoid</w:t>
       </w:r>
     </w:p>
-    <w:bookmarkStart w:id="81" w:name="deeply-nested-conditionals"/>
+    <w:bookmarkStart w:id="82" w:name="deeply-nested-conditionals"/>
     <w:p>
       <w:pPr>
         <w:pStyle w:val="Heading3"/>
@@ -37116,8 +38991,8 @@
         <w:t xml:space="preserve">;</w:t>
       </w:r>
     </w:p>
-    <w:bookmarkEnd w:id="81"/>
-    <w:bookmarkStart w:id="82" w:name="giant-functions-50-lines"/>
+    <w:bookmarkEnd w:id="82"/>
+    <w:bookmarkStart w:id="83" w:name="giant-functions-50-lines"/>
     <w:p>
       <w:pPr>
         <w:pStyle w:val="Heading3"/>
@@ -37397,8 +39272,8 @@
         <w:t xml:space="preserve">}</w:t>
       </w:r>
     </w:p>
-    <w:bookmarkEnd w:id="82"/>
-    <w:bookmarkStart w:id="83" w:name="copy-paste-code-dry-dont-repeat-yourself"/>
+    <w:bookmarkEnd w:id="83"/>
+    <w:bookmarkStart w:id="84" w:name="copy-paste-code-dry-dont-repeat-yourself"/>
     <w:p>
       <w:pPr>
         <w:pStyle w:val="Heading3"/>
@@ -37762,8 +39637,8 @@
         <w:t xml:space="preserve">}</w:t>
       </w:r>
     </w:p>
-    <w:bookmarkEnd w:id="83"/>
-    <w:bookmarkStart w:id="84" w:name="boolean-parameters-that-change-behavior"/>
+    <w:bookmarkEnd w:id="84"/>
+    <w:bookmarkStart w:id="85" w:name="boolean-parameters-that-change-behavior"/>
     <w:p>
       <w:pPr>
         <w:pStyle w:val="Heading3"/>
@@ -37957,8 +39832,8 @@
         <w:t xml:space="preserve">;</w:t>
       </w:r>
     </w:p>
-    <w:bookmarkEnd w:id="84"/>
-    <w:bookmarkStart w:id="85" w:name="catch-all-error-handling"/>
+    <w:bookmarkEnd w:id="85"/>
+    <w:bookmarkStart w:id="86" w:name="catch-all-error-handling"/>
     <w:p>
       <w:pPr>
         <w:pStyle w:val="Heading3"/>
@@ -38426,9 +40301,9 @@
         </w:pict>
       </w:r>
     </w:p>
-    <w:bookmarkEnd w:id="85"/>
     <w:bookmarkEnd w:id="86"/>
-    <w:bookmarkStart w:id="96" w:name="git-repos-documentation"/>
+    <w:bookmarkEnd w:id="87"/>
+    <w:bookmarkStart w:id="97" w:name="git-repos-documentation"/>
     <w:p>
       <w:pPr>
         <w:pStyle w:val="Heading2"/>
@@ -38437,7 +40312,7 @@
         <w:t xml:space="preserve">14. Git, Repos &amp; Documentation</w:t>
       </w:r>
     </w:p>
-    <w:bookmarkStart w:id="87" w:name="every-project-lives-in-a-git-repo"/>
+    <w:bookmarkStart w:id="88" w:name="every-project-lives-in-a-git-repo"/>
     <w:p>
       <w:pPr>
         <w:pStyle w:val="Heading3"/>
@@ -38552,8 +40427,8 @@
         <w:t xml:space="preserve">The goal: any developer (or AI) can pick up the project and understand it without asking you.</w:t>
       </w:r>
     </w:p>
-    <w:bookmarkEnd w:id="87"/>
-    <w:bookmarkStart w:id="88" w:name="pull-requests-are-required"/>
+    <w:bookmarkEnd w:id="88"/>
+    <w:bookmarkStart w:id="89" w:name="pull-requests-are-required"/>
     <w:p>
       <w:pPr>
         <w:pStyle w:val="Heading3"/>
@@ -38641,8 +40516,8 @@
         <w:t xml:space="preserve">main</w:t>
       </w:r>
     </w:p>
-    <w:bookmarkEnd w:id="88"/>
-    <w:bookmarkStart w:id="89" w:name="X25b9c52efc2fb43239c048b5bc1aadc80deb6cd"/>
+    <w:bookmarkEnd w:id="89"/>
+    <w:bookmarkStart w:id="90" w:name="X25b9c52efc2fb43239c048b5bc1aadc80deb6cd"/>
     <w:p>
       <w:pPr>
         <w:pStyle w:val="Heading3"/>
@@ -38740,8 +40615,8 @@
         <w:t xml:space="preserve">that gives Claude the context it needs — project structure, naming conventions, key patterns, and common commands. This file is loaded automatically when Claude Code opens the project.</w:t>
       </w:r>
     </w:p>
-    <w:bookmarkEnd w:id="89"/>
-    <w:bookmarkStart w:id="90" w:name="X7f65b519046e9b3f978d20480df0afdbcd9aedb"/>
+    <w:bookmarkEnd w:id="90"/>
+    <w:bookmarkStart w:id="91" w:name="X7f65b519046e9b3f978d20480df0afdbcd9aedb"/>
     <w:p>
       <w:pPr>
         <w:pStyle w:val="Heading3"/>
@@ -38842,8 +40717,8 @@
         <w:t xml:space="preserve">  asdfasdf</w:t>
       </w:r>
     </w:p>
-    <w:bookmarkEnd w:id="90"/>
-    <w:bookmarkStart w:id="91" w:name="commit-small-and-often"/>
+    <w:bookmarkEnd w:id="91"/>
+    <w:bookmarkStart w:id="92" w:name="commit-small-and-often"/>
     <w:p>
       <w:pPr>
         <w:pStyle w:val="Heading3"/>
@@ -38873,8 +40748,8 @@
         <w:t xml:space="preserve">. If you can’t describe it in one sentence, it’s probably too big.</w:t>
       </w:r>
     </w:p>
-    <w:bookmarkEnd w:id="91"/>
-    <w:bookmarkStart w:id="92" w:name="code-must-build-and-pass-before-you-push"/>
+    <w:bookmarkEnd w:id="92"/>
+    <w:bookmarkStart w:id="93" w:name="code-must-build-and-pass-before-you-push"/>
     <w:p>
       <w:pPr>
         <w:pStyle w:val="Heading3"/>
@@ -39058,8 +40933,8 @@
         <w:t xml:space="preserve">git push origin feature/my-branch # Only after both pass</w:t>
       </w:r>
     </w:p>
-    <w:bookmarkEnd w:id="92"/>
-    <w:bookmarkStart w:id="93" w:name="branch-naming"/>
+    <w:bookmarkEnd w:id="93"/>
+    <w:bookmarkStart w:id="94" w:name="branch-naming"/>
     <w:p>
       <w:pPr>
         <w:pStyle w:val="Heading3"/>
@@ -39097,8 +40972,8 @@
         <w:t xml:space="preserve">chore/update-dependencies</w:t>
       </w:r>
     </w:p>
-    <w:bookmarkEnd w:id="93"/>
-    <w:bookmarkStart w:id="94" w:name="keep-the-repo-clean-no-junk-files"/>
+    <w:bookmarkEnd w:id="94"/>
+    <w:bookmarkStart w:id="95" w:name="keep-the-repo-clean-no-junk-files"/>
     <w:p>
       <w:pPr>
         <w:pStyle w:val="Heading3"/>
@@ -39447,8 +41322,8 @@
         <w:t xml:space="preserve">*.log</w:t>
       </w:r>
     </w:p>
-    <w:bookmarkEnd w:id="94"/>
-    <w:bookmarkStart w:id="95" w:name="never-commit-secrets"/>
+    <w:bookmarkEnd w:id="95"/>
+    <w:bookmarkStart w:id="96" w:name="never-commit-secrets"/>
     <w:p>
       <w:pPr>
         <w:pStyle w:val="Heading3"/>
@@ -39488,9 +41363,9 @@
         </w:pict>
       </w:r>
     </w:p>
-    <w:bookmarkEnd w:id="95"/>
     <w:bookmarkEnd w:id="96"/>
-    <w:bookmarkStart w:id="101" w:name="deployment-pipeline"/>
+    <w:bookmarkEnd w:id="97"/>
+    <w:bookmarkStart w:id="102" w:name="deployment-pipeline"/>
     <w:p>
       <w:pPr>
         <w:pStyle w:val="Heading2"/>
@@ -39538,7 +41413,7 @@
         <w:t xml:space="preserve">— never deploy by manually uploading files.</w:t>
       </w:r>
     </w:p>
-    <w:bookmarkStart w:id="97" w:name="the-deploy-protocol"/>
+    <w:bookmarkStart w:id="98" w:name="the-deploy-protocol"/>
     <w:p>
       <w:pPr>
         <w:pStyle w:val="Heading3"/>
@@ -39629,8 +41504,8 @@
         <w:t xml:space="preserve">8. E2E tests           — (optional) run Playwright tests after successful deploy</w:t>
       </w:r>
     </w:p>
-    <w:bookmarkEnd w:id="97"/>
-    <w:bookmarkStart w:id="98" w:name="key-rules"/>
+    <w:bookmarkEnd w:id="98"/>
+    <w:bookmarkStart w:id="99" w:name="key-rules"/>
     <w:p>
       <w:pPr>
         <w:pStyle w:val="Heading3"/>
@@ -39757,8 +41632,8 @@
         <w:t xml:space="preserve">— always check that remote hasn’t diverged. If remote has commits you don’t have, pull and resolve first.</w:t>
       </w:r>
     </w:p>
-    <w:bookmarkEnd w:id="98"/>
-    <w:bookmarkStart w:id="99" w:name="sdf-project-types"/>
+    <w:bookmarkEnd w:id="99"/>
+    <w:bookmarkStart w:id="100" w:name="sdf-project-types"/>
     <w:p>
       <w:pPr>
         <w:pStyle w:val="Heading3"/>
@@ -39864,8 +41739,8 @@
         <w:t xml:space="preserve">.</w:t>
       </w:r>
     </w:p>
-    <w:bookmarkEnd w:id="99"/>
-    <w:bookmarkStart w:id="100" w:name="running-the-pipeline"/>
+    <w:bookmarkEnd w:id="100"/>
+    <w:bookmarkStart w:id="101" w:name="running-the-pipeline"/>
     <w:p>
       <w:pPr>
         <w:pStyle w:val="Heading3"/>
@@ -39936,9 +41811,9 @@
         </w:pict>
       </w:r>
     </w:p>
-    <w:bookmarkEnd w:id="100"/>
     <w:bookmarkEnd w:id="101"/>
-    <w:bookmarkStart w:id="107" w:name="performance"/>
+    <w:bookmarkEnd w:id="102"/>
+    <w:bookmarkStart w:id="108" w:name="performance"/>
     <w:p>
       <w:pPr>
         <w:pStyle w:val="Heading2"/>
@@ -39947,7 +41822,7 @@
         <w:t xml:space="preserve">16. Performance</w:t>
       </w:r>
     </w:p>
-    <w:bookmarkStart w:id="102" w:name="cache-expensive-operations"/>
+    <w:bookmarkStart w:id="103" w:name="cache-expensive-operations"/>
     <w:p>
       <w:pPr>
         <w:pStyle w:val="Heading3"/>
@@ -40213,8 +42088,8 @@
         <w:t xml:space="preserve">}</w:t>
       </w:r>
     </w:p>
-    <w:bookmarkEnd w:id="102"/>
-    <w:bookmarkStart w:id="103" w:name="Xa74a405f1fed5ae85c19790ade65c79ddb0642a"/>
+    <w:bookmarkEnd w:id="103"/>
+    <w:bookmarkStart w:id="104" w:name="Xa74a405f1fed5ae85c19790ade65c79ddb0642a"/>
     <w:p>
       <w:pPr>
         <w:pStyle w:val="Heading3"/>
@@ -40531,8 +42406,8 @@
         <w:t xml:space="preserve">(customerId)) { }</w:t>
       </w:r>
     </w:p>
-    <w:bookmarkEnd w:id="103"/>
-    <w:bookmarkStart w:id="104" w:name="X49cf1d292c392980f371464f134868e0ee80c99"/>
+    <w:bookmarkEnd w:id="104"/>
+    <w:bookmarkStart w:id="105" w:name="X49cf1d292c392980f371464f134868e0ee80c99"/>
     <w:p>
       <w:pPr>
         <w:pStyle w:val="Heading3"/>
@@ -42799,8 +44674,8 @@
         <w:t xml:space="preserve">for Map/Reduce-specific pagination patterns.</w:t>
       </w:r>
     </w:p>
-    <w:bookmarkEnd w:id="104"/>
-    <w:bookmarkStart w:id="105" w:name="dont-fetch-more-data-than-you-need"/>
+    <w:bookmarkEnd w:id="105"/>
+    <w:bookmarkStart w:id="106" w:name="dont-fetch-more-data-than-you-need"/>
     <w:p>
       <w:pPr>
         <w:pStyle w:val="Heading3"/>
@@ -43063,8 +44938,8 @@
         <w:t xml:space="preserve">;</w:t>
       </w:r>
     </w:p>
-    <w:bookmarkEnd w:id="105"/>
-    <w:bookmarkStart w:id="106" w:name="X9a8d88f8973947317c7c53a160d6f6c73eb16e2"/>
+    <w:bookmarkEnd w:id="106"/>
+    <w:bookmarkStart w:id="107" w:name="X9a8d88f8973947317c7c53a160d6f6c73eb16e2"/>
     <w:p>
       <w:pPr>
         <w:pStyle w:val="Heading3"/>
@@ -43382,9 +45257,9 @@
         </w:pict>
       </w:r>
     </w:p>
-    <w:bookmarkEnd w:id="106"/>
     <w:bookmarkEnd w:id="107"/>
-    <w:bookmarkStart w:id="112" w:name="quick-reference-checklist"/>
+    <w:bookmarkEnd w:id="108"/>
+    <w:bookmarkStart w:id="113" w:name="quick-reference-checklist"/>
     <w:p>
       <w:pPr>
         <w:pStyle w:val="Heading2"/>
@@ -43401,7 +45276,7 @@
         <w:t xml:space="preserve">Use this before submitting code for review:</w:t>
       </w:r>
     </w:p>
-    <w:bookmarkStart w:id="108" w:name="before-writing-code"/>
+    <w:bookmarkStart w:id="109" w:name="before-writing-code"/>
     <w:p>
       <w:pPr>
         <w:pStyle w:val="Heading3"/>
@@ -43434,8 +45309,8 @@
         <w:t xml:space="preserve">Is there existing code I can reuse or extend?</w:t>
       </w:r>
     </w:p>
-    <w:bookmarkEnd w:id="108"/>
-    <w:bookmarkStart w:id="109" w:name="while-writing-code"/>
+    <w:bookmarkEnd w:id="109"/>
+    <w:bookmarkStart w:id="110" w:name="while-writing-code"/>
     <w:p>
       <w:pPr>
         <w:pStyle w:val="Heading3"/>
@@ -43600,17 +45475,52 @@
         </w:numPr>
       </w:pPr>
       <w:r>
-        <w:t xml:space="preserve">All queries and saved searches are paginated</w:t>
-      </w:r>
-    </w:p>
-    <w:bookmarkEnd w:id="109"/>
-    <w:bookmarkStart w:id="110" w:name="before-committing"/>
-    <w:p>
-      <w:pPr>
-        <w:pStyle w:val="Heading3"/>
-      </w:pPr>
-      <w:r>
-        <w:t xml:space="preserve">Before committing</w:t>
+        <w:t xml:space="preserve">Using</w:t>
+      </w:r>
+      <w:r>
+        <w:t xml:space="preserve"> </w:t>
+      </w:r>
+      <w:r>
+        <w:rPr>
+          <w:rStyle w:val="VerbatimChar"/>
+        </w:rPr>
+        <w:t xml:space="preserve">lookupFields</w:t>
+      </w:r>
+      <w:r>
+        <w:t xml:space="preserve">/</w:t>
+      </w:r>
+      <w:r>
+        <w:rPr>
+          <w:rStyle w:val="VerbatimChar"/>
+        </w:rPr>
+        <w:t xml:space="preserve">submitFields</w:t>
+      </w:r>
+      <w:r>
+        <w:t xml:space="preserve">/SuiteQL instead of</w:t>
+      </w:r>
+      <w:r>
+        <w:t xml:space="preserve"> </w:t>
+      </w:r>
+      <w:r>
+        <w:rPr>
+          <w:rStyle w:val="VerbatimChar"/>
+        </w:rPr>
+        <w:t xml:space="preserve">record.load</w:t>
+      </w:r>
+      <w:r>
+        <w:t xml:space="preserve">/</w:t>
+      </w:r>
+      <w:r>
+        <w:rPr>
+          <w:rStyle w:val="VerbatimChar"/>
+        </w:rPr>
+        <w:t xml:space="preserve">save</w:t>
+      </w:r>
+      <w:r>
+        <w:t xml:space="preserve"> </w:t>
+      </w:r>
+      <w:r>
+        <w:t xml:space="preserve">where possible</w:t>
       </w:r>
     </w:p>
     <w:p>
@@ -43622,7 +45532,17 @@
         </w:numPr>
       </w:pPr>
       <w:r>
-        <w:t xml:space="preserve">Tests written for new/changed logic</w:t>
+        <w:t xml:space="preserve">All queries and saved searches are paginated</w:t>
+      </w:r>
+    </w:p>
+    <w:bookmarkEnd w:id="110"/>
+    <w:bookmarkStart w:id="111" w:name="before-committing"/>
+    <w:p>
+      <w:pPr>
+        <w:pStyle w:val="Heading3"/>
+      </w:pPr>
+      <w:r>
+        <w:t xml:space="preserve">Before committing</w:t>
       </w:r>
     </w:p>
     <w:p>
@@ -43634,16 +45554,7 @@
         </w:numPr>
       </w:pPr>
       <w:r>
-        <w:t xml:space="preserve">Tests pass (</w:t>
-      </w:r>
-      <w:r>
-        <w:rPr>
-          <w:rStyle w:val="VerbatimChar"/>
-        </w:rPr>
-        <w:t xml:space="preserve">npm test</w:t>
-      </w:r>
-      <w:r>
-        <w:t xml:space="preserve">)</w:t>
+        <w:t xml:space="preserve">Tests written for new/changed logic</w:t>
       </w:r>
     </w:p>
     <w:p>
@@ -43655,22 +45566,16 @@
         </w:numPr>
       </w:pPr>
       <w:r>
-        <w:t xml:space="preserve">No</w:t>
-      </w:r>
-      <w:r>
-        <w:t xml:space="preserve"> </w:t>
+        <w:t xml:space="preserve">Tests pass (</w:t>
       </w:r>
       <w:r>
         <w:rPr>
           <w:rStyle w:val="VerbatimChar"/>
         </w:rPr>
-        <w:t xml:space="preserve">console.log</w:t>
-      </w:r>
-      <w:r>
-        <w:t xml:space="preserve"> </w:t>
-      </w:r>
-      <w:r>
-        <w:t xml:space="preserve">debugging left behind</w:t>
+        <w:t xml:space="preserve">npm test</w:t>
+      </w:r>
+      <w:r>
+        <w:t xml:space="preserve">)</w:t>
       </w:r>
     </w:p>
     <w:p>
@@ -43682,7 +45587,22 @@
         </w:numPr>
       </w:pPr>
       <w:r>
-        <w:t xml:space="preserve">No commented-out code</w:t>
+        <w:t xml:space="preserve">No</w:t>
+      </w:r>
+      <w:r>
+        <w:t xml:space="preserve"> </w:t>
+      </w:r>
+      <w:r>
+        <w:rPr>
+          <w:rStyle w:val="VerbatimChar"/>
+        </w:rPr>
+        <w:t xml:space="preserve">console.log</w:t>
+      </w:r>
+      <w:r>
+        <w:t xml:space="preserve"> </w:t>
+      </w:r>
+      <w:r>
+        <w:t xml:space="preserve">debugging left behind</w:t>
       </w:r>
     </w:p>
     <w:p>
@@ -43694,20 +45614,7 @@
         </w:numPr>
       </w:pPr>
       <w:r>
-        <w:t xml:space="preserve">Commit message describes</w:t>
-      </w:r>
-      <w:r>
-        <w:t xml:space="preserve"> </w:t>
-      </w:r>
-      <w:r>
-        <w:rPr>
-          <w:b/>
-          <w:bCs/>
-        </w:rPr>
-        <w:t xml:space="preserve">why</w:t>
-      </w:r>
-      <w:r>
-        <w:t xml:space="preserve">, not just what</w:t>
+        <w:t xml:space="preserve">No commented-out code</w:t>
       </w:r>
     </w:p>
     <w:p>
@@ -43719,32 +45626,20 @@
         </w:numPr>
       </w:pPr>
       <w:r>
-        <w:t xml:space="preserve">No secrets or</w:t>
-      </w:r>
-      <w:r>
-        <w:t xml:space="preserve"> </w:t>
-      </w:r>
-      <w:r>
-        <w:rPr>
-          <w:rStyle w:val="VerbatimChar"/>
-        </w:rPr>
-        <w:t xml:space="preserve">.env</w:t>
-      </w:r>
-      <w:r>
-        <w:t xml:space="preserve"> </w:t>
-      </w:r>
-      <w:r>
-        <w:t xml:space="preserve">files staged</w:t>
-      </w:r>
-    </w:p>
-    <w:bookmarkEnd w:id="110"/>
-    <w:bookmarkStart w:id="111" w:name="before-requesting-review"/>
-    <w:p>
-      <w:pPr>
-        <w:pStyle w:val="Heading3"/>
-      </w:pPr>
-      <w:r>
-        <w:t xml:space="preserve">Before requesting review</w:t>
+        <w:t xml:space="preserve">Commit message describes</w:t>
+      </w:r>
+      <w:r>
+        <w:t xml:space="preserve"> </w:t>
+      </w:r>
+      <w:r>
+        <w:rPr>
+          <w:b/>
+          <w:bCs/>
+        </w:rPr>
+        <w:t xml:space="preserve">why</w:t>
+      </w:r>
+      <w:r>
+        <w:t xml:space="preserve">, not just what</w:t>
       </w:r>
     </w:p>
     <w:p>
@@ -43756,7 +45651,32 @@
         </w:numPr>
       </w:pPr>
       <w:r>
-        <w:t xml:space="preserve">Code is consistent with the existing codebase style</w:t>
+        <w:t xml:space="preserve">No secrets or</w:t>
+      </w:r>
+      <w:r>
+        <w:t xml:space="preserve"> </w:t>
+      </w:r>
+      <w:r>
+        <w:rPr>
+          <w:rStyle w:val="VerbatimChar"/>
+        </w:rPr>
+        <w:t xml:space="preserve">.env</w:t>
+      </w:r>
+      <w:r>
+        <w:t xml:space="preserve"> </w:t>
+      </w:r>
+      <w:r>
+        <w:t xml:space="preserve">files staged</w:t>
+      </w:r>
+    </w:p>
+    <w:bookmarkEnd w:id="111"/>
+    <w:bookmarkStart w:id="112" w:name="before-requesting-review"/>
+    <w:p>
+      <w:pPr>
+        <w:pStyle w:val="Heading3"/>
+      </w:pPr>
+      <w:r>
+        <w:t xml:space="preserve">Before requesting review</w:t>
       </w:r>
     </w:p>
     <w:p>
@@ -43768,6 +45688,18 @@
         </w:numPr>
       </w:pPr>
       <w:r>
+        <w:t xml:space="preserve">Code is consistent with the existing codebase style</w:t>
+      </w:r>
+    </w:p>
+    <w:p>
+      <w:pPr>
+        <w:pStyle w:val="Compact"/>
+        <w:numPr>
+          <w:ilvl w:val="0"/>
+          <w:numId w:val="1022"/>
+        </w:numPr>
+      </w:pPr>
+      <w:r>
         <w:t xml:space="preserve">I can explain every line I wrote if asked</w:t>
       </w:r>
     </w:p>
@@ -43790,9 +45722,9 @@
         <w:t xml:space="preserve">This is a living document. As the team grows and patterns evolve, update it.</w:t>
       </w:r>
     </w:p>
-    <w:bookmarkEnd w:id="111"/>
     <w:bookmarkEnd w:id="112"/>
     <w:bookmarkEnd w:id="113"/>
+    <w:bookmarkEnd w:id="114"/>
     <w:sectPr>
       <w:footnotePr>
         <w:numRestart w:val="eachSect"/>
@@ -44258,6 +46190,9 @@
     <w:abstractNumId w:val="992"/>
   </w:num>
   <w:num w:numId="1021">
+    <w:abstractNumId w:val="992"/>
+  </w:num>
+  <w:num w:numId="1022">
     <w:abstractNumId w:val="992"/>
   </w:num>
 </w:numbering>

</xml_diff>